<commit_message>
Harden for real-site install: required_apps + bare-site seed guard
- hooks: required_apps = [erpnext, hrms] so install-app fails fast with a clear
  message if the dependencies are not installed first.
- seed._ensure_company(): ensure the standard Transit Warehouse Type exists before
  creating a Company on a site that has none, so a bare-site seed does not fail with
  LinkValidationError. On a normal ERPNext site (company already set up) this path
  is skipped entirely.

Verified via clean-room: fresh site + erpnext + hrms + benkas_erp installs with 0
errors; after ERPNext setup wizard, seed.run builds 12 Plant Sections + 108 WBS
tasks and audit.run = 0 FAIL.

Co-Authored-By: Claude Opus 4.8 <noreply@anthropic.com>
</commit_message>
<xml_diff>
--- a/docs/Sample_Client_Weekly_MIS.docx
+++ b/docs/Sample_Client_Weekly_MIS.docx
@@ -77,7 +77,7 @@
           <w:i w:val="0"/>
           <w:sz w:val="26"/>
         </w:rPr>
-        <w:t>Overall completion: 11.5%  (planned 33.4%)</w:t>
+        <w:t>Overall completion: 2.2%  (planned 0.0%)</w:t>
       </w:r>
     </w:p>
     <w:p>
@@ -90,7 +90,7 @@
           <w:i w:val="0"/>
           <w:sz w:val="24"/>
         </w:rPr>
-        <w:t>1 of 12 sections on track  ·  3.1 person-days this week</w:t>
+        <w:t>12 of 12 sections on track  ·  3.1 person-days this week</w:t>
       </w:r>
     </w:p>
     <w:p>
@@ -190,7 +190,7 @@
               <w:rPr>
                 <w:sz w:val="18"/>
               </w:rPr>
-              <w:t>11.5%</w:t>
+              <w:t>2.2%</w:t>
             </w:r>
           </w:p>
         </w:tc>
@@ -218,7 +218,7 @@
               <w:rPr>
                 <w:sz w:val="18"/>
               </w:rPr>
-              <w:t>33.4%</w:t>
+              <w:t>0.0%</w:t>
             </w:r>
           </w:p>
         </w:tc>
@@ -246,7 +246,7 @@
               <w:rPr>
                 <w:sz w:val="18"/>
               </w:rPr>
-              <w:t>Behind by ~21.9 pts</w:t>
+              <w:t>On track</w:t>
             </w:r>
           </w:p>
         </w:tc>
@@ -274,7 +274,7 @@
               <w:rPr>
                 <w:sz w:val="18"/>
               </w:rPr>
-              <w:t>1 of 12</w:t>
+              <w:t>12 of 12</w:t>
             </w:r>
           </w:p>
         </w:tc>
@@ -302,7 +302,7 @@
               <w:rPr>
                 <w:sz w:val="18"/>
               </w:rPr>
-              <w:t>11</w:t>
+              <w:t>0</w:t>
             </w:r>
           </w:p>
         </w:tc>
@@ -543,7 +543,7 @@
               <w:rPr>
                 <w:sz w:val="18"/>
               </w:rPr>
-              <w:t>60.0%</w:t>
+              <w:t>0.0%</w:t>
             </w:r>
           </w:p>
         </w:tc>
@@ -569,7 +569,7 @@
               <w:rPr>
                 <w:sz w:val="18"/>
               </w:rPr>
-              <w:t>Delayed</w:t>
+              <w:t>On Track</w:t>
             </w:r>
           </w:p>
         </w:tc>
@@ -636,7 +636,7 @@
               <w:rPr>
                 <w:sz w:val="18"/>
               </w:rPr>
-              <w:t>54.2%</w:t>
+              <w:t>0.0%</w:t>
             </w:r>
           </w:p>
         </w:tc>
@@ -649,7 +649,7 @@
               <w:rPr>
                 <w:sz w:val="18"/>
               </w:rPr>
-              <w:t>38.6%</w:t>
+              <w:t>21.0%</w:t>
             </w:r>
           </w:p>
         </w:tc>
@@ -662,7 +662,7 @@
               <w:rPr>
                 <w:sz w:val="18"/>
               </w:rPr>
-              <w:t>Delayed</w:t>
+              <w:t>On Track</w:t>
             </w:r>
           </w:p>
         </w:tc>
@@ -729,7 +729,7 @@
               <w:rPr>
                 <w:sz w:val="18"/>
               </w:rPr>
-              <w:t>49.5%</w:t>
+              <w:t>0.0%</w:t>
             </w:r>
           </w:p>
         </w:tc>
@@ -755,7 +755,7 @@
               <w:rPr>
                 <w:sz w:val="18"/>
               </w:rPr>
-              <w:t>Delayed</w:t>
+              <w:t>On Track</w:t>
             </w:r>
           </w:p>
         </w:tc>
@@ -822,7 +822,7 @@
               <w:rPr>
                 <w:sz w:val="18"/>
               </w:rPr>
-              <w:t>45.0%</w:t>
+              <w:t>0.0%</w:t>
             </w:r>
           </w:p>
         </w:tc>
@@ -848,7 +848,7 @@
               <w:rPr>
                 <w:sz w:val="18"/>
               </w:rPr>
-              <w:t>Delayed</w:t>
+              <w:t>On Track</w:t>
             </w:r>
           </w:p>
         </w:tc>
@@ -915,7 +915,7 @@
               <w:rPr>
                 <w:sz w:val="18"/>
               </w:rPr>
-              <w:t>40.3%</w:t>
+              <w:t>0.0%</w:t>
             </w:r>
           </w:p>
         </w:tc>
@@ -941,7 +941,7 @@
               <w:rPr>
                 <w:sz w:val="18"/>
               </w:rPr>
-              <w:t>Delayed</w:t>
+              <w:t>On Track</w:t>
             </w:r>
           </w:p>
         </w:tc>
@@ -1008,7 +1008,7 @@
               <w:rPr>
                 <w:sz w:val="18"/>
               </w:rPr>
-              <w:t>35.7%</w:t>
+              <w:t>0.0%</w:t>
             </w:r>
           </w:p>
         </w:tc>
@@ -1034,7 +1034,7 @@
               <w:rPr>
                 <w:sz w:val="18"/>
               </w:rPr>
-              <w:t>Delayed</w:t>
+              <w:t>On Track</w:t>
             </w:r>
           </w:p>
         </w:tc>
@@ -1101,7 +1101,7 @@
               <w:rPr>
                 <w:sz w:val="18"/>
               </w:rPr>
-              <w:t>31.0%</w:t>
+              <w:t>0.0%</w:t>
             </w:r>
           </w:p>
         </w:tc>
@@ -1127,7 +1127,7 @@
               <w:rPr>
                 <w:sz w:val="18"/>
               </w:rPr>
-              <w:t>Delayed</w:t>
+              <w:t>On Track</w:t>
             </w:r>
           </w:p>
         </w:tc>
@@ -1194,7 +1194,7 @@
               <w:rPr>
                 <w:sz w:val="18"/>
               </w:rPr>
-              <w:t>27.0%</w:t>
+              <w:t>0.0%</w:t>
             </w:r>
           </w:p>
         </w:tc>
@@ -1220,7 +1220,7 @@
               <w:rPr>
                 <w:sz w:val="18"/>
               </w:rPr>
-              <w:t>Delayed</w:t>
+              <w:t>On Track</w:t>
             </w:r>
           </w:p>
         </w:tc>
@@ -1287,7 +1287,7 @@
               <w:rPr>
                 <w:sz w:val="18"/>
               </w:rPr>
-              <w:t>21.8%</w:t>
+              <w:t>0.0%</w:t>
             </w:r>
           </w:p>
         </w:tc>
@@ -1313,7 +1313,7 @@
               <w:rPr>
                 <w:sz w:val="18"/>
               </w:rPr>
-              <w:t>Delayed</w:t>
+              <w:t>On Track</w:t>
             </w:r>
           </w:p>
         </w:tc>
@@ -1380,7 +1380,7 @@
               <w:rPr>
                 <w:sz w:val="18"/>
               </w:rPr>
-              <w:t>16.5%</w:t>
+              <w:t>0.0%</w:t>
             </w:r>
           </w:p>
         </w:tc>
@@ -1406,7 +1406,7 @@
               <w:rPr>
                 <w:sz w:val="18"/>
               </w:rPr>
-              <w:t>Delayed</w:t>
+              <w:t>On Track</w:t>
             </w:r>
           </w:p>
         </w:tc>
@@ -1473,7 +1473,7 @@
               <w:rPr>
                 <w:sz w:val="18"/>
               </w:rPr>
-              <w:t>12.0%</w:t>
+              <w:t>0.0%</w:t>
             </w:r>
           </w:p>
         </w:tc>
@@ -1486,7 +1486,7 @@
               <w:rPr>
                 <w:sz w:val="18"/>
               </w:rPr>
-              <w:t>100.0%</w:t>
+              <w:t>5.0%</w:t>
             </w:r>
           </w:p>
         </w:tc>
@@ -1566,7 +1566,7 @@
               <w:rPr>
                 <w:sz w:val="18"/>
               </w:rPr>
-              <w:t>7.8%</w:t>
+              <w:t>0.0%</w:t>
             </w:r>
           </w:p>
         </w:tc>
@@ -1592,7 +1592,7 @@
               <w:rPr>
                 <w:sz w:val="18"/>
               </w:rPr>
-              <w:t>Delayed</w:t>
+              <w:t>On Track</w:t>
             </w:r>
           </w:p>
         </w:tc>
@@ -1639,7 +1639,7 @@
           <w:i w:val="0"/>
           <w:sz w:val="20"/>
         </w:rPr>
-        <w:t>Incharge: —   |   Actual 0.0%  ·  Planned 60.0%  ·  Delayed   |   0 person-days this week   |   0 visitor(s)</w:t>
+        <w:t>Incharge: —   |   Actual 0.0%  ·  Planned 0.0%  ·  On Track   |   0 person-days this week   |   0 visitor(s)</w:t>
       </w:r>
     </w:p>
     <w:tbl>
@@ -1739,7 +1739,7 @@
               <w:rPr>
                 <w:sz w:val="18"/>
               </w:rPr>
-              <w:t>2026-04-08 00:00:00 → 2026-04-28 00:00:00</w:t>
+              <w:t>2026-07-07 00:00:00 → 2026-07-27 00:00:00</w:t>
             </w:r>
           </w:p>
         </w:tc>
@@ -1765,7 +1765,7 @@
               <w:rPr>
                 <w:sz w:val="18"/>
               </w:rPr>
-              <w:t>Delayed</w:t>
+              <w:t>Not Started</w:t>
             </w:r>
           </w:p>
         </w:tc>
@@ -1793,7 +1793,7 @@
               <w:rPr>
                 <w:sz w:val="18"/>
               </w:rPr>
-              <w:t>2026-04-29 00:00:00 → 2026-05-19 00:00:00</w:t>
+              <w:t>2026-07-28 00:00:00 → 2026-08-17 00:00:00</w:t>
             </w:r>
           </w:p>
         </w:tc>
@@ -1819,7 +1819,7 @@
               <w:rPr>
                 <w:sz w:val="18"/>
               </w:rPr>
-              <w:t>Delayed</w:t>
+              <w:t>Not Started</w:t>
             </w:r>
           </w:p>
         </w:tc>
@@ -1847,7 +1847,7 @@
               <w:rPr>
                 <w:sz w:val="18"/>
               </w:rPr>
-              <w:t>2026-05-20 00:00:00 → 2026-06-16 00:00:00</w:t>
+              <w:t>2026-08-18 00:00:00 → 2026-09-14 00:00:00</w:t>
             </w:r>
           </w:p>
         </w:tc>
@@ -1873,7 +1873,7 @@
               <w:rPr>
                 <w:sz w:val="18"/>
               </w:rPr>
-              <w:t>Delayed</w:t>
+              <w:t>Not Started</w:t>
             </w:r>
           </w:p>
         </w:tc>
@@ -1901,7 +1901,7 @@
               <w:rPr>
                 <w:sz w:val="18"/>
               </w:rPr>
-              <w:t>2026-06-17 00:00:00 → 2026-07-07 00:00:00</w:t>
+              <w:t>2026-09-15 00:00:00 → 2026-10-05 00:00:00</w:t>
             </w:r>
           </w:p>
         </w:tc>
@@ -1955,7 +1955,7 @@
               <w:rPr>
                 <w:sz w:val="18"/>
               </w:rPr>
-              <w:t>2026-07-08 00:00:00 → 2026-07-25 00:00:00</w:t>
+              <w:t>2026-10-06 00:00:00 → 2026-10-23 00:00:00</w:t>
             </w:r>
           </w:p>
         </w:tc>
@@ -2009,7 +2009,7 @@
               <w:rPr>
                 <w:sz w:val="18"/>
               </w:rPr>
-              <w:t>2026-07-26 00:00:00 → 2026-08-08 00:00:00</w:t>
+              <w:t>2026-10-24 00:00:00 → 2026-11-06 00:00:00</w:t>
             </w:r>
           </w:p>
         </w:tc>
@@ -2063,7 +2063,7 @@
               <w:rPr>
                 <w:sz w:val="18"/>
               </w:rPr>
-              <w:t>2026-08-09 00:00:00 → 2026-08-18 00:00:00</w:t>
+              <w:t>2026-11-07 00:00:00 → 2026-11-16 00:00:00</w:t>
             </w:r>
           </w:p>
         </w:tc>
@@ -2117,7 +2117,7 @@
               <w:rPr>
                 <w:sz w:val="18"/>
               </w:rPr>
-              <w:t>2026-08-19 00:00:00 → 2026-08-28 00:00:00</w:t>
+              <w:t>2026-11-17 00:00:00 → 2026-11-26 00:00:00</w:t>
             </w:r>
           </w:p>
         </w:tc>
@@ -2171,7 +2171,7 @@
               <w:rPr>
                 <w:sz w:val="18"/>
               </w:rPr>
-              <w:t>2026-08-29 00:00:00 → 2026-09-04 00:00:00</w:t>
+              <w:t>2026-11-27 00:00:00 → 2026-12-03 00:00:00</w:t>
             </w:r>
           </w:p>
         </w:tc>
@@ -2219,7 +2219,7 @@
           <w:i w:val="0"/>
           <w:sz w:val="20"/>
         </w:rPr>
-        <w:t>Incharge: Administrator   |   Actual 38.6%  ·  Planned 54.2%  ·  Delayed   |   3.1 person-days this week   |   0 visitor(s)</w:t>
+        <w:t>Incharge: Administrator   |   Actual 21.0%  ·  Planned 0.0%  ·  On Track   |   3.1 person-days this week   |   0 visitor(s)</w:t>
       </w:r>
     </w:p>
     <w:tbl>
@@ -2319,7 +2319,7 @@
               <w:rPr>
                 <w:sz w:val="18"/>
               </w:rPr>
-              <w:t>2026-04-15 00:00:00 → 2026-05-05 00:00:00</w:t>
+              <w:t>2026-07-07 00:00:00 → 2026-07-27 00:00:00</w:t>
             </w:r>
           </w:p>
         </w:tc>
@@ -2373,7 +2373,7 @@
               <w:rPr>
                 <w:sz w:val="18"/>
               </w:rPr>
-              <w:t>2026-05-06 00:00:00 → 2026-05-26 00:00:00</w:t>
+              <w:t>2026-07-28 00:00:00 → 2026-08-17 00:00:00</w:t>
             </w:r>
           </w:p>
         </w:tc>
@@ -2399,7 +2399,7 @@
               <w:rPr>
                 <w:sz w:val="18"/>
               </w:rPr>
-              <w:t>Delayed</w:t>
+              <w:t>In Progress</w:t>
             </w:r>
           </w:p>
         </w:tc>
@@ -2427,33 +2427,33 @@
               <w:rPr>
                 <w:sz w:val="18"/>
               </w:rPr>
-              <w:t>2026-05-27 00:00:00 → 2026-06-23 00:00:00</w:t>
-            </w:r>
-          </w:p>
-        </w:tc>
-        <w:tc>
-          <w:tcPr>
-            <w:tcW w:type="dxa" w:w="2401"/>
-          </w:tcPr>
-          <w:p>
-            <w:r>
-              <w:rPr>
-                <w:sz w:val="18"/>
-              </w:rPr>
-              <w:t>100%</w:t>
-            </w:r>
-          </w:p>
-        </w:tc>
-        <w:tc>
-          <w:tcPr>
-            <w:tcW w:type="dxa" w:w="2401"/>
-          </w:tcPr>
-          <w:p>
-            <w:r>
-              <w:rPr>
-                <w:sz w:val="18"/>
-              </w:rPr>
-              <w:t>Completed</w:t>
+              <w:t>2026-08-18 00:00:00 → 2026-09-14 00:00:00</w:t>
+            </w:r>
+          </w:p>
+        </w:tc>
+        <w:tc>
+          <w:tcPr>
+            <w:tcW w:type="dxa" w:w="2401"/>
+          </w:tcPr>
+          <w:p>
+            <w:r>
+              <w:rPr>
+                <w:sz w:val="18"/>
+              </w:rPr>
+              <w:t>0%</w:t>
+            </w:r>
+          </w:p>
+        </w:tc>
+        <w:tc>
+          <w:tcPr>
+            <w:tcW w:type="dxa" w:w="2401"/>
+          </w:tcPr>
+          <w:p>
+            <w:r>
+              <w:rPr>
+                <w:sz w:val="18"/>
+              </w:rPr>
+              <w:t>Not Started</w:t>
             </w:r>
           </w:p>
         </w:tc>
@@ -2481,7 +2481,7 @@
               <w:rPr>
                 <w:sz w:val="18"/>
               </w:rPr>
-              <w:t>2026-06-24 00:00:00 → 2026-07-14 00:00:00</w:t>
+              <w:t>2026-09-15 00:00:00 → 2026-10-05 00:00:00</w:t>
             </w:r>
           </w:p>
         </w:tc>
@@ -2535,7 +2535,7 @@
               <w:rPr>
                 <w:sz w:val="18"/>
               </w:rPr>
-              <w:t>2026-07-15 00:00:00 → 2026-08-01 00:00:00</w:t>
+              <w:t>2026-10-06 00:00:00 → 2026-10-23 00:00:00</w:t>
             </w:r>
           </w:p>
         </w:tc>
@@ -2589,7 +2589,7 @@
               <w:rPr>
                 <w:sz w:val="18"/>
               </w:rPr>
-              <w:t>2026-08-02 00:00:00 → 2026-08-15 00:00:00</w:t>
+              <w:t>2026-10-24 00:00:00 → 2026-11-06 00:00:00</w:t>
             </w:r>
           </w:p>
         </w:tc>
@@ -2643,7 +2643,7 @@
               <w:rPr>
                 <w:sz w:val="18"/>
               </w:rPr>
-              <w:t>2026-08-16 00:00:00 → 2026-08-25 00:00:00</w:t>
+              <w:t>2026-11-07 00:00:00 → 2026-11-16 00:00:00</w:t>
             </w:r>
           </w:p>
         </w:tc>
@@ -2697,7 +2697,7 @@
               <w:rPr>
                 <w:sz w:val="18"/>
               </w:rPr>
-              <w:t>2026-08-26 00:00:00 → 2026-09-04 00:00:00</w:t>
+              <w:t>2026-11-17 00:00:00 → 2026-11-26 00:00:00</w:t>
             </w:r>
           </w:p>
         </w:tc>
@@ -2751,7 +2751,7 @@
               <w:rPr>
                 <w:sz w:val="18"/>
               </w:rPr>
-              <w:t>2026-09-05 00:00:00 → 2026-09-11 00:00:00</w:t>
+              <w:t>2026-11-27 00:00:00 → 2026-12-03 00:00:00</w:t>
             </w:r>
           </w:p>
         </w:tc>
@@ -2939,7 +2939,7 @@
           <w:i w:val="0"/>
           <w:sz w:val="20"/>
         </w:rPr>
-        <w:t>Incharge: —   |   Actual 0.0%  ·  Planned 49.5%  ·  Delayed   |   0 person-days this week   |   0 visitor(s)</w:t>
+        <w:t>Incharge: —   |   Actual 0.0%  ·  Planned 0.0%  ·  On Track   |   0 person-days this week   |   0 visitor(s)</w:t>
       </w:r>
     </w:p>
     <w:tbl>
@@ -3039,7 +3039,7 @@
               <w:rPr>
                 <w:sz w:val="18"/>
               </w:rPr>
-              <w:t>2026-04-22 00:00:00 → 2026-05-12 00:00:00</w:t>
+              <w:t>2026-07-07 00:00:00 → 2026-07-27 00:00:00</w:t>
             </w:r>
           </w:p>
         </w:tc>
@@ -3065,7 +3065,7 @@
               <w:rPr>
                 <w:sz w:val="18"/>
               </w:rPr>
-              <w:t>Delayed</w:t>
+              <w:t>Not Started</w:t>
             </w:r>
           </w:p>
         </w:tc>
@@ -3093,7 +3093,7 @@
               <w:rPr>
                 <w:sz w:val="18"/>
               </w:rPr>
-              <w:t>2026-05-13 00:00:00 → 2026-06-02 00:00:00</w:t>
+              <w:t>2026-07-28 00:00:00 → 2026-08-17 00:00:00</w:t>
             </w:r>
           </w:p>
         </w:tc>
@@ -3119,7 +3119,7 @@
               <w:rPr>
                 <w:sz w:val="18"/>
               </w:rPr>
-              <w:t>Delayed</w:t>
+              <w:t>Not Started</w:t>
             </w:r>
           </w:p>
         </w:tc>
@@ -3147,7 +3147,7 @@
               <w:rPr>
                 <w:sz w:val="18"/>
               </w:rPr>
-              <w:t>2026-06-03 00:00:00 → 2026-06-30 00:00:00</w:t>
+              <w:t>2026-08-18 00:00:00 → 2026-09-14 00:00:00</w:t>
             </w:r>
           </w:p>
         </w:tc>
@@ -3173,7 +3173,7 @@
               <w:rPr>
                 <w:sz w:val="18"/>
               </w:rPr>
-              <w:t>Delayed</w:t>
+              <w:t>Not Started</w:t>
             </w:r>
           </w:p>
         </w:tc>
@@ -3201,7 +3201,7 @@
               <w:rPr>
                 <w:sz w:val="18"/>
               </w:rPr>
-              <w:t>2026-07-01 00:00:00 → 2026-07-21 00:00:00</w:t>
+              <w:t>2026-09-15 00:00:00 → 2026-10-05 00:00:00</w:t>
             </w:r>
           </w:p>
         </w:tc>
@@ -3255,7 +3255,7 @@
               <w:rPr>
                 <w:sz w:val="18"/>
               </w:rPr>
-              <w:t>2026-07-22 00:00:00 → 2026-08-08 00:00:00</w:t>
+              <w:t>2026-10-06 00:00:00 → 2026-10-23 00:00:00</w:t>
             </w:r>
           </w:p>
         </w:tc>
@@ -3309,7 +3309,7 @@
               <w:rPr>
                 <w:sz w:val="18"/>
               </w:rPr>
-              <w:t>2026-08-09 00:00:00 → 2026-08-22 00:00:00</w:t>
+              <w:t>2026-10-24 00:00:00 → 2026-11-06 00:00:00</w:t>
             </w:r>
           </w:p>
         </w:tc>
@@ -3363,7 +3363,7 @@
               <w:rPr>
                 <w:sz w:val="18"/>
               </w:rPr>
-              <w:t>2026-08-23 00:00:00 → 2026-09-01 00:00:00</w:t>
+              <w:t>2026-11-07 00:00:00 → 2026-11-16 00:00:00</w:t>
             </w:r>
           </w:p>
         </w:tc>
@@ -3417,7 +3417,7 @@
               <w:rPr>
                 <w:sz w:val="18"/>
               </w:rPr>
-              <w:t>2026-09-02 00:00:00 → 2026-09-11 00:00:00</w:t>
+              <w:t>2026-11-17 00:00:00 → 2026-11-26 00:00:00</w:t>
             </w:r>
           </w:p>
         </w:tc>
@@ -3471,7 +3471,7 @@
               <w:rPr>
                 <w:sz w:val="18"/>
               </w:rPr>
-              <w:t>2026-09-12 00:00:00 → 2026-09-18 00:00:00</w:t>
+              <w:t>2026-11-27 00:00:00 → 2026-12-03 00:00:00</w:t>
             </w:r>
           </w:p>
         </w:tc>
@@ -3519,7 +3519,7 @@
           <w:i w:val="0"/>
           <w:sz w:val="20"/>
         </w:rPr>
-        <w:t>Incharge: —   |   Actual 0.0%  ·  Planned 45.0%  ·  Delayed   |   0 person-days this week   |   0 visitor(s)</w:t>
+        <w:t>Incharge: —   |   Actual 0.0%  ·  Planned 0.0%  ·  On Track   |   0 person-days this week   |   0 visitor(s)</w:t>
       </w:r>
     </w:p>
     <w:tbl>
@@ -3619,7 +3619,7 @@
               <w:rPr>
                 <w:sz w:val="18"/>
               </w:rPr>
-              <w:t>2026-04-29 00:00:00 → 2026-05-19 00:00:00</w:t>
+              <w:t>2026-07-07 00:00:00 → 2026-07-27 00:00:00</w:t>
             </w:r>
           </w:p>
         </w:tc>
@@ -3645,7 +3645,7 @@
               <w:rPr>
                 <w:sz w:val="18"/>
               </w:rPr>
-              <w:t>Delayed</w:t>
+              <w:t>Not Started</w:t>
             </w:r>
           </w:p>
         </w:tc>
@@ -3673,7 +3673,7 @@
               <w:rPr>
                 <w:sz w:val="18"/>
               </w:rPr>
-              <w:t>2026-05-20 00:00:00 → 2026-06-09 00:00:00</w:t>
+              <w:t>2026-07-28 00:00:00 → 2026-08-17 00:00:00</w:t>
             </w:r>
           </w:p>
         </w:tc>
@@ -3699,7 +3699,7 @@
               <w:rPr>
                 <w:sz w:val="18"/>
               </w:rPr>
-              <w:t>Delayed</w:t>
+              <w:t>Not Started</w:t>
             </w:r>
           </w:p>
         </w:tc>
@@ -3727,7 +3727,7 @@
               <w:rPr>
                 <w:sz w:val="18"/>
               </w:rPr>
-              <w:t>2026-06-10 00:00:00 → 2026-07-07 00:00:00</w:t>
+              <w:t>2026-08-18 00:00:00 → 2026-09-14 00:00:00</w:t>
             </w:r>
           </w:p>
         </w:tc>
@@ -3781,7 +3781,7 @@
               <w:rPr>
                 <w:sz w:val="18"/>
               </w:rPr>
-              <w:t>2026-07-08 00:00:00 → 2026-07-28 00:00:00</w:t>
+              <w:t>2026-09-15 00:00:00 → 2026-10-05 00:00:00</w:t>
             </w:r>
           </w:p>
         </w:tc>
@@ -3835,7 +3835,7 @@
               <w:rPr>
                 <w:sz w:val="18"/>
               </w:rPr>
-              <w:t>2026-07-29 00:00:00 → 2026-08-15 00:00:00</w:t>
+              <w:t>2026-10-06 00:00:00 → 2026-10-23 00:00:00</w:t>
             </w:r>
           </w:p>
         </w:tc>
@@ -3889,7 +3889,7 @@
               <w:rPr>
                 <w:sz w:val="18"/>
               </w:rPr>
-              <w:t>2026-08-16 00:00:00 → 2026-08-29 00:00:00</w:t>
+              <w:t>2026-10-24 00:00:00 → 2026-11-06 00:00:00</w:t>
             </w:r>
           </w:p>
         </w:tc>
@@ -3943,7 +3943,7 @@
               <w:rPr>
                 <w:sz w:val="18"/>
               </w:rPr>
-              <w:t>2026-08-30 00:00:00 → 2026-09-08 00:00:00</w:t>
+              <w:t>2026-11-07 00:00:00 → 2026-11-16 00:00:00</w:t>
             </w:r>
           </w:p>
         </w:tc>
@@ -3997,7 +3997,7 @@
               <w:rPr>
                 <w:sz w:val="18"/>
               </w:rPr>
-              <w:t>2026-09-09 00:00:00 → 2026-09-18 00:00:00</w:t>
+              <w:t>2026-11-17 00:00:00 → 2026-11-26 00:00:00</w:t>
             </w:r>
           </w:p>
         </w:tc>
@@ -4051,7 +4051,7 @@
               <w:rPr>
                 <w:sz w:val="18"/>
               </w:rPr>
-              <w:t>2026-09-19 00:00:00 → 2026-09-25 00:00:00</w:t>
+              <w:t>2026-11-27 00:00:00 → 2026-12-03 00:00:00</w:t>
             </w:r>
           </w:p>
         </w:tc>
@@ -4099,7 +4099,7 @@
           <w:i w:val="0"/>
           <w:sz w:val="20"/>
         </w:rPr>
-        <w:t>Incharge: —   |   Actual 0.0%  ·  Planned 40.3%  ·  Delayed   |   0 person-days this week   |   0 visitor(s)</w:t>
+        <w:t>Incharge: —   |   Actual 0.0%  ·  Planned 0.0%  ·  On Track   |   0 person-days this week   |   0 visitor(s)</w:t>
       </w:r>
     </w:p>
     <w:tbl>
@@ -4199,7 +4199,7 @@
               <w:rPr>
                 <w:sz w:val="18"/>
               </w:rPr>
-              <w:t>2026-05-06 00:00:00 → 2026-05-26 00:00:00</w:t>
+              <w:t>2026-07-07 00:00:00 → 2026-07-27 00:00:00</w:t>
             </w:r>
           </w:p>
         </w:tc>
@@ -4225,7 +4225,7 @@
               <w:rPr>
                 <w:sz w:val="18"/>
               </w:rPr>
-              <w:t>Delayed</w:t>
+              <w:t>Not Started</w:t>
             </w:r>
           </w:p>
         </w:tc>
@@ -4253,7 +4253,7 @@
               <w:rPr>
                 <w:sz w:val="18"/>
               </w:rPr>
-              <w:t>2026-05-27 00:00:00 → 2026-06-16 00:00:00</w:t>
+              <w:t>2026-07-28 00:00:00 → 2026-08-17 00:00:00</w:t>
             </w:r>
           </w:p>
         </w:tc>
@@ -4279,7 +4279,7 @@
               <w:rPr>
                 <w:sz w:val="18"/>
               </w:rPr>
-              <w:t>Delayed</w:t>
+              <w:t>Not Started</w:t>
             </w:r>
           </w:p>
         </w:tc>
@@ -4307,7 +4307,7 @@
               <w:rPr>
                 <w:sz w:val="18"/>
               </w:rPr>
-              <w:t>2026-06-17 00:00:00 → 2026-07-14 00:00:00</w:t>
+              <w:t>2026-08-18 00:00:00 → 2026-09-14 00:00:00</w:t>
             </w:r>
           </w:p>
         </w:tc>
@@ -4361,7 +4361,7 @@
               <w:rPr>
                 <w:sz w:val="18"/>
               </w:rPr>
-              <w:t>2026-07-15 00:00:00 → 2026-08-04 00:00:00</w:t>
+              <w:t>2026-09-15 00:00:00 → 2026-10-05 00:00:00</w:t>
             </w:r>
           </w:p>
         </w:tc>
@@ -4415,7 +4415,7 @@
               <w:rPr>
                 <w:sz w:val="18"/>
               </w:rPr>
-              <w:t>2026-08-05 00:00:00 → 2026-08-22 00:00:00</w:t>
+              <w:t>2026-10-06 00:00:00 → 2026-10-23 00:00:00</w:t>
             </w:r>
           </w:p>
         </w:tc>
@@ -4469,7 +4469,7 @@
               <w:rPr>
                 <w:sz w:val="18"/>
               </w:rPr>
-              <w:t>2026-08-23 00:00:00 → 2026-09-05 00:00:00</w:t>
+              <w:t>2026-10-24 00:00:00 → 2026-11-06 00:00:00</w:t>
             </w:r>
           </w:p>
         </w:tc>
@@ -4523,7 +4523,7 @@
               <w:rPr>
                 <w:sz w:val="18"/>
               </w:rPr>
-              <w:t>2026-09-06 00:00:00 → 2026-09-15 00:00:00</w:t>
+              <w:t>2026-11-07 00:00:00 → 2026-11-16 00:00:00</w:t>
             </w:r>
           </w:p>
         </w:tc>
@@ -4577,7 +4577,7 @@
               <w:rPr>
                 <w:sz w:val="18"/>
               </w:rPr>
-              <w:t>2026-09-16 00:00:00 → 2026-09-25 00:00:00</w:t>
+              <w:t>2026-11-17 00:00:00 → 2026-11-26 00:00:00</w:t>
             </w:r>
           </w:p>
         </w:tc>
@@ -4631,7 +4631,7 @@
               <w:rPr>
                 <w:sz w:val="18"/>
               </w:rPr>
-              <w:t>2026-09-26 00:00:00 → 2026-10-02 00:00:00</w:t>
+              <w:t>2026-11-27 00:00:00 → 2026-12-03 00:00:00</w:t>
             </w:r>
           </w:p>
         </w:tc>
@@ -4679,7 +4679,7 @@
           <w:i w:val="0"/>
           <w:sz w:val="20"/>
         </w:rPr>
-        <w:t>Incharge: Administrator   |   Actual 0.0%  ·  Planned 35.7%  ·  Delayed   |   0 person-days this week   |   1 visitor(s)</w:t>
+        <w:t>Incharge: Administrator   |   Actual 0.0%  ·  Planned 0.0%  ·  On Track   |   0 person-days this week   |   1 visitor(s)</w:t>
       </w:r>
     </w:p>
     <w:tbl>
@@ -4779,7 +4779,7 @@
               <w:rPr>
                 <w:sz w:val="18"/>
               </w:rPr>
-              <w:t>2026-05-13 00:00:00 → 2026-06-02 00:00:00</w:t>
+              <w:t>2026-07-07 00:00:00 → 2026-07-27 00:00:00</w:t>
             </w:r>
           </w:p>
         </w:tc>
@@ -4805,7 +4805,7 @@
               <w:rPr>
                 <w:sz w:val="18"/>
               </w:rPr>
-              <w:t>Delayed</w:t>
+              <w:t>In Progress</w:t>
             </w:r>
           </w:p>
         </w:tc>
@@ -4833,7 +4833,7 @@
               <w:rPr>
                 <w:sz w:val="18"/>
               </w:rPr>
-              <w:t>2026-06-03 00:00:00 → 2026-06-23 00:00:00</w:t>
+              <w:t>2026-07-28 00:00:00 → 2026-08-17 00:00:00</w:t>
             </w:r>
           </w:p>
         </w:tc>
@@ -4859,7 +4859,7 @@
               <w:rPr>
                 <w:sz w:val="18"/>
               </w:rPr>
-              <w:t>Delayed</w:t>
+              <w:t>Not Started</w:t>
             </w:r>
           </w:p>
         </w:tc>
@@ -4887,7 +4887,7 @@
               <w:rPr>
                 <w:sz w:val="18"/>
               </w:rPr>
-              <w:t>2026-06-24 00:00:00 → 2026-07-21 00:00:00</w:t>
+              <w:t>2026-08-18 00:00:00 → 2026-09-14 00:00:00</w:t>
             </w:r>
           </w:p>
         </w:tc>
@@ -4941,7 +4941,7 @@
               <w:rPr>
                 <w:sz w:val="18"/>
               </w:rPr>
-              <w:t>2026-07-22 00:00:00 → 2026-08-11 00:00:00</w:t>
+              <w:t>2026-09-15 00:00:00 → 2026-10-05 00:00:00</w:t>
             </w:r>
           </w:p>
         </w:tc>
@@ -4995,7 +4995,7 @@
               <w:rPr>
                 <w:sz w:val="18"/>
               </w:rPr>
-              <w:t>2026-08-12 00:00:00 → 2026-08-29 00:00:00</w:t>
+              <w:t>2026-10-06 00:00:00 → 2026-10-23 00:00:00</w:t>
             </w:r>
           </w:p>
         </w:tc>
@@ -5049,7 +5049,7 @@
               <w:rPr>
                 <w:sz w:val="18"/>
               </w:rPr>
-              <w:t>2026-08-30 00:00:00 → 2026-09-12 00:00:00</w:t>
+              <w:t>2026-10-24 00:00:00 → 2026-11-06 00:00:00</w:t>
             </w:r>
           </w:p>
         </w:tc>
@@ -5103,7 +5103,7 @@
               <w:rPr>
                 <w:sz w:val="18"/>
               </w:rPr>
-              <w:t>2026-09-13 00:00:00 → 2026-09-22 00:00:00</w:t>
+              <w:t>2026-11-07 00:00:00 → 2026-11-16 00:00:00</w:t>
             </w:r>
           </w:p>
         </w:tc>
@@ -5157,7 +5157,7 @@
               <w:rPr>
                 <w:sz w:val="18"/>
               </w:rPr>
-              <w:t>2026-09-23 00:00:00 → 2026-10-02 00:00:00</w:t>
+              <w:t>2026-11-17 00:00:00 → 2026-11-26 00:00:00</w:t>
             </w:r>
           </w:p>
         </w:tc>
@@ -5211,7 +5211,7 @@
               <w:rPr>
                 <w:sz w:val="18"/>
               </w:rPr>
-              <w:t>2026-10-03 00:00:00 → 2026-10-09 00:00:00</w:t>
+              <w:t>2026-11-27 00:00:00 → 2026-12-03 00:00:00</w:t>
             </w:r>
           </w:p>
         </w:tc>
@@ -5259,7 +5259,7 @@
           <w:i w:val="0"/>
           <w:sz w:val="20"/>
         </w:rPr>
-        <w:t>Incharge: —   |   Actual 0.0%  ·  Planned 31.0%  ·  Delayed   |   0 person-days this week   |   0 visitor(s)</w:t>
+        <w:t>Incharge: —   |   Actual 0.0%  ·  Planned 0.0%  ·  On Track   |   0 person-days this week   |   0 visitor(s)</w:t>
       </w:r>
     </w:p>
     <w:tbl>
@@ -5359,7 +5359,7 @@
               <w:rPr>
                 <w:sz w:val="18"/>
               </w:rPr>
-              <w:t>2026-05-20 00:00:00 → 2026-06-09 00:00:00</w:t>
+              <w:t>2026-07-07 00:00:00 → 2026-07-27 00:00:00</w:t>
             </w:r>
           </w:p>
         </w:tc>
@@ -5385,7 +5385,7 @@
               <w:rPr>
                 <w:sz w:val="18"/>
               </w:rPr>
-              <w:t>Delayed</w:t>
+              <w:t>Not Started</w:t>
             </w:r>
           </w:p>
         </w:tc>
@@ -5413,7 +5413,7 @@
               <w:rPr>
                 <w:sz w:val="18"/>
               </w:rPr>
-              <w:t>2026-06-10 00:00:00 → 2026-06-30 00:00:00</w:t>
+              <w:t>2026-07-28 00:00:00 → 2026-08-17 00:00:00</w:t>
             </w:r>
           </w:p>
         </w:tc>
@@ -5439,7 +5439,7 @@
               <w:rPr>
                 <w:sz w:val="18"/>
               </w:rPr>
-              <w:t>Delayed</w:t>
+              <w:t>Not Started</w:t>
             </w:r>
           </w:p>
         </w:tc>
@@ -5467,7 +5467,7 @@
               <w:rPr>
                 <w:sz w:val="18"/>
               </w:rPr>
-              <w:t>2026-07-01 00:00:00 → 2026-07-28 00:00:00</w:t>
+              <w:t>2026-08-18 00:00:00 → 2026-09-14 00:00:00</w:t>
             </w:r>
           </w:p>
         </w:tc>
@@ -5521,7 +5521,7 @@
               <w:rPr>
                 <w:sz w:val="18"/>
               </w:rPr>
-              <w:t>2026-07-29 00:00:00 → 2026-08-18 00:00:00</w:t>
+              <w:t>2026-09-15 00:00:00 → 2026-10-05 00:00:00</w:t>
             </w:r>
           </w:p>
         </w:tc>
@@ -5575,7 +5575,7 @@
               <w:rPr>
                 <w:sz w:val="18"/>
               </w:rPr>
-              <w:t>2026-08-19 00:00:00 → 2026-09-05 00:00:00</w:t>
+              <w:t>2026-10-06 00:00:00 → 2026-10-23 00:00:00</w:t>
             </w:r>
           </w:p>
         </w:tc>
@@ -5629,7 +5629,7 @@
               <w:rPr>
                 <w:sz w:val="18"/>
               </w:rPr>
-              <w:t>2026-09-06 00:00:00 → 2026-09-19 00:00:00</w:t>
+              <w:t>2026-10-24 00:00:00 → 2026-11-06 00:00:00</w:t>
             </w:r>
           </w:p>
         </w:tc>
@@ -5683,7 +5683,7 @@
               <w:rPr>
                 <w:sz w:val="18"/>
               </w:rPr>
-              <w:t>2026-09-20 00:00:00 → 2026-09-29 00:00:00</w:t>
+              <w:t>2026-11-07 00:00:00 → 2026-11-16 00:00:00</w:t>
             </w:r>
           </w:p>
         </w:tc>
@@ -5737,7 +5737,7 @@
               <w:rPr>
                 <w:sz w:val="18"/>
               </w:rPr>
-              <w:t>2026-09-30 00:00:00 → 2026-10-09 00:00:00</w:t>
+              <w:t>2026-11-17 00:00:00 → 2026-11-26 00:00:00</w:t>
             </w:r>
           </w:p>
         </w:tc>
@@ -5791,7 +5791,7 @@
               <w:rPr>
                 <w:sz w:val="18"/>
               </w:rPr>
-              <w:t>2026-10-10 00:00:00 → 2026-10-16 00:00:00</w:t>
+              <w:t>2026-11-27 00:00:00 → 2026-12-03 00:00:00</w:t>
             </w:r>
           </w:p>
         </w:tc>
@@ -5839,7 +5839,7 @@
           <w:i w:val="0"/>
           <w:sz w:val="20"/>
         </w:rPr>
-        <w:t>Incharge: —   |   Actual 0.0%  ·  Planned 27.0%  ·  Delayed   |   0 person-days this week   |   0 visitor(s)</w:t>
+        <w:t>Incharge: —   |   Actual 0.0%  ·  Planned 0.0%  ·  On Track   |   0 person-days this week   |   0 visitor(s)</w:t>
       </w:r>
     </w:p>
     <w:tbl>
@@ -5939,7 +5939,7 @@
               <w:rPr>
                 <w:sz w:val="18"/>
               </w:rPr>
-              <w:t>2026-05-27 00:00:00 → 2026-06-16 00:00:00</w:t>
+              <w:t>2026-07-07 00:00:00 → 2026-07-27 00:00:00</w:t>
             </w:r>
           </w:p>
         </w:tc>
@@ -5965,7 +5965,7 @@
               <w:rPr>
                 <w:sz w:val="18"/>
               </w:rPr>
-              <w:t>Delayed</w:t>
+              <w:t>Not Started</w:t>
             </w:r>
           </w:p>
         </w:tc>
@@ -5993,7 +5993,7 @@
               <w:rPr>
                 <w:sz w:val="18"/>
               </w:rPr>
-              <w:t>2026-06-17 00:00:00 → 2026-07-07 00:00:00</w:t>
+              <w:t>2026-07-28 00:00:00 → 2026-08-17 00:00:00</w:t>
             </w:r>
           </w:p>
         </w:tc>
@@ -6047,7 +6047,7 @@
               <w:rPr>
                 <w:sz w:val="18"/>
               </w:rPr>
-              <w:t>2026-07-08 00:00:00 → 2026-08-04 00:00:00</w:t>
+              <w:t>2026-08-18 00:00:00 → 2026-09-14 00:00:00</w:t>
             </w:r>
           </w:p>
         </w:tc>
@@ -6101,7 +6101,7 @@
               <w:rPr>
                 <w:sz w:val="18"/>
               </w:rPr>
-              <w:t>2026-08-05 00:00:00 → 2026-08-25 00:00:00</w:t>
+              <w:t>2026-09-15 00:00:00 → 2026-10-05 00:00:00</w:t>
             </w:r>
           </w:p>
         </w:tc>
@@ -6155,7 +6155,7 @@
               <w:rPr>
                 <w:sz w:val="18"/>
               </w:rPr>
-              <w:t>2026-08-26 00:00:00 → 2026-09-12 00:00:00</w:t>
+              <w:t>2026-10-06 00:00:00 → 2026-10-23 00:00:00</w:t>
             </w:r>
           </w:p>
         </w:tc>
@@ -6209,7 +6209,7 @@
               <w:rPr>
                 <w:sz w:val="18"/>
               </w:rPr>
-              <w:t>2026-09-13 00:00:00 → 2026-09-26 00:00:00</w:t>
+              <w:t>2026-10-24 00:00:00 → 2026-11-06 00:00:00</w:t>
             </w:r>
           </w:p>
         </w:tc>
@@ -6263,7 +6263,7 @@
               <w:rPr>
                 <w:sz w:val="18"/>
               </w:rPr>
-              <w:t>2026-09-27 00:00:00 → 2026-10-06 00:00:00</w:t>
+              <w:t>2026-11-07 00:00:00 → 2026-11-16 00:00:00</w:t>
             </w:r>
           </w:p>
         </w:tc>
@@ -6317,7 +6317,7 @@
               <w:rPr>
                 <w:sz w:val="18"/>
               </w:rPr>
-              <w:t>2026-10-07 00:00:00 → 2026-10-16 00:00:00</w:t>
+              <w:t>2026-11-17 00:00:00 → 2026-11-26 00:00:00</w:t>
             </w:r>
           </w:p>
         </w:tc>
@@ -6371,7 +6371,7 @@
               <w:rPr>
                 <w:sz w:val="18"/>
               </w:rPr>
-              <w:t>2026-10-17 00:00:00 → 2026-10-23 00:00:00</w:t>
+              <w:t>2026-11-27 00:00:00 → 2026-12-03 00:00:00</w:t>
             </w:r>
           </w:p>
         </w:tc>
@@ -6419,7 +6419,7 @@
           <w:i w:val="0"/>
           <w:sz w:val="20"/>
         </w:rPr>
-        <w:t>Incharge: —   |   Actual 0.0%  ·  Planned 21.8%  ·  Delayed   |   0 person-days this week   |   0 visitor(s)</w:t>
+        <w:t>Incharge: —   |   Actual 0.0%  ·  Planned 0.0%  ·  On Track   |   0 person-days this week   |   0 visitor(s)</w:t>
       </w:r>
     </w:p>
     <w:tbl>
@@ -6519,7 +6519,7 @@
               <w:rPr>
                 <w:sz w:val="18"/>
               </w:rPr>
-              <w:t>2026-06-03 00:00:00 → 2026-06-23 00:00:00</w:t>
+              <w:t>2026-07-07 00:00:00 → 2026-07-27 00:00:00</w:t>
             </w:r>
           </w:p>
         </w:tc>
@@ -6545,7 +6545,7 @@
               <w:rPr>
                 <w:sz w:val="18"/>
               </w:rPr>
-              <w:t>Delayed</w:t>
+              <w:t>Not Started</w:t>
             </w:r>
           </w:p>
         </w:tc>
@@ -6573,7 +6573,7 @@
               <w:rPr>
                 <w:sz w:val="18"/>
               </w:rPr>
-              <w:t>2026-06-24 00:00:00 → 2026-07-14 00:00:00</w:t>
+              <w:t>2026-07-28 00:00:00 → 2026-08-17 00:00:00</w:t>
             </w:r>
           </w:p>
         </w:tc>
@@ -6627,7 +6627,7 @@
               <w:rPr>
                 <w:sz w:val="18"/>
               </w:rPr>
-              <w:t>2026-07-15 00:00:00 → 2026-08-11 00:00:00</w:t>
+              <w:t>2026-08-18 00:00:00 → 2026-09-14 00:00:00</w:t>
             </w:r>
           </w:p>
         </w:tc>
@@ -6681,7 +6681,7 @@
               <w:rPr>
                 <w:sz w:val="18"/>
               </w:rPr>
-              <w:t>2026-08-12 00:00:00 → 2026-09-01 00:00:00</w:t>
+              <w:t>2026-09-15 00:00:00 → 2026-10-05 00:00:00</w:t>
             </w:r>
           </w:p>
         </w:tc>
@@ -6735,7 +6735,7 @@
               <w:rPr>
                 <w:sz w:val="18"/>
               </w:rPr>
-              <w:t>2026-09-02 00:00:00 → 2026-09-19 00:00:00</w:t>
+              <w:t>2026-10-06 00:00:00 → 2026-10-23 00:00:00</w:t>
             </w:r>
           </w:p>
         </w:tc>
@@ -6789,7 +6789,7 @@
               <w:rPr>
                 <w:sz w:val="18"/>
               </w:rPr>
-              <w:t>2026-09-20 00:00:00 → 2026-10-03 00:00:00</w:t>
+              <w:t>2026-10-24 00:00:00 → 2026-11-06 00:00:00</w:t>
             </w:r>
           </w:p>
         </w:tc>
@@ -6843,7 +6843,7 @@
               <w:rPr>
                 <w:sz w:val="18"/>
               </w:rPr>
-              <w:t>2026-10-04 00:00:00 → 2026-10-13 00:00:00</w:t>
+              <w:t>2026-11-07 00:00:00 → 2026-11-16 00:00:00</w:t>
             </w:r>
           </w:p>
         </w:tc>
@@ -6897,7 +6897,7 @@
               <w:rPr>
                 <w:sz w:val="18"/>
               </w:rPr>
-              <w:t>2026-10-14 00:00:00 → 2026-10-23 00:00:00</w:t>
+              <w:t>2026-11-17 00:00:00 → 2026-11-26 00:00:00</w:t>
             </w:r>
           </w:p>
         </w:tc>
@@ -6951,7 +6951,7 @@
               <w:rPr>
                 <w:sz w:val="18"/>
               </w:rPr>
-              <w:t>2026-10-24 00:00:00 → 2026-10-30 00:00:00</w:t>
+              <w:t>2026-11-27 00:00:00 → 2026-12-03 00:00:00</w:t>
             </w:r>
           </w:p>
         </w:tc>
@@ -6999,7 +6999,7 @@
           <w:i w:val="0"/>
           <w:sz w:val="20"/>
         </w:rPr>
-        <w:t>Incharge: —   |   Actual 0.0%  ·  Planned 16.5%  ·  Delayed   |   0 person-days this week   |   0 visitor(s)</w:t>
+        <w:t>Incharge: —   |   Actual 0.0%  ·  Planned 0.0%  ·  On Track   |   0 person-days this week   |   0 visitor(s)</w:t>
       </w:r>
     </w:p>
     <w:tbl>
@@ -7099,7 +7099,7 @@
               <w:rPr>
                 <w:sz w:val="18"/>
               </w:rPr>
-              <w:t>2026-06-10 00:00:00 → 2026-06-30 00:00:00</w:t>
+              <w:t>2026-07-07 00:00:00 → 2026-07-27 00:00:00</w:t>
             </w:r>
           </w:p>
         </w:tc>
@@ -7125,7 +7125,7 @@
               <w:rPr>
                 <w:sz w:val="18"/>
               </w:rPr>
-              <w:t>Delayed</w:t>
+              <w:t>Not Started</w:t>
             </w:r>
           </w:p>
         </w:tc>
@@ -7153,7 +7153,7 @@
               <w:rPr>
                 <w:sz w:val="18"/>
               </w:rPr>
-              <w:t>2026-07-01 00:00:00 → 2026-07-21 00:00:00</w:t>
+              <w:t>2026-07-28 00:00:00 → 2026-08-17 00:00:00</w:t>
             </w:r>
           </w:p>
         </w:tc>
@@ -7207,7 +7207,7 @@
               <w:rPr>
                 <w:sz w:val="18"/>
               </w:rPr>
-              <w:t>2026-07-22 00:00:00 → 2026-08-18 00:00:00</w:t>
+              <w:t>2026-08-18 00:00:00 → 2026-09-14 00:00:00</w:t>
             </w:r>
           </w:p>
         </w:tc>
@@ -7261,7 +7261,7 @@
               <w:rPr>
                 <w:sz w:val="18"/>
               </w:rPr>
-              <w:t>2026-08-19 00:00:00 → 2026-09-08 00:00:00</w:t>
+              <w:t>2026-09-15 00:00:00 → 2026-10-05 00:00:00</w:t>
             </w:r>
           </w:p>
         </w:tc>
@@ -7315,7 +7315,7 @@
               <w:rPr>
                 <w:sz w:val="18"/>
               </w:rPr>
-              <w:t>2026-09-09 00:00:00 → 2026-09-26 00:00:00</w:t>
+              <w:t>2026-10-06 00:00:00 → 2026-10-23 00:00:00</w:t>
             </w:r>
           </w:p>
         </w:tc>
@@ -7369,7 +7369,7 @@
               <w:rPr>
                 <w:sz w:val="18"/>
               </w:rPr>
-              <w:t>2026-09-27 00:00:00 → 2026-10-10 00:00:00</w:t>
+              <w:t>2026-10-24 00:00:00 → 2026-11-06 00:00:00</w:t>
             </w:r>
           </w:p>
         </w:tc>
@@ -7423,7 +7423,7 @@
               <w:rPr>
                 <w:sz w:val="18"/>
               </w:rPr>
-              <w:t>2026-10-11 00:00:00 → 2026-10-20 00:00:00</w:t>
+              <w:t>2026-11-07 00:00:00 → 2026-11-16 00:00:00</w:t>
             </w:r>
           </w:p>
         </w:tc>
@@ -7477,7 +7477,7 @@
               <w:rPr>
                 <w:sz w:val="18"/>
               </w:rPr>
-              <w:t>2026-10-21 00:00:00 → 2026-10-30 00:00:00</w:t>
+              <w:t>2026-11-17 00:00:00 → 2026-11-26 00:00:00</w:t>
             </w:r>
           </w:p>
         </w:tc>
@@ -7531,7 +7531,7 @@
               <w:rPr>
                 <w:sz w:val="18"/>
               </w:rPr>
-              <w:t>2026-10-31 00:00:00 → 2026-11-06 00:00:00</w:t>
+              <w:t>2026-11-27 00:00:00 → 2026-12-03 00:00:00</w:t>
             </w:r>
           </w:p>
         </w:tc>
@@ -7579,7 +7579,7 @@
           <w:i w:val="0"/>
           <w:sz w:val="20"/>
         </w:rPr>
-        <w:t>Incharge: —   |   Actual 100.0%  ·  Planned 12.0%  ·  On Track   |   0 person-days this week   |   0 visitor(s)</w:t>
+        <w:t>Incharge: —   |   Actual 5.0%  ·  Planned 0.0%  ·  On Track   |   0 person-days this week   |   0 visitor(s)</w:t>
       </w:r>
     </w:p>
     <w:tbl>
@@ -7679,33 +7679,33 @@
               <w:rPr>
                 <w:sz w:val="18"/>
               </w:rPr>
-              <w:t>2026-06-17 00:00:00 → 2026-07-07 00:00:00</w:t>
-            </w:r>
-          </w:p>
-        </w:tc>
-        <w:tc>
-          <w:tcPr>
-            <w:tcW w:type="dxa" w:w="2401"/>
-          </w:tcPr>
-          <w:p>
-            <w:r>
-              <w:rPr>
-                <w:sz w:val="18"/>
-              </w:rPr>
-              <w:t>100%</w:t>
-            </w:r>
-          </w:p>
-        </w:tc>
-        <w:tc>
-          <w:tcPr>
-            <w:tcW w:type="dxa" w:w="2401"/>
-          </w:tcPr>
-          <w:p>
-            <w:r>
-              <w:rPr>
-                <w:sz w:val="18"/>
-              </w:rPr>
-              <w:t>Completed</w:t>
+              <w:t>2026-07-07 00:00:00 → 2026-07-27 00:00:00</w:t>
+            </w:r>
+          </w:p>
+        </w:tc>
+        <w:tc>
+          <w:tcPr>
+            <w:tcW w:type="dxa" w:w="2401"/>
+          </w:tcPr>
+          <w:p>
+            <w:r>
+              <w:rPr>
+                <w:sz w:val="18"/>
+              </w:rPr>
+              <w:t>0%</w:t>
+            </w:r>
+          </w:p>
+        </w:tc>
+        <w:tc>
+          <w:tcPr>
+            <w:tcW w:type="dxa" w:w="2401"/>
+          </w:tcPr>
+          <w:p>
+            <w:r>
+              <w:rPr>
+                <w:sz w:val="18"/>
+              </w:rPr>
+              <w:t>Not Started</w:t>
             </w:r>
           </w:p>
         </w:tc>
@@ -7733,33 +7733,33 @@
               <w:rPr>
                 <w:sz w:val="18"/>
               </w:rPr>
-              <w:t>2026-07-08 00:00:00 → 2026-07-28 00:00:00</w:t>
-            </w:r>
-          </w:p>
-        </w:tc>
-        <w:tc>
-          <w:tcPr>
-            <w:tcW w:type="dxa" w:w="2401"/>
-          </w:tcPr>
-          <w:p>
-            <w:r>
-              <w:rPr>
-                <w:sz w:val="18"/>
-              </w:rPr>
-              <w:t>100%</w:t>
-            </w:r>
-          </w:p>
-        </w:tc>
-        <w:tc>
-          <w:tcPr>
-            <w:tcW w:type="dxa" w:w="2401"/>
-          </w:tcPr>
-          <w:p>
-            <w:r>
-              <w:rPr>
-                <w:sz w:val="18"/>
-              </w:rPr>
-              <w:t>Completed</w:t>
+              <w:t>2026-07-28 00:00:00 → 2026-08-17 00:00:00</w:t>
+            </w:r>
+          </w:p>
+        </w:tc>
+        <w:tc>
+          <w:tcPr>
+            <w:tcW w:type="dxa" w:w="2401"/>
+          </w:tcPr>
+          <w:p>
+            <w:r>
+              <w:rPr>
+                <w:sz w:val="18"/>
+              </w:rPr>
+              <w:t>0%</w:t>
+            </w:r>
+          </w:p>
+        </w:tc>
+        <w:tc>
+          <w:tcPr>
+            <w:tcW w:type="dxa" w:w="2401"/>
+          </w:tcPr>
+          <w:p>
+            <w:r>
+              <w:rPr>
+                <w:sz w:val="18"/>
+              </w:rPr>
+              <w:t>Not Started</w:t>
             </w:r>
           </w:p>
         </w:tc>
@@ -7787,33 +7787,33 @@
               <w:rPr>
                 <w:sz w:val="18"/>
               </w:rPr>
-              <w:t>2026-07-29 00:00:00 → 2026-08-25 00:00:00</w:t>
-            </w:r>
-          </w:p>
-        </w:tc>
-        <w:tc>
-          <w:tcPr>
-            <w:tcW w:type="dxa" w:w="2401"/>
-          </w:tcPr>
-          <w:p>
-            <w:r>
-              <w:rPr>
-                <w:sz w:val="18"/>
-              </w:rPr>
-              <w:t>100%</w:t>
-            </w:r>
-          </w:p>
-        </w:tc>
-        <w:tc>
-          <w:tcPr>
-            <w:tcW w:type="dxa" w:w="2401"/>
-          </w:tcPr>
-          <w:p>
-            <w:r>
-              <w:rPr>
-                <w:sz w:val="18"/>
-              </w:rPr>
-              <w:t>Completed</w:t>
+              <w:t>2026-08-18 00:00:00 → 2026-09-14 00:00:00</w:t>
+            </w:r>
+          </w:p>
+        </w:tc>
+        <w:tc>
+          <w:tcPr>
+            <w:tcW w:type="dxa" w:w="2401"/>
+          </w:tcPr>
+          <w:p>
+            <w:r>
+              <w:rPr>
+                <w:sz w:val="18"/>
+              </w:rPr>
+              <w:t>0%</w:t>
+            </w:r>
+          </w:p>
+        </w:tc>
+        <w:tc>
+          <w:tcPr>
+            <w:tcW w:type="dxa" w:w="2401"/>
+          </w:tcPr>
+          <w:p>
+            <w:r>
+              <w:rPr>
+                <w:sz w:val="18"/>
+              </w:rPr>
+              <w:t>Not Started</w:t>
             </w:r>
           </w:p>
         </w:tc>
@@ -7841,33 +7841,33 @@
               <w:rPr>
                 <w:sz w:val="18"/>
               </w:rPr>
-              <w:t>2026-08-26 00:00:00 → 2026-09-15 00:00:00</w:t>
-            </w:r>
-          </w:p>
-        </w:tc>
-        <w:tc>
-          <w:tcPr>
-            <w:tcW w:type="dxa" w:w="2401"/>
-          </w:tcPr>
-          <w:p>
-            <w:r>
-              <w:rPr>
-                <w:sz w:val="18"/>
-              </w:rPr>
-              <w:t>100%</w:t>
-            </w:r>
-          </w:p>
-        </w:tc>
-        <w:tc>
-          <w:tcPr>
-            <w:tcW w:type="dxa" w:w="2401"/>
-          </w:tcPr>
-          <w:p>
-            <w:r>
-              <w:rPr>
-                <w:sz w:val="18"/>
-              </w:rPr>
-              <w:t>Completed</w:t>
+              <w:t>2026-09-15 00:00:00 → 2026-10-05 00:00:00</w:t>
+            </w:r>
+          </w:p>
+        </w:tc>
+        <w:tc>
+          <w:tcPr>
+            <w:tcW w:type="dxa" w:w="2401"/>
+          </w:tcPr>
+          <w:p>
+            <w:r>
+              <w:rPr>
+                <w:sz w:val="18"/>
+              </w:rPr>
+              <w:t>0%</w:t>
+            </w:r>
+          </w:p>
+        </w:tc>
+        <w:tc>
+          <w:tcPr>
+            <w:tcW w:type="dxa" w:w="2401"/>
+          </w:tcPr>
+          <w:p>
+            <w:r>
+              <w:rPr>
+                <w:sz w:val="18"/>
+              </w:rPr>
+              <w:t>Not Started</w:t>
             </w:r>
           </w:p>
         </w:tc>
@@ -7895,33 +7895,33 @@
               <w:rPr>
                 <w:sz w:val="18"/>
               </w:rPr>
-              <w:t>2026-09-16 00:00:00 → 2026-10-03 00:00:00</w:t>
-            </w:r>
-          </w:p>
-        </w:tc>
-        <w:tc>
-          <w:tcPr>
-            <w:tcW w:type="dxa" w:w="2401"/>
-          </w:tcPr>
-          <w:p>
-            <w:r>
-              <w:rPr>
-                <w:sz w:val="18"/>
-              </w:rPr>
-              <w:t>100%</w:t>
-            </w:r>
-          </w:p>
-        </w:tc>
-        <w:tc>
-          <w:tcPr>
-            <w:tcW w:type="dxa" w:w="2401"/>
-          </w:tcPr>
-          <w:p>
-            <w:r>
-              <w:rPr>
-                <w:sz w:val="18"/>
-              </w:rPr>
-              <w:t>Completed</w:t>
+              <w:t>2026-10-06 00:00:00 → 2026-10-23 00:00:00</w:t>
+            </w:r>
+          </w:p>
+        </w:tc>
+        <w:tc>
+          <w:tcPr>
+            <w:tcW w:type="dxa" w:w="2401"/>
+          </w:tcPr>
+          <w:p>
+            <w:r>
+              <w:rPr>
+                <w:sz w:val="18"/>
+              </w:rPr>
+              <w:t>0%</w:t>
+            </w:r>
+          </w:p>
+        </w:tc>
+        <w:tc>
+          <w:tcPr>
+            <w:tcW w:type="dxa" w:w="2401"/>
+          </w:tcPr>
+          <w:p>
+            <w:r>
+              <w:rPr>
+                <w:sz w:val="18"/>
+              </w:rPr>
+              <w:t>Not Started</w:t>
             </w:r>
           </w:p>
         </w:tc>
@@ -7949,33 +7949,33 @@
               <w:rPr>
                 <w:sz w:val="18"/>
               </w:rPr>
-              <w:t>2026-10-04 00:00:00 → 2026-10-17 00:00:00</w:t>
-            </w:r>
-          </w:p>
-        </w:tc>
-        <w:tc>
-          <w:tcPr>
-            <w:tcW w:type="dxa" w:w="2401"/>
-          </w:tcPr>
-          <w:p>
-            <w:r>
-              <w:rPr>
-                <w:sz w:val="18"/>
-              </w:rPr>
-              <w:t>100%</w:t>
-            </w:r>
-          </w:p>
-        </w:tc>
-        <w:tc>
-          <w:tcPr>
-            <w:tcW w:type="dxa" w:w="2401"/>
-          </w:tcPr>
-          <w:p>
-            <w:r>
-              <w:rPr>
-                <w:sz w:val="18"/>
-              </w:rPr>
-              <w:t>Completed</w:t>
+              <w:t>2026-10-24 00:00:00 → 2026-11-06 00:00:00</w:t>
+            </w:r>
+          </w:p>
+        </w:tc>
+        <w:tc>
+          <w:tcPr>
+            <w:tcW w:type="dxa" w:w="2401"/>
+          </w:tcPr>
+          <w:p>
+            <w:r>
+              <w:rPr>
+                <w:sz w:val="18"/>
+              </w:rPr>
+              <w:t>0%</w:t>
+            </w:r>
+          </w:p>
+        </w:tc>
+        <w:tc>
+          <w:tcPr>
+            <w:tcW w:type="dxa" w:w="2401"/>
+          </w:tcPr>
+          <w:p>
+            <w:r>
+              <w:rPr>
+                <w:sz w:val="18"/>
+              </w:rPr>
+              <w:t>Not Started</w:t>
             </w:r>
           </w:p>
         </w:tc>
@@ -8003,33 +8003,33 @@
               <w:rPr>
                 <w:sz w:val="18"/>
               </w:rPr>
-              <w:t>2026-10-18 00:00:00 → 2026-10-27 00:00:00</w:t>
-            </w:r>
-          </w:p>
-        </w:tc>
-        <w:tc>
-          <w:tcPr>
-            <w:tcW w:type="dxa" w:w="2401"/>
-          </w:tcPr>
-          <w:p>
-            <w:r>
-              <w:rPr>
-                <w:sz w:val="18"/>
-              </w:rPr>
-              <w:t>100%</w:t>
-            </w:r>
-          </w:p>
-        </w:tc>
-        <w:tc>
-          <w:tcPr>
-            <w:tcW w:type="dxa" w:w="2401"/>
-          </w:tcPr>
-          <w:p>
-            <w:r>
-              <w:rPr>
-                <w:sz w:val="18"/>
-              </w:rPr>
-              <w:t>Completed</w:t>
+              <w:t>2026-11-07 00:00:00 → 2026-11-16 00:00:00</w:t>
+            </w:r>
+          </w:p>
+        </w:tc>
+        <w:tc>
+          <w:tcPr>
+            <w:tcW w:type="dxa" w:w="2401"/>
+          </w:tcPr>
+          <w:p>
+            <w:r>
+              <w:rPr>
+                <w:sz w:val="18"/>
+              </w:rPr>
+              <w:t>0%</w:t>
+            </w:r>
+          </w:p>
+        </w:tc>
+        <w:tc>
+          <w:tcPr>
+            <w:tcW w:type="dxa" w:w="2401"/>
+          </w:tcPr>
+          <w:p>
+            <w:r>
+              <w:rPr>
+                <w:sz w:val="18"/>
+              </w:rPr>
+              <w:t>Not Started</w:t>
             </w:r>
           </w:p>
         </w:tc>
@@ -8057,33 +8057,33 @@
               <w:rPr>
                 <w:sz w:val="18"/>
               </w:rPr>
-              <w:t>2026-10-28 00:00:00 → 2026-11-06 00:00:00</w:t>
-            </w:r>
-          </w:p>
-        </w:tc>
-        <w:tc>
-          <w:tcPr>
-            <w:tcW w:type="dxa" w:w="2401"/>
-          </w:tcPr>
-          <w:p>
-            <w:r>
-              <w:rPr>
-                <w:sz w:val="18"/>
-              </w:rPr>
-              <w:t>100%</w:t>
-            </w:r>
-          </w:p>
-        </w:tc>
-        <w:tc>
-          <w:tcPr>
-            <w:tcW w:type="dxa" w:w="2401"/>
-          </w:tcPr>
-          <w:p>
-            <w:r>
-              <w:rPr>
-                <w:sz w:val="18"/>
-              </w:rPr>
-              <w:t>Completed</w:t>
+              <w:t>2026-11-17 00:00:00 → 2026-11-26 00:00:00</w:t>
+            </w:r>
+          </w:p>
+        </w:tc>
+        <w:tc>
+          <w:tcPr>
+            <w:tcW w:type="dxa" w:w="2401"/>
+          </w:tcPr>
+          <w:p>
+            <w:r>
+              <w:rPr>
+                <w:sz w:val="18"/>
+              </w:rPr>
+              <w:t>0%</w:t>
+            </w:r>
+          </w:p>
+        </w:tc>
+        <w:tc>
+          <w:tcPr>
+            <w:tcW w:type="dxa" w:w="2401"/>
+          </w:tcPr>
+          <w:p>
+            <w:r>
+              <w:rPr>
+                <w:sz w:val="18"/>
+              </w:rPr>
+              <w:t>Not Started</w:t>
             </w:r>
           </w:p>
         </w:tc>
@@ -8111,7 +8111,7 @@
               <w:rPr>
                 <w:sz w:val="18"/>
               </w:rPr>
-              <w:t>2026-11-07 00:00:00 → 2026-11-13 00:00:00</w:t>
+              <w:t>2026-11-27 00:00:00 → 2026-12-03 00:00:00</w:t>
             </w:r>
           </w:p>
         </w:tc>
@@ -8159,7 +8159,7 @@
           <w:i w:val="0"/>
           <w:sz w:val="20"/>
         </w:rPr>
-        <w:t>Incharge: —   |   Actual 0.0%  ·  Planned 7.8%  ·  Delayed   |   0 person-days this week   |   0 visitor(s)</w:t>
+        <w:t>Incharge: —   |   Actual 0.0%  ·  Planned 0.0%  ·  On Track   |   0 person-days this week   |   0 visitor(s)</w:t>
       </w:r>
     </w:p>
     <w:tbl>
@@ -8259,7 +8259,7 @@
               <w:rPr>
                 <w:sz w:val="18"/>
               </w:rPr>
-              <w:t>2026-06-24 00:00:00 → 2026-07-14 00:00:00</w:t>
+              <w:t>2026-07-07 00:00:00 → 2026-07-27 00:00:00</w:t>
             </w:r>
           </w:p>
         </w:tc>
@@ -8313,7 +8313,7 @@
               <w:rPr>
                 <w:sz w:val="18"/>
               </w:rPr>
-              <w:t>2026-07-15 00:00:00 → 2026-08-04 00:00:00</w:t>
+              <w:t>2026-07-28 00:00:00 → 2026-08-17 00:00:00</w:t>
             </w:r>
           </w:p>
         </w:tc>
@@ -8367,7 +8367,7 @@
               <w:rPr>
                 <w:sz w:val="18"/>
               </w:rPr>
-              <w:t>2026-08-05 00:00:00 → 2026-09-01 00:00:00</w:t>
+              <w:t>2026-08-18 00:00:00 → 2026-09-14 00:00:00</w:t>
             </w:r>
           </w:p>
         </w:tc>
@@ -8421,7 +8421,7 @@
               <w:rPr>
                 <w:sz w:val="18"/>
               </w:rPr>
-              <w:t>2026-09-02 00:00:00 → 2026-09-22 00:00:00</w:t>
+              <w:t>2026-09-15 00:00:00 → 2026-10-05 00:00:00</w:t>
             </w:r>
           </w:p>
         </w:tc>
@@ -8475,7 +8475,7 @@
               <w:rPr>
                 <w:sz w:val="18"/>
               </w:rPr>
-              <w:t>2026-09-23 00:00:00 → 2026-10-10 00:00:00</w:t>
+              <w:t>2026-10-06 00:00:00 → 2026-10-23 00:00:00</w:t>
             </w:r>
           </w:p>
         </w:tc>
@@ -8529,7 +8529,7 @@
               <w:rPr>
                 <w:sz w:val="18"/>
               </w:rPr>
-              <w:t>2026-10-11 00:00:00 → 2026-10-24 00:00:00</w:t>
+              <w:t>2026-10-24 00:00:00 → 2026-11-06 00:00:00</w:t>
             </w:r>
           </w:p>
         </w:tc>
@@ -8583,7 +8583,7 @@
               <w:rPr>
                 <w:sz w:val="18"/>
               </w:rPr>
-              <w:t>2026-10-25 00:00:00 → 2026-11-03 00:00:00</w:t>
+              <w:t>2026-11-07 00:00:00 → 2026-11-16 00:00:00</w:t>
             </w:r>
           </w:p>
         </w:tc>
@@ -8637,7 +8637,7 @@
               <w:rPr>
                 <w:sz w:val="18"/>
               </w:rPr>
-              <w:t>2026-11-04 00:00:00 → 2026-11-13 00:00:00</w:t>
+              <w:t>2026-11-17 00:00:00 → 2026-11-26 00:00:00</w:t>
             </w:r>
           </w:p>
         </w:tc>
@@ -8691,7 +8691,7 @@
               <w:rPr>
                 <w:sz w:val="18"/>
               </w:rPr>
-              <w:t>2026-11-14 00:00:00 → 2026-11-20 00:00:00</w:t>
+              <w:t>2026-11-27 00:00:00 → 2026-12-03 00:00:00</w:t>
             </w:r>
           </w:p>
         </w:tc>
@@ -9231,964 +9231,44 @@
               <w:rPr>
                 <w:sz w:val="18"/>
               </w:rPr>
-              <w:t>CO2</w:t>
-            </w:r>
-          </w:p>
-        </w:tc>
-        <w:tc>
-          <w:tcPr>
-            <w:tcW w:type="dxa" w:w="2401"/>
-          </w:tcPr>
-          <w:p>
-            <w:r>
-              <w:rPr>
-                <w:sz w:val="18"/>
-              </w:rPr>
-              <w:t>CO2 - Civil &amp; Foundation</w:t>
-            </w:r>
-          </w:p>
-        </w:tc>
-        <w:tc>
-          <w:tcPr>
-            <w:tcW w:type="dxa" w:w="2401"/>
-          </w:tcPr>
-          <w:p>
-            <w:r>
-              <w:rPr>
-                <w:sz w:val="18"/>
-              </w:rPr>
-              <w:t>2026-04-28 00:00:00</w:t>
-            </w:r>
-          </w:p>
-        </w:tc>
-        <w:tc>
-          <w:tcPr>
-            <w:tcW w:type="dxa" w:w="2401"/>
-          </w:tcPr>
-          <w:p>
-            <w:r>
-              <w:rPr>
-                <w:sz w:val="18"/>
-              </w:rPr>
-              <w:t>0%</w:t>
-            </w:r>
-          </w:p>
-        </w:tc>
-      </w:tr>
-      <w:tr>
-        <w:tc>
-          <w:tcPr>
-            <w:tcW w:type="dxa" w:w="2401"/>
-          </w:tcPr>
-          <w:p>
-            <w:r>
-              <w:rPr>
-                <w:sz w:val="18"/>
-              </w:rPr>
-              <w:t>CO2</w:t>
-            </w:r>
-          </w:p>
-        </w:tc>
-        <w:tc>
-          <w:tcPr>
-            <w:tcW w:type="dxa" w:w="2401"/>
-          </w:tcPr>
-          <w:p>
-            <w:r>
-              <w:rPr>
-                <w:sz w:val="18"/>
-              </w:rPr>
-              <w:t>CO2 - Structural / Erection</w:t>
-            </w:r>
-          </w:p>
-        </w:tc>
-        <w:tc>
-          <w:tcPr>
-            <w:tcW w:type="dxa" w:w="2401"/>
-          </w:tcPr>
-          <w:p>
-            <w:r>
-              <w:rPr>
-                <w:sz w:val="18"/>
-              </w:rPr>
-              <w:t>2026-05-19 00:00:00</w:t>
-            </w:r>
-          </w:p>
-        </w:tc>
-        <w:tc>
-          <w:tcPr>
-            <w:tcW w:type="dxa" w:w="2401"/>
-          </w:tcPr>
-          <w:p>
-            <w:r>
-              <w:rPr>
-                <w:sz w:val="18"/>
-              </w:rPr>
-              <w:t>0%</w:t>
-            </w:r>
-          </w:p>
-        </w:tc>
-      </w:tr>
-      <w:tr>
-        <w:tc>
-          <w:tcPr>
-            <w:tcW w:type="dxa" w:w="2401"/>
-          </w:tcPr>
-          <w:p>
-            <w:r>
-              <w:rPr>
-                <w:sz w:val="18"/>
-              </w:rPr>
-              <w:t>CO2</w:t>
-            </w:r>
-          </w:p>
-        </w:tc>
-        <w:tc>
-          <w:tcPr>
-            <w:tcW w:type="dxa" w:w="2401"/>
-          </w:tcPr>
-          <w:p>
-            <w:r>
-              <w:rPr>
-                <w:sz w:val="18"/>
-              </w:rPr>
-              <w:t>CO2 - Equipment Installation</w:t>
-            </w:r>
-          </w:p>
-        </w:tc>
-        <w:tc>
-          <w:tcPr>
-            <w:tcW w:type="dxa" w:w="2401"/>
-          </w:tcPr>
-          <w:p>
-            <w:r>
-              <w:rPr>
-                <w:sz w:val="18"/>
-              </w:rPr>
-              <w:t>2026-06-16 00:00:00</w:t>
-            </w:r>
-          </w:p>
-        </w:tc>
-        <w:tc>
-          <w:tcPr>
-            <w:tcW w:type="dxa" w:w="2401"/>
-          </w:tcPr>
-          <w:p>
-            <w:r>
-              <w:rPr>
-                <w:sz w:val="18"/>
-              </w:rPr>
-              <w:t>0%</w:t>
-            </w:r>
-          </w:p>
-        </w:tc>
-      </w:tr>
-      <w:tr>
-        <w:tc>
-          <w:tcPr>
-            <w:tcW w:type="dxa" w:w="2401"/>
-          </w:tcPr>
-          <w:p>
-            <w:r>
-              <w:rPr>
-                <w:sz w:val="18"/>
-              </w:rPr>
-              <w:t>DIST</w:t>
-            </w:r>
-          </w:p>
-        </w:tc>
-        <w:tc>
-          <w:tcPr>
-            <w:tcW w:type="dxa" w:w="2401"/>
-          </w:tcPr>
-          <w:p>
-            <w:r>
-              <w:rPr>
-                <w:sz w:val="18"/>
-              </w:rPr>
-              <w:t>DIST - Structural / Erection</w:t>
-            </w:r>
-          </w:p>
-        </w:tc>
-        <w:tc>
-          <w:tcPr>
-            <w:tcW w:type="dxa" w:w="2401"/>
-          </w:tcPr>
-          <w:p>
-            <w:r>
-              <w:rPr>
-                <w:sz w:val="18"/>
-              </w:rPr>
-              <w:t>2026-05-26 00:00:00</w:t>
-            </w:r>
-          </w:p>
-        </w:tc>
-        <w:tc>
-          <w:tcPr>
-            <w:tcW w:type="dxa" w:w="2401"/>
-          </w:tcPr>
-          <w:p>
-            <w:r>
-              <w:rPr>
-                <w:sz w:val="18"/>
-              </w:rPr>
-              <w:t>60%</w:t>
-            </w:r>
-          </w:p>
-        </w:tc>
-      </w:tr>
-      <w:tr>
-        <w:tc>
-          <w:tcPr>
-            <w:tcW w:type="dxa" w:w="2401"/>
-          </w:tcPr>
-          <w:p>
-            <w:r>
-              <w:rPr>
-                <w:sz w:val="18"/>
-              </w:rPr>
-              <w:t>DRY</w:t>
-            </w:r>
-          </w:p>
-        </w:tc>
-        <w:tc>
-          <w:tcPr>
-            <w:tcW w:type="dxa" w:w="2401"/>
-          </w:tcPr>
-          <w:p>
-            <w:r>
-              <w:rPr>
-                <w:sz w:val="18"/>
-              </w:rPr>
-              <w:t>DRY - Civil &amp; Foundation</w:t>
-            </w:r>
-          </w:p>
-        </w:tc>
-        <w:tc>
-          <w:tcPr>
-            <w:tcW w:type="dxa" w:w="2401"/>
-          </w:tcPr>
-          <w:p>
-            <w:r>
-              <w:rPr>
-                <w:sz w:val="18"/>
-              </w:rPr>
-              <w:t>2026-05-12 00:00:00</w:t>
-            </w:r>
-          </w:p>
-        </w:tc>
-        <w:tc>
-          <w:tcPr>
-            <w:tcW w:type="dxa" w:w="2401"/>
-          </w:tcPr>
-          <w:p>
-            <w:r>
-              <w:rPr>
-                <w:sz w:val="18"/>
-              </w:rPr>
-              <w:t>0%</w:t>
-            </w:r>
-          </w:p>
-        </w:tc>
-      </w:tr>
-      <w:tr>
-        <w:tc>
-          <w:tcPr>
-            <w:tcW w:type="dxa" w:w="2401"/>
-          </w:tcPr>
-          <w:p>
-            <w:r>
-              <w:rPr>
-                <w:sz w:val="18"/>
-              </w:rPr>
-              <w:t>DRY</w:t>
-            </w:r>
-          </w:p>
-        </w:tc>
-        <w:tc>
-          <w:tcPr>
-            <w:tcW w:type="dxa" w:w="2401"/>
-          </w:tcPr>
-          <w:p>
-            <w:r>
-              <w:rPr>
-                <w:sz w:val="18"/>
-              </w:rPr>
-              <w:t>DRY - Structural / Erection</w:t>
-            </w:r>
-          </w:p>
-        </w:tc>
-        <w:tc>
-          <w:tcPr>
-            <w:tcW w:type="dxa" w:w="2401"/>
-          </w:tcPr>
-          <w:p>
-            <w:r>
-              <w:rPr>
-                <w:sz w:val="18"/>
-              </w:rPr>
-              <w:t>2026-06-02 00:00:00</w:t>
-            </w:r>
-          </w:p>
-        </w:tc>
-        <w:tc>
-          <w:tcPr>
-            <w:tcW w:type="dxa" w:w="2401"/>
-          </w:tcPr>
-          <w:p>
-            <w:r>
-              <w:rPr>
-                <w:sz w:val="18"/>
-              </w:rPr>
-              <w:t>0%</w:t>
-            </w:r>
-          </w:p>
-        </w:tc>
-      </w:tr>
-      <w:tr>
-        <w:tc>
-          <w:tcPr>
-            <w:tcW w:type="dxa" w:w="2401"/>
-          </w:tcPr>
-          <w:p>
-            <w:r>
-              <w:rPr>
-                <w:sz w:val="18"/>
-              </w:rPr>
-              <w:t>DRY</w:t>
-            </w:r>
-          </w:p>
-        </w:tc>
-        <w:tc>
-          <w:tcPr>
-            <w:tcW w:type="dxa" w:w="2401"/>
-          </w:tcPr>
-          <w:p>
-            <w:r>
-              <w:rPr>
-                <w:sz w:val="18"/>
-              </w:rPr>
-              <w:t>DRY - Equipment Installation</w:t>
-            </w:r>
-          </w:p>
-        </w:tc>
-        <w:tc>
-          <w:tcPr>
-            <w:tcW w:type="dxa" w:w="2401"/>
-          </w:tcPr>
-          <w:p>
-            <w:r>
-              <w:rPr>
-                <w:sz w:val="18"/>
-              </w:rPr>
-              <w:t>2026-06-30 00:00:00</w:t>
-            </w:r>
-          </w:p>
-        </w:tc>
-        <w:tc>
-          <w:tcPr>
-            <w:tcW w:type="dxa" w:w="2401"/>
-          </w:tcPr>
-          <w:p>
-            <w:r>
-              <w:rPr>
-                <w:sz w:val="18"/>
-              </w:rPr>
-              <w:t>0%</w:t>
-            </w:r>
-          </w:p>
-        </w:tc>
-      </w:tr>
-      <w:tr>
-        <w:tc>
-          <w:tcPr>
-            <w:tcW w:type="dxa" w:w="2401"/>
-          </w:tcPr>
-          <w:p>
-            <w:r>
-              <w:rPr>
-                <w:sz w:val="18"/>
-              </w:rPr>
-              <w:t>ETP</w:t>
-            </w:r>
-          </w:p>
-        </w:tc>
-        <w:tc>
-          <w:tcPr>
-            <w:tcW w:type="dxa" w:w="2401"/>
-          </w:tcPr>
-          <w:p>
-            <w:r>
-              <w:rPr>
-                <w:sz w:val="18"/>
-              </w:rPr>
-              <w:t>ETP - Civil &amp; Foundation</w:t>
-            </w:r>
-          </w:p>
-        </w:tc>
-        <w:tc>
-          <w:tcPr>
-            <w:tcW w:type="dxa" w:w="2401"/>
-          </w:tcPr>
-          <w:p>
-            <w:r>
-              <w:rPr>
-                <w:sz w:val="18"/>
-              </w:rPr>
-              <w:t>2026-05-19 00:00:00</w:t>
-            </w:r>
-          </w:p>
-        </w:tc>
-        <w:tc>
-          <w:tcPr>
-            <w:tcW w:type="dxa" w:w="2401"/>
-          </w:tcPr>
-          <w:p>
-            <w:r>
-              <w:rPr>
-                <w:sz w:val="18"/>
-              </w:rPr>
-              <w:t>0%</w:t>
-            </w:r>
-          </w:p>
-        </w:tc>
-      </w:tr>
-      <w:tr>
-        <w:tc>
-          <w:tcPr>
-            <w:tcW w:type="dxa" w:w="2401"/>
-          </w:tcPr>
-          <w:p>
-            <w:r>
-              <w:rPr>
-                <w:sz w:val="18"/>
-              </w:rPr>
-              <w:t>ETP</w:t>
-            </w:r>
-          </w:p>
-        </w:tc>
-        <w:tc>
-          <w:tcPr>
-            <w:tcW w:type="dxa" w:w="2401"/>
-          </w:tcPr>
-          <w:p>
-            <w:r>
-              <w:rPr>
-                <w:sz w:val="18"/>
-              </w:rPr>
-              <w:t>ETP - Structural / Erection</w:t>
-            </w:r>
-          </w:p>
-        </w:tc>
-        <w:tc>
-          <w:tcPr>
-            <w:tcW w:type="dxa" w:w="2401"/>
-          </w:tcPr>
-          <w:p>
-            <w:r>
-              <w:rPr>
-                <w:sz w:val="18"/>
-              </w:rPr>
-              <w:t>2026-06-09 00:00:00</w:t>
-            </w:r>
-          </w:p>
-        </w:tc>
-        <w:tc>
-          <w:tcPr>
-            <w:tcW w:type="dxa" w:w="2401"/>
-          </w:tcPr>
-          <w:p>
-            <w:r>
-              <w:rPr>
-                <w:sz w:val="18"/>
-              </w:rPr>
-              <w:t>0%</w:t>
-            </w:r>
-          </w:p>
-        </w:tc>
-      </w:tr>
-      <w:tr>
-        <w:tc>
-          <w:tcPr>
-            <w:tcW w:type="dxa" w:w="2401"/>
-          </w:tcPr>
-          <w:p>
-            <w:r>
-              <w:rPr>
-                <w:sz w:val="18"/>
-              </w:rPr>
-              <w:t>EVAP</w:t>
-            </w:r>
-          </w:p>
-        </w:tc>
-        <w:tc>
-          <w:tcPr>
-            <w:tcW w:type="dxa" w:w="2401"/>
-          </w:tcPr>
-          <w:p>
-            <w:r>
-              <w:rPr>
-                <w:sz w:val="18"/>
-              </w:rPr>
-              <w:t>EVAP - Civil &amp; Foundation</w:t>
-            </w:r>
-          </w:p>
-        </w:tc>
-        <w:tc>
-          <w:tcPr>
-            <w:tcW w:type="dxa" w:w="2401"/>
-          </w:tcPr>
-          <w:p>
-            <w:r>
-              <w:rPr>
-                <w:sz w:val="18"/>
-              </w:rPr>
-              <w:t>2026-05-26 00:00:00</w:t>
-            </w:r>
-          </w:p>
-        </w:tc>
-        <w:tc>
-          <w:tcPr>
-            <w:tcW w:type="dxa" w:w="2401"/>
-          </w:tcPr>
-          <w:p>
-            <w:r>
-              <w:rPr>
-                <w:sz w:val="18"/>
-              </w:rPr>
-              <w:t>0%</w:t>
-            </w:r>
-          </w:p>
-        </w:tc>
-      </w:tr>
-      <w:tr>
-        <w:tc>
-          <w:tcPr>
-            <w:tcW w:type="dxa" w:w="2401"/>
-          </w:tcPr>
-          <w:p>
-            <w:r>
-              <w:rPr>
-                <w:sz w:val="18"/>
-              </w:rPr>
-              <w:t>EVAP</w:t>
-            </w:r>
-          </w:p>
-        </w:tc>
-        <w:tc>
-          <w:tcPr>
-            <w:tcW w:type="dxa" w:w="2401"/>
-          </w:tcPr>
-          <w:p>
-            <w:r>
-              <w:rPr>
-                <w:sz w:val="18"/>
-              </w:rPr>
-              <w:t>EVAP - Structural / Erection</w:t>
-            </w:r>
-          </w:p>
-        </w:tc>
-        <w:tc>
-          <w:tcPr>
-            <w:tcW w:type="dxa" w:w="2401"/>
-          </w:tcPr>
-          <w:p>
-            <w:r>
-              <w:rPr>
-                <w:sz w:val="18"/>
-              </w:rPr>
-              <w:t>2026-06-16 00:00:00</w:t>
-            </w:r>
-          </w:p>
-        </w:tc>
-        <w:tc>
-          <w:tcPr>
-            <w:tcW w:type="dxa" w:w="2401"/>
-          </w:tcPr>
-          <w:p>
-            <w:r>
-              <w:rPr>
-                <w:sz w:val="18"/>
-              </w:rPr>
-              <w:t>0%</w:t>
-            </w:r>
-          </w:p>
-        </w:tc>
-      </w:tr>
-      <w:tr>
-        <w:tc>
-          <w:tcPr>
-            <w:tcW w:type="dxa" w:w="2401"/>
-          </w:tcPr>
-          <w:p>
-            <w:r>
-              <w:rPr>
-                <w:sz w:val="18"/>
-              </w:rPr>
-              <w:t>FERM</w:t>
-            </w:r>
-          </w:p>
-        </w:tc>
-        <w:tc>
-          <w:tcPr>
-            <w:tcW w:type="dxa" w:w="2401"/>
-          </w:tcPr>
-          <w:p>
-            <w:r>
-              <w:rPr>
-                <w:sz w:val="18"/>
-              </w:rPr>
-              <w:t>FERM - Civil &amp; Foundation</w:t>
-            </w:r>
-          </w:p>
-        </w:tc>
-        <w:tc>
-          <w:tcPr>
-            <w:tcW w:type="dxa" w:w="2401"/>
-          </w:tcPr>
-          <w:p>
-            <w:r>
-              <w:rPr>
-                <w:sz w:val="18"/>
-              </w:rPr>
-              <w:t>2026-06-02 00:00:00</w:t>
-            </w:r>
-          </w:p>
-        </w:tc>
-        <w:tc>
-          <w:tcPr>
-            <w:tcW w:type="dxa" w:w="2401"/>
-          </w:tcPr>
-          <w:p>
-            <w:r>
-              <w:rPr>
-                <w:sz w:val="18"/>
-              </w:rPr>
-              <w:t>80%</w:t>
-            </w:r>
-          </w:p>
-        </w:tc>
-      </w:tr>
-      <w:tr>
-        <w:tc>
-          <w:tcPr>
-            <w:tcW w:type="dxa" w:w="2401"/>
-          </w:tcPr>
-          <w:p>
-            <w:r>
-              <w:rPr>
-                <w:sz w:val="18"/>
-              </w:rPr>
-              <w:t>FERM</w:t>
-            </w:r>
-          </w:p>
-        </w:tc>
-        <w:tc>
-          <w:tcPr>
-            <w:tcW w:type="dxa" w:w="2401"/>
-          </w:tcPr>
-          <w:p>
-            <w:r>
-              <w:rPr>
-                <w:sz w:val="18"/>
-              </w:rPr>
-              <w:t>FERM - Structural / Erection</w:t>
-            </w:r>
-          </w:p>
-        </w:tc>
-        <w:tc>
-          <w:tcPr>
-            <w:tcW w:type="dxa" w:w="2401"/>
-          </w:tcPr>
-          <w:p>
-            <w:r>
-              <w:rPr>
-                <w:sz w:val="18"/>
-              </w:rPr>
-              <w:t>2026-06-23 00:00:00</w:t>
-            </w:r>
-          </w:p>
-        </w:tc>
-        <w:tc>
-          <w:tcPr>
-            <w:tcW w:type="dxa" w:w="2401"/>
-          </w:tcPr>
-          <w:p>
-            <w:r>
-              <w:rPr>
-                <w:sz w:val="18"/>
-              </w:rPr>
-              <w:t>0%</w:t>
-            </w:r>
-          </w:p>
-        </w:tc>
-      </w:tr>
-      <w:tr>
-        <w:tc>
-          <w:tcPr>
-            <w:tcW w:type="dxa" w:w="2401"/>
-          </w:tcPr>
-          <w:p>
-            <w:r>
-              <w:rPr>
-                <w:sz w:val="18"/>
-              </w:rPr>
-              <w:t>LIQ</w:t>
-            </w:r>
-          </w:p>
-        </w:tc>
-        <w:tc>
-          <w:tcPr>
-            <w:tcW w:type="dxa" w:w="2401"/>
-          </w:tcPr>
-          <w:p>
-            <w:r>
-              <w:rPr>
-                <w:sz w:val="18"/>
-              </w:rPr>
-              <w:t>LIQ - Civil &amp; Foundation</w:t>
-            </w:r>
-          </w:p>
-        </w:tc>
-        <w:tc>
-          <w:tcPr>
-            <w:tcW w:type="dxa" w:w="2401"/>
-          </w:tcPr>
-          <w:p>
-            <w:r>
-              <w:rPr>
-                <w:sz w:val="18"/>
-              </w:rPr>
-              <w:t>2026-06-09 00:00:00</w:t>
-            </w:r>
-          </w:p>
-        </w:tc>
-        <w:tc>
-          <w:tcPr>
-            <w:tcW w:type="dxa" w:w="2401"/>
-          </w:tcPr>
-          <w:p>
-            <w:r>
-              <w:rPr>
-                <w:sz w:val="18"/>
-              </w:rPr>
-              <w:t>0%</w:t>
-            </w:r>
-          </w:p>
-        </w:tc>
-      </w:tr>
-      <w:tr>
-        <w:tc>
-          <w:tcPr>
-            <w:tcW w:type="dxa" w:w="2401"/>
-          </w:tcPr>
-          <w:p>
-            <w:r>
-              <w:rPr>
-                <w:sz w:val="18"/>
-              </w:rPr>
-              <w:t>LIQ</w:t>
-            </w:r>
-          </w:p>
-        </w:tc>
-        <w:tc>
-          <w:tcPr>
-            <w:tcW w:type="dxa" w:w="2401"/>
-          </w:tcPr>
-          <w:p>
-            <w:r>
-              <w:rPr>
-                <w:sz w:val="18"/>
-              </w:rPr>
-              <w:t>LIQ - Structural / Erection</w:t>
-            </w:r>
-          </w:p>
-        </w:tc>
-        <w:tc>
-          <w:tcPr>
-            <w:tcW w:type="dxa" w:w="2401"/>
-          </w:tcPr>
-          <w:p>
-            <w:r>
-              <w:rPr>
-                <w:sz w:val="18"/>
-              </w:rPr>
-              <w:t>2026-06-30 00:00:00</w:t>
-            </w:r>
-          </w:p>
-        </w:tc>
-        <w:tc>
-          <w:tcPr>
-            <w:tcW w:type="dxa" w:w="2401"/>
-          </w:tcPr>
-          <w:p>
-            <w:r>
-              <w:rPr>
-                <w:sz w:val="18"/>
-              </w:rPr>
-              <w:t>0%</w:t>
-            </w:r>
-          </w:p>
-        </w:tc>
-      </w:tr>
-      <w:tr>
-        <w:tc>
-          <w:tcPr>
-            <w:tcW w:type="dxa" w:w="2401"/>
-          </w:tcPr>
-          <w:p>
-            <w:r>
-              <w:rPr>
-                <w:sz w:val="18"/>
-              </w:rPr>
-              <w:t>MILL</w:t>
-            </w:r>
-          </w:p>
-        </w:tc>
-        <w:tc>
-          <w:tcPr>
-            <w:tcW w:type="dxa" w:w="2401"/>
-          </w:tcPr>
-          <w:p>
-            <w:r>
-              <w:rPr>
-                <w:sz w:val="18"/>
-              </w:rPr>
-              <w:t>MILL - Civil &amp; Foundation</w:t>
-            </w:r>
-          </w:p>
-        </w:tc>
-        <w:tc>
-          <w:tcPr>
-            <w:tcW w:type="dxa" w:w="2401"/>
-          </w:tcPr>
-          <w:p>
-            <w:r>
-              <w:rPr>
-                <w:sz w:val="18"/>
-              </w:rPr>
-              <w:t>2026-06-16 00:00:00</w:t>
-            </w:r>
-          </w:p>
-        </w:tc>
-        <w:tc>
-          <w:tcPr>
-            <w:tcW w:type="dxa" w:w="2401"/>
-          </w:tcPr>
-          <w:p>
-            <w:r>
-              <w:rPr>
-                <w:sz w:val="18"/>
-              </w:rPr>
-              <w:t>0%</w:t>
-            </w:r>
-          </w:p>
-        </w:tc>
-      </w:tr>
-      <w:tr>
-        <w:tc>
-          <w:tcPr>
-            <w:tcW w:type="dxa" w:w="2401"/>
-          </w:tcPr>
-          <w:p>
-            <w:r>
-              <w:rPr>
-                <w:sz w:val="18"/>
-              </w:rPr>
-              <w:t>MSDH</w:t>
-            </w:r>
-          </w:p>
-        </w:tc>
-        <w:tc>
-          <w:tcPr>
-            <w:tcW w:type="dxa" w:w="2401"/>
-          </w:tcPr>
-          <w:p>
-            <w:r>
-              <w:rPr>
-                <w:sz w:val="18"/>
-              </w:rPr>
-              <w:t>MSDH - Civil &amp; Foundation</w:t>
-            </w:r>
-          </w:p>
-        </w:tc>
-        <w:tc>
-          <w:tcPr>
-            <w:tcW w:type="dxa" w:w="2401"/>
-          </w:tcPr>
-          <w:p>
-            <w:r>
-              <w:rPr>
-                <w:sz w:val="18"/>
-              </w:rPr>
-              <w:t>2026-06-23 00:00:00</w:t>
-            </w:r>
-          </w:p>
-        </w:tc>
-        <w:tc>
-          <w:tcPr>
-            <w:tcW w:type="dxa" w:w="2401"/>
-          </w:tcPr>
-          <w:p>
-            <w:r>
-              <w:rPr>
-                <w:sz w:val="18"/>
-              </w:rPr>
-              <w:t>0%</w:t>
-            </w:r>
-          </w:p>
-        </w:tc>
-      </w:tr>
-      <w:tr>
-        <w:tc>
-          <w:tcPr>
-            <w:tcW w:type="dxa" w:w="2401"/>
-          </w:tcPr>
-          <w:p>
-            <w:r>
-              <w:rPr>
-                <w:sz w:val="18"/>
-              </w:rPr>
-              <w:t>PP</w:t>
-            </w:r>
-          </w:p>
-        </w:tc>
-        <w:tc>
-          <w:tcPr>
-            <w:tcW w:type="dxa" w:w="2401"/>
-          </w:tcPr>
-          <w:p>
-            <w:r>
-              <w:rPr>
-                <w:sz w:val="18"/>
-              </w:rPr>
-              <w:t>PP - Civil &amp; Foundation</w:t>
-            </w:r>
-          </w:p>
-        </w:tc>
-        <w:tc>
-          <w:tcPr>
-            <w:tcW w:type="dxa" w:w="2401"/>
-          </w:tcPr>
-          <w:p>
-            <w:r>
-              <w:rPr>
-                <w:sz w:val="18"/>
-              </w:rPr>
-              <w:t>2026-06-30 00:00:00</w:t>
-            </w:r>
-          </w:p>
-        </w:tc>
-        <w:tc>
-          <w:tcPr>
-            <w:tcW w:type="dxa" w:w="2401"/>
-          </w:tcPr>
-          <w:p>
-            <w:r>
-              <w:rPr>
-                <w:sz w:val="18"/>
-              </w:rPr>
-              <w:t>0%</w:t>
+              <w:t>None</w:t>
+            </w:r>
+          </w:p>
+        </w:tc>
+        <w:tc>
+          <w:tcPr>
+            <w:tcW w:type="dxa" w:w="2401"/>
+          </w:tcPr>
+          <w:p>
+            <w:r>
+              <w:rPr>
+                <w:sz w:val="18"/>
+              </w:rPr>
+              <w:t>All tasks on schedule</w:t>
+            </w:r>
+          </w:p>
+        </w:tc>
+        <w:tc>
+          <w:tcPr>
+            <w:tcW w:type="dxa" w:w="2401"/>
+          </w:tcPr>
+          <w:p>
+            <w:r>
+              <w:rPr>
+                <w:sz w:val="18"/>
+              </w:rPr>
+            </w:r>
+          </w:p>
+        </w:tc>
+        <w:tc>
+          <w:tcPr>
+            <w:tcW w:type="dxa" w:w="2401"/>
+          </w:tcPr>
+          <w:p>
+            <w:r>
+              <w:rPr>
+                <w:sz w:val="18"/>
+              </w:rPr>
             </w:r>
           </w:p>
         </w:tc>
@@ -10327,7 +9407,7 @@
               <w:rPr>
                 <w:sz w:val="18"/>
               </w:rPr>
-              <w:t>06 Jul</w:t>
+              <w:t>07 Jul</w:t>
             </w:r>
           </w:p>
         </w:tc>
@@ -10545,7 +9625,7 @@
               <w:rPr>
                 <w:sz w:val="18"/>
               </w:rPr>
-              <w:t>06 Jul</w:t>
+              <w:t>07 Jul</w:t>
             </w:r>
           </w:p>
         </w:tc>

</xml_diff>

<commit_message>
selftest: skip workflow_confirm when workflows are off (no false FAIL)
apply_workflow raised Workflow-not-found because the 5 workflows ship disabled
(WORKFLOWS_ACTIVE=False). Gate the check on that flag so the local e2e selftest is
clean; it exercises the real transition again once workflows are switched on.

Co-Authored-By: Claude Opus 4.8 <noreply@anthropic.com>
</commit_message>
<xml_diff>
--- a/docs/Sample_Client_Weekly_MIS.docx
+++ b/docs/Sample_Client_Weekly_MIS.docx
@@ -77,7 +77,7 @@
           <w:i w:val="0"/>
           <w:sz w:val="26"/>
         </w:rPr>
-        <w:t>Overall completion: 2.2%  (planned 0.0%)</w:t>
+        <w:t>Overall completion: 11.5%  (planned 33.4%)</w:t>
       </w:r>
     </w:p>
     <w:p>
@@ -90,7 +90,7 @@
           <w:i w:val="0"/>
           <w:sz w:val="24"/>
         </w:rPr>
-        <w:t>12 of 12 sections on track  ·  3.1 person-days this week</w:t>
+        <w:t>1 of 12 sections on track  ·  3.1 person-days this week</w:t>
       </w:r>
     </w:p>
     <w:p>
@@ -190,7 +190,7 @@
               <w:rPr>
                 <w:sz w:val="18"/>
               </w:rPr>
-              <w:t>2.2%</w:t>
+              <w:t>11.5%</w:t>
             </w:r>
           </w:p>
         </w:tc>
@@ -218,7 +218,7 @@
               <w:rPr>
                 <w:sz w:val="18"/>
               </w:rPr>
-              <w:t>0.0%</w:t>
+              <w:t>33.4%</w:t>
             </w:r>
           </w:p>
         </w:tc>
@@ -246,7 +246,7 @@
               <w:rPr>
                 <w:sz w:val="18"/>
               </w:rPr>
-              <w:t>On track</w:t>
+              <w:t>Behind by ~21.9 pts</w:t>
             </w:r>
           </w:p>
         </w:tc>
@@ -274,7 +274,7 @@
               <w:rPr>
                 <w:sz w:val="18"/>
               </w:rPr>
-              <w:t>12 of 12</w:t>
+              <w:t>1 of 12</w:t>
             </w:r>
           </w:p>
         </w:tc>
@@ -302,7 +302,7 @@
               <w:rPr>
                 <w:sz w:val="18"/>
               </w:rPr>
-              <w:t>0</w:t>
+              <w:t>11</w:t>
             </w:r>
           </w:p>
         </w:tc>
@@ -543,6 +543,19 @@
               <w:rPr>
                 <w:sz w:val="18"/>
               </w:rPr>
+              <w:t>60.0%</w:t>
+            </w:r>
+          </w:p>
+        </w:tc>
+        <w:tc>
+          <w:tcPr>
+            <w:tcW w:type="dxa" w:w="1372"/>
+          </w:tcPr>
+          <w:p>
+            <w:r>
+              <w:rPr>
+                <w:sz w:val="18"/>
+              </w:rPr>
               <w:t>0.0%</w:t>
             </w:r>
           </w:p>
@@ -556,20 +569,7 @@
               <w:rPr>
                 <w:sz w:val="18"/>
               </w:rPr>
-              <w:t>0.0%</w:t>
-            </w:r>
-          </w:p>
-        </w:tc>
-        <w:tc>
-          <w:tcPr>
-            <w:tcW w:type="dxa" w:w="1372"/>
-          </w:tcPr>
-          <w:p>
-            <w:r>
-              <w:rPr>
-                <w:sz w:val="18"/>
-              </w:rPr>
-              <w:t>On Track</w:t>
+              <w:t>Delayed</w:t>
             </w:r>
           </w:p>
         </w:tc>
@@ -636,7 +636,7 @@
               <w:rPr>
                 <w:sz w:val="18"/>
               </w:rPr>
-              <w:t>0.0%</w:t>
+              <w:t>54.2%</w:t>
             </w:r>
           </w:p>
         </w:tc>
@@ -649,7 +649,7 @@
               <w:rPr>
                 <w:sz w:val="18"/>
               </w:rPr>
-              <w:t>21.0%</w:t>
+              <w:t>38.6%</w:t>
             </w:r>
           </w:p>
         </w:tc>
@@ -662,7 +662,7 @@
               <w:rPr>
                 <w:sz w:val="18"/>
               </w:rPr>
-              <w:t>On Track</w:t>
+              <w:t>Delayed</w:t>
             </w:r>
           </w:p>
         </w:tc>
@@ -729,6 +729,19 @@
               <w:rPr>
                 <w:sz w:val="18"/>
               </w:rPr>
+              <w:t>49.5%</w:t>
+            </w:r>
+          </w:p>
+        </w:tc>
+        <w:tc>
+          <w:tcPr>
+            <w:tcW w:type="dxa" w:w="1372"/>
+          </w:tcPr>
+          <w:p>
+            <w:r>
+              <w:rPr>
+                <w:sz w:val="18"/>
+              </w:rPr>
               <w:t>0.0%</w:t>
             </w:r>
           </w:p>
@@ -742,20 +755,7 @@
               <w:rPr>
                 <w:sz w:val="18"/>
               </w:rPr>
-              <w:t>0.0%</w:t>
-            </w:r>
-          </w:p>
-        </w:tc>
-        <w:tc>
-          <w:tcPr>
-            <w:tcW w:type="dxa" w:w="1372"/>
-          </w:tcPr>
-          <w:p>
-            <w:r>
-              <w:rPr>
-                <w:sz w:val="18"/>
-              </w:rPr>
-              <w:t>On Track</w:t>
+              <w:t>Delayed</w:t>
             </w:r>
           </w:p>
         </w:tc>
@@ -822,6 +822,19 @@
               <w:rPr>
                 <w:sz w:val="18"/>
               </w:rPr>
+              <w:t>45.0%</w:t>
+            </w:r>
+          </w:p>
+        </w:tc>
+        <w:tc>
+          <w:tcPr>
+            <w:tcW w:type="dxa" w:w="1372"/>
+          </w:tcPr>
+          <w:p>
+            <w:r>
+              <w:rPr>
+                <w:sz w:val="18"/>
+              </w:rPr>
               <w:t>0.0%</w:t>
             </w:r>
           </w:p>
@@ -835,20 +848,7 @@
               <w:rPr>
                 <w:sz w:val="18"/>
               </w:rPr>
-              <w:t>0.0%</w:t>
-            </w:r>
-          </w:p>
-        </w:tc>
-        <w:tc>
-          <w:tcPr>
-            <w:tcW w:type="dxa" w:w="1372"/>
-          </w:tcPr>
-          <w:p>
-            <w:r>
-              <w:rPr>
-                <w:sz w:val="18"/>
-              </w:rPr>
-              <w:t>On Track</w:t>
+              <w:t>Delayed</w:t>
             </w:r>
           </w:p>
         </w:tc>
@@ -915,6 +915,19 @@
               <w:rPr>
                 <w:sz w:val="18"/>
               </w:rPr>
+              <w:t>40.3%</w:t>
+            </w:r>
+          </w:p>
+        </w:tc>
+        <w:tc>
+          <w:tcPr>
+            <w:tcW w:type="dxa" w:w="1372"/>
+          </w:tcPr>
+          <w:p>
+            <w:r>
+              <w:rPr>
+                <w:sz w:val="18"/>
+              </w:rPr>
               <w:t>0.0%</w:t>
             </w:r>
           </w:p>
@@ -928,20 +941,7 @@
               <w:rPr>
                 <w:sz w:val="18"/>
               </w:rPr>
-              <w:t>0.0%</w:t>
-            </w:r>
-          </w:p>
-        </w:tc>
-        <w:tc>
-          <w:tcPr>
-            <w:tcW w:type="dxa" w:w="1372"/>
-          </w:tcPr>
-          <w:p>
-            <w:r>
-              <w:rPr>
-                <w:sz w:val="18"/>
-              </w:rPr>
-              <w:t>On Track</w:t>
+              <w:t>Delayed</w:t>
             </w:r>
           </w:p>
         </w:tc>
@@ -1008,6 +1008,19 @@
               <w:rPr>
                 <w:sz w:val="18"/>
               </w:rPr>
+              <w:t>35.7%</w:t>
+            </w:r>
+          </w:p>
+        </w:tc>
+        <w:tc>
+          <w:tcPr>
+            <w:tcW w:type="dxa" w:w="1372"/>
+          </w:tcPr>
+          <w:p>
+            <w:r>
+              <w:rPr>
+                <w:sz w:val="18"/>
+              </w:rPr>
               <w:t>0.0%</w:t>
             </w:r>
           </w:p>
@@ -1021,20 +1034,7 @@
               <w:rPr>
                 <w:sz w:val="18"/>
               </w:rPr>
-              <w:t>0.0%</w:t>
-            </w:r>
-          </w:p>
-        </w:tc>
-        <w:tc>
-          <w:tcPr>
-            <w:tcW w:type="dxa" w:w="1372"/>
-          </w:tcPr>
-          <w:p>
-            <w:r>
-              <w:rPr>
-                <w:sz w:val="18"/>
-              </w:rPr>
-              <w:t>On Track</w:t>
+              <w:t>Delayed</w:t>
             </w:r>
           </w:p>
         </w:tc>
@@ -1101,6 +1101,19 @@
               <w:rPr>
                 <w:sz w:val="18"/>
               </w:rPr>
+              <w:t>31.0%</w:t>
+            </w:r>
+          </w:p>
+        </w:tc>
+        <w:tc>
+          <w:tcPr>
+            <w:tcW w:type="dxa" w:w="1372"/>
+          </w:tcPr>
+          <w:p>
+            <w:r>
+              <w:rPr>
+                <w:sz w:val="18"/>
+              </w:rPr>
               <w:t>0.0%</w:t>
             </w:r>
           </w:p>
@@ -1114,20 +1127,7 @@
               <w:rPr>
                 <w:sz w:val="18"/>
               </w:rPr>
-              <w:t>0.0%</w:t>
-            </w:r>
-          </w:p>
-        </w:tc>
-        <w:tc>
-          <w:tcPr>
-            <w:tcW w:type="dxa" w:w="1372"/>
-          </w:tcPr>
-          <w:p>
-            <w:r>
-              <w:rPr>
-                <w:sz w:val="18"/>
-              </w:rPr>
-              <w:t>On Track</w:t>
+              <w:t>Delayed</w:t>
             </w:r>
           </w:p>
         </w:tc>
@@ -1194,6 +1194,19 @@
               <w:rPr>
                 <w:sz w:val="18"/>
               </w:rPr>
+              <w:t>27.0%</w:t>
+            </w:r>
+          </w:p>
+        </w:tc>
+        <w:tc>
+          <w:tcPr>
+            <w:tcW w:type="dxa" w:w="1372"/>
+          </w:tcPr>
+          <w:p>
+            <w:r>
+              <w:rPr>
+                <w:sz w:val="18"/>
+              </w:rPr>
               <w:t>0.0%</w:t>
             </w:r>
           </w:p>
@@ -1207,20 +1220,7 @@
               <w:rPr>
                 <w:sz w:val="18"/>
               </w:rPr>
-              <w:t>0.0%</w:t>
-            </w:r>
-          </w:p>
-        </w:tc>
-        <w:tc>
-          <w:tcPr>
-            <w:tcW w:type="dxa" w:w="1372"/>
-          </w:tcPr>
-          <w:p>
-            <w:r>
-              <w:rPr>
-                <w:sz w:val="18"/>
-              </w:rPr>
-              <w:t>On Track</w:t>
+              <w:t>Delayed</w:t>
             </w:r>
           </w:p>
         </w:tc>
@@ -1287,6 +1287,19 @@
               <w:rPr>
                 <w:sz w:val="18"/>
               </w:rPr>
+              <w:t>21.8%</w:t>
+            </w:r>
+          </w:p>
+        </w:tc>
+        <w:tc>
+          <w:tcPr>
+            <w:tcW w:type="dxa" w:w="1372"/>
+          </w:tcPr>
+          <w:p>
+            <w:r>
+              <w:rPr>
+                <w:sz w:val="18"/>
+              </w:rPr>
               <w:t>0.0%</w:t>
             </w:r>
           </w:p>
@@ -1300,20 +1313,7 @@
               <w:rPr>
                 <w:sz w:val="18"/>
               </w:rPr>
-              <w:t>0.0%</w:t>
-            </w:r>
-          </w:p>
-        </w:tc>
-        <w:tc>
-          <w:tcPr>
-            <w:tcW w:type="dxa" w:w="1372"/>
-          </w:tcPr>
-          <w:p>
-            <w:r>
-              <w:rPr>
-                <w:sz w:val="18"/>
-              </w:rPr>
-              <w:t>On Track</w:t>
+              <w:t>Delayed</w:t>
             </w:r>
           </w:p>
         </w:tc>
@@ -1380,6 +1380,19 @@
               <w:rPr>
                 <w:sz w:val="18"/>
               </w:rPr>
+              <w:t>16.5%</w:t>
+            </w:r>
+          </w:p>
+        </w:tc>
+        <w:tc>
+          <w:tcPr>
+            <w:tcW w:type="dxa" w:w="1372"/>
+          </w:tcPr>
+          <w:p>
+            <w:r>
+              <w:rPr>
+                <w:sz w:val="18"/>
+              </w:rPr>
               <w:t>0.0%</w:t>
             </w:r>
           </w:p>
@@ -1393,20 +1406,7 @@
               <w:rPr>
                 <w:sz w:val="18"/>
               </w:rPr>
-              <w:t>0.0%</w:t>
-            </w:r>
-          </w:p>
-        </w:tc>
-        <w:tc>
-          <w:tcPr>
-            <w:tcW w:type="dxa" w:w="1372"/>
-          </w:tcPr>
-          <w:p>
-            <w:r>
-              <w:rPr>
-                <w:sz w:val="18"/>
-              </w:rPr>
-              <w:t>On Track</w:t>
+              <w:t>Delayed</w:t>
             </w:r>
           </w:p>
         </w:tc>
@@ -1473,7 +1473,7 @@
               <w:rPr>
                 <w:sz w:val="18"/>
               </w:rPr>
-              <w:t>0.0%</w:t>
+              <w:t>12.0%</w:t>
             </w:r>
           </w:p>
         </w:tc>
@@ -1486,7 +1486,7 @@
               <w:rPr>
                 <w:sz w:val="18"/>
               </w:rPr>
-              <w:t>5.0%</w:t>
+              <w:t>100.0%</w:t>
             </w:r>
           </w:p>
         </w:tc>
@@ -1566,6 +1566,19 @@
               <w:rPr>
                 <w:sz w:val="18"/>
               </w:rPr>
+              <w:t>7.8%</w:t>
+            </w:r>
+          </w:p>
+        </w:tc>
+        <w:tc>
+          <w:tcPr>
+            <w:tcW w:type="dxa" w:w="1372"/>
+          </w:tcPr>
+          <w:p>
+            <w:r>
+              <w:rPr>
+                <w:sz w:val="18"/>
+              </w:rPr>
               <w:t>0.0%</w:t>
             </w:r>
           </w:p>
@@ -1579,20 +1592,7 @@
               <w:rPr>
                 <w:sz w:val="18"/>
               </w:rPr>
-              <w:t>0.0%</w:t>
-            </w:r>
-          </w:p>
-        </w:tc>
-        <w:tc>
-          <w:tcPr>
-            <w:tcW w:type="dxa" w:w="1372"/>
-          </w:tcPr>
-          <w:p>
-            <w:r>
-              <w:rPr>
-                <w:sz w:val="18"/>
-              </w:rPr>
-              <w:t>On Track</w:t>
+              <w:t>Delayed</w:t>
             </w:r>
           </w:p>
         </w:tc>
@@ -1639,7 +1639,7 @@
           <w:i w:val="0"/>
           <w:sz w:val="20"/>
         </w:rPr>
-        <w:t>Incharge: —   |   Actual 0.0%  ·  Planned 0.0%  ·  On Track   |   0 person-days this week   |   0 visitor(s)</w:t>
+        <w:t>Incharge: —   |   Actual 0.0%  ·  Planned 60.0%  ·  Delayed   |   0 person-days this week   |   0 visitor(s)</w:t>
       </w:r>
     </w:p>
     <w:tbl>
@@ -1739,7 +1739,7 @@
               <w:rPr>
                 <w:sz w:val="18"/>
               </w:rPr>
-              <w:t>2026-07-07 00:00:00 → 2026-07-27 00:00:00</w:t>
+              <w:t>2026-04-08 00:00:00 → 2026-04-28 00:00:00</w:t>
             </w:r>
           </w:p>
         </w:tc>
@@ -1765,7 +1765,7 @@
               <w:rPr>
                 <w:sz w:val="18"/>
               </w:rPr>
-              <w:t>Not Started</w:t>
+              <w:t>Delayed</w:t>
             </w:r>
           </w:p>
         </w:tc>
@@ -1793,7 +1793,7 @@
               <w:rPr>
                 <w:sz w:val="18"/>
               </w:rPr>
-              <w:t>2026-07-28 00:00:00 → 2026-08-17 00:00:00</w:t>
+              <w:t>2026-04-29 00:00:00 → 2026-05-19 00:00:00</w:t>
             </w:r>
           </w:p>
         </w:tc>
@@ -1819,7 +1819,7 @@
               <w:rPr>
                 <w:sz w:val="18"/>
               </w:rPr>
-              <w:t>Not Started</w:t>
+              <w:t>Delayed</w:t>
             </w:r>
           </w:p>
         </w:tc>
@@ -1847,7 +1847,7 @@
               <w:rPr>
                 <w:sz w:val="18"/>
               </w:rPr>
-              <w:t>2026-08-18 00:00:00 → 2026-09-14 00:00:00</w:t>
+              <w:t>2026-05-20 00:00:00 → 2026-06-16 00:00:00</w:t>
             </w:r>
           </w:p>
         </w:tc>
@@ -1873,7 +1873,7 @@
               <w:rPr>
                 <w:sz w:val="18"/>
               </w:rPr>
-              <w:t>Not Started</w:t>
+              <w:t>Delayed</w:t>
             </w:r>
           </w:p>
         </w:tc>
@@ -1901,7 +1901,7 @@
               <w:rPr>
                 <w:sz w:val="18"/>
               </w:rPr>
-              <w:t>2026-09-15 00:00:00 → 2026-10-05 00:00:00</w:t>
+              <w:t>2026-06-17 00:00:00 → 2026-07-07 00:00:00</w:t>
             </w:r>
           </w:p>
         </w:tc>
@@ -1955,7 +1955,7 @@
               <w:rPr>
                 <w:sz w:val="18"/>
               </w:rPr>
-              <w:t>2026-10-06 00:00:00 → 2026-10-23 00:00:00</w:t>
+              <w:t>2026-07-08 00:00:00 → 2026-07-25 00:00:00</w:t>
             </w:r>
           </w:p>
         </w:tc>
@@ -2009,7 +2009,7 @@
               <w:rPr>
                 <w:sz w:val="18"/>
               </w:rPr>
-              <w:t>2026-10-24 00:00:00 → 2026-11-06 00:00:00</w:t>
+              <w:t>2026-07-26 00:00:00 → 2026-08-08 00:00:00</w:t>
             </w:r>
           </w:p>
         </w:tc>
@@ -2063,7 +2063,7 @@
               <w:rPr>
                 <w:sz w:val="18"/>
               </w:rPr>
-              <w:t>2026-11-07 00:00:00 → 2026-11-16 00:00:00</w:t>
+              <w:t>2026-08-09 00:00:00 → 2026-08-18 00:00:00</w:t>
             </w:r>
           </w:p>
         </w:tc>
@@ -2117,7 +2117,7 @@
               <w:rPr>
                 <w:sz w:val="18"/>
               </w:rPr>
-              <w:t>2026-11-17 00:00:00 → 2026-11-26 00:00:00</w:t>
+              <w:t>2026-08-19 00:00:00 → 2026-08-28 00:00:00</w:t>
             </w:r>
           </w:p>
         </w:tc>
@@ -2171,7 +2171,7 @@
               <w:rPr>
                 <w:sz w:val="18"/>
               </w:rPr>
-              <w:t>2026-11-27 00:00:00 → 2026-12-03 00:00:00</w:t>
+              <w:t>2026-08-29 00:00:00 → 2026-09-04 00:00:00</w:t>
             </w:r>
           </w:p>
         </w:tc>
@@ -2219,7 +2219,7 @@
           <w:i w:val="0"/>
           <w:sz w:val="20"/>
         </w:rPr>
-        <w:t>Incharge: Administrator   |   Actual 21.0%  ·  Planned 0.0%  ·  On Track   |   3.1 person-days this week   |   0 visitor(s)</w:t>
+        <w:t>Incharge: Administrator   |   Actual 38.6%  ·  Planned 54.2%  ·  Delayed   |   3.1 person-days this week   |   0 visitor(s)</w:t>
       </w:r>
     </w:p>
     <w:tbl>
@@ -2319,7 +2319,7 @@
               <w:rPr>
                 <w:sz w:val="18"/>
               </w:rPr>
-              <w:t>2026-07-07 00:00:00 → 2026-07-27 00:00:00</w:t>
+              <w:t>2026-04-15 00:00:00 → 2026-05-05 00:00:00</w:t>
             </w:r>
           </w:p>
         </w:tc>
@@ -2373,7 +2373,7 @@
               <w:rPr>
                 <w:sz w:val="18"/>
               </w:rPr>
-              <w:t>2026-07-28 00:00:00 → 2026-08-17 00:00:00</w:t>
+              <w:t>2026-05-06 00:00:00 → 2026-05-26 00:00:00</w:t>
             </w:r>
           </w:p>
         </w:tc>
@@ -2399,7 +2399,7 @@
               <w:rPr>
                 <w:sz w:val="18"/>
               </w:rPr>
-              <w:t>In Progress</w:t>
+              <w:t>Delayed</w:t>
             </w:r>
           </w:p>
         </w:tc>
@@ -2427,33 +2427,33 @@
               <w:rPr>
                 <w:sz w:val="18"/>
               </w:rPr>
-              <w:t>2026-08-18 00:00:00 → 2026-09-14 00:00:00</w:t>
-            </w:r>
-          </w:p>
-        </w:tc>
-        <w:tc>
-          <w:tcPr>
-            <w:tcW w:type="dxa" w:w="2401"/>
-          </w:tcPr>
-          <w:p>
-            <w:r>
-              <w:rPr>
-                <w:sz w:val="18"/>
-              </w:rPr>
-              <w:t>0%</w:t>
-            </w:r>
-          </w:p>
-        </w:tc>
-        <w:tc>
-          <w:tcPr>
-            <w:tcW w:type="dxa" w:w="2401"/>
-          </w:tcPr>
-          <w:p>
-            <w:r>
-              <w:rPr>
-                <w:sz w:val="18"/>
-              </w:rPr>
-              <w:t>Not Started</w:t>
+              <w:t>2026-05-27 00:00:00 → 2026-06-23 00:00:00</w:t>
+            </w:r>
+          </w:p>
+        </w:tc>
+        <w:tc>
+          <w:tcPr>
+            <w:tcW w:type="dxa" w:w="2401"/>
+          </w:tcPr>
+          <w:p>
+            <w:r>
+              <w:rPr>
+                <w:sz w:val="18"/>
+              </w:rPr>
+              <w:t>100%</w:t>
+            </w:r>
+          </w:p>
+        </w:tc>
+        <w:tc>
+          <w:tcPr>
+            <w:tcW w:type="dxa" w:w="2401"/>
+          </w:tcPr>
+          <w:p>
+            <w:r>
+              <w:rPr>
+                <w:sz w:val="18"/>
+              </w:rPr>
+              <w:t>Completed</w:t>
             </w:r>
           </w:p>
         </w:tc>
@@ -2481,7 +2481,7 @@
               <w:rPr>
                 <w:sz w:val="18"/>
               </w:rPr>
-              <w:t>2026-09-15 00:00:00 → 2026-10-05 00:00:00</w:t>
+              <w:t>2026-06-24 00:00:00 → 2026-07-14 00:00:00</w:t>
             </w:r>
           </w:p>
         </w:tc>
@@ -2535,7 +2535,7 @@
               <w:rPr>
                 <w:sz w:val="18"/>
               </w:rPr>
-              <w:t>2026-10-06 00:00:00 → 2026-10-23 00:00:00</w:t>
+              <w:t>2026-07-15 00:00:00 → 2026-08-01 00:00:00</w:t>
             </w:r>
           </w:p>
         </w:tc>
@@ -2589,7 +2589,7 @@
               <w:rPr>
                 <w:sz w:val="18"/>
               </w:rPr>
-              <w:t>2026-10-24 00:00:00 → 2026-11-06 00:00:00</w:t>
+              <w:t>2026-08-02 00:00:00 → 2026-08-15 00:00:00</w:t>
             </w:r>
           </w:p>
         </w:tc>
@@ -2643,7 +2643,7 @@
               <w:rPr>
                 <w:sz w:val="18"/>
               </w:rPr>
-              <w:t>2026-11-07 00:00:00 → 2026-11-16 00:00:00</w:t>
+              <w:t>2026-08-16 00:00:00 → 2026-08-25 00:00:00</w:t>
             </w:r>
           </w:p>
         </w:tc>
@@ -2697,7 +2697,7 @@
               <w:rPr>
                 <w:sz w:val="18"/>
               </w:rPr>
-              <w:t>2026-11-17 00:00:00 → 2026-11-26 00:00:00</w:t>
+              <w:t>2026-08-26 00:00:00 → 2026-09-04 00:00:00</w:t>
             </w:r>
           </w:p>
         </w:tc>
@@ -2751,7 +2751,7 @@
               <w:rPr>
                 <w:sz w:val="18"/>
               </w:rPr>
-              <w:t>2026-11-27 00:00:00 → 2026-12-03 00:00:00</w:t>
+              <w:t>2026-09-05 00:00:00 → 2026-09-11 00:00:00</w:t>
             </w:r>
           </w:p>
         </w:tc>
@@ -2939,7 +2939,7 @@
           <w:i w:val="0"/>
           <w:sz w:val="20"/>
         </w:rPr>
-        <w:t>Incharge: —   |   Actual 0.0%  ·  Planned 0.0%  ·  On Track   |   0 person-days this week   |   0 visitor(s)</w:t>
+        <w:t>Incharge: —   |   Actual 0.0%  ·  Planned 49.5%  ·  Delayed   |   0 person-days this week   |   0 visitor(s)</w:t>
       </w:r>
     </w:p>
     <w:tbl>
@@ -3039,7 +3039,7 @@
               <w:rPr>
                 <w:sz w:val="18"/>
               </w:rPr>
-              <w:t>2026-07-07 00:00:00 → 2026-07-27 00:00:00</w:t>
+              <w:t>2026-04-22 00:00:00 → 2026-05-12 00:00:00</w:t>
             </w:r>
           </w:p>
         </w:tc>
@@ -3065,7 +3065,7 @@
               <w:rPr>
                 <w:sz w:val="18"/>
               </w:rPr>
-              <w:t>Not Started</w:t>
+              <w:t>Delayed</w:t>
             </w:r>
           </w:p>
         </w:tc>
@@ -3093,7 +3093,7 @@
               <w:rPr>
                 <w:sz w:val="18"/>
               </w:rPr>
-              <w:t>2026-07-28 00:00:00 → 2026-08-17 00:00:00</w:t>
+              <w:t>2026-05-13 00:00:00 → 2026-06-02 00:00:00</w:t>
             </w:r>
           </w:p>
         </w:tc>
@@ -3119,7 +3119,7 @@
               <w:rPr>
                 <w:sz w:val="18"/>
               </w:rPr>
-              <w:t>Not Started</w:t>
+              <w:t>Delayed</w:t>
             </w:r>
           </w:p>
         </w:tc>
@@ -3147,7 +3147,7 @@
               <w:rPr>
                 <w:sz w:val="18"/>
               </w:rPr>
-              <w:t>2026-08-18 00:00:00 → 2026-09-14 00:00:00</w:t>
+              <w:t>2026-06-03 00:00:00 → 2026-06-30 00:00:00</w:t>
             </w:r>
           </w:p>
         </w:tc>
@@ -3173,7 +3173,7 @@
               <w:rPr>
                 <w:sz w:val="18"/>
               </w:rPr>
-              <w:t>Not Started</w:t>
+              <w:t>Delayed</w:t>
             </w:r>
           </w:p>
         </w:tc>
@@ -3201,7 +3201,7 @@
               <w:rPr>
                 <w:sz w:val="18"/>
               </w:rPr>
-              <w:t>2026-09-15 00:00:00 → 2026-10-05 00:00:00</w:t>
+              <w:t>2026-07-01 00:00:00 → 2026-07-21 00:00:00</w:t>
             </w:r>
           </w:p>
         </w:tc>
@@ -3255,7 +3255,7 @@
               <w:rPr>
                 <w:sz w:val="18"/>
               </w:rPr>
-              <w:t>2026-10-06 00:00:00 → 2026-10-23 00:00:00</w:t>
+              <w:t>2026-07-22 00:00:00 → 2026-08-08 00:00:00</w:t>
             </w:r>
           </w:p>
         </w:tc>
@@ -3309,7 +3309,7 @@
               <w:rPr>
                 <w:sz w:val="18"/>
               </w:rPr>
-              <w:t>2026-10-24 00:00:00 → 2026-11-06 00:00:00</w:t>
+              <w:t>2026-08-09 00:00:00 → 2026-08-22 00:00:00</w:t>
             </w:r>
           </w:p>
         </w:tc>
@@ -3363,7 +3363,7 @@
               <w:rPr>
                 <w:sz w:val="18"/>
               </w:rPr>
-              <w:t>2026-11-07 00:00:00 → 2026-11-16 00:00:00</w:t>
+              <w:t>2026-08-23 00:00:00 → 2026-09-01 00:00:00</w:t>
             </w:r>
           </w:p>
         </w:tc>
@@ -3417,7 +3417,7 @@
               <w:rPr>
                 <w:sz w:val="18"/>
               </w:rPr>
-              <w:t>2026-11-17 00:00:00 → 2026-11-26 00:00:00</w:t>
+              <w:t>2026-09-02 00:00:00 → 2026-09-11 00:00:00</w:t>
             </w:r>
           </w:p>
         </w:tc>
@@ -3471,7 +3471,7 @@
               <w:rPr>
                 <w:sz w:val="18"/>
               </w:rPr>
-              <w:t>2026-11-27 00:00:00 → 2026-12-03 00:00:00</w:t>
+              <w:t>2026-09-12 00:00:00 → 2026-09-18 00:00:00</w:t>
             </w:r>
           </w:p>
         </w:tc>
@@ -3519,7 +3519,7 @@
           <w:i w:val="0"/>
           <w:sz w:val="20"/>
         </w:rPr>
-        <w:t>Incharge: —   |   Actual 0.0%  ·  Planned 0.0%  ·  On Track   |   0 person-days this week   |   0 visitor(s)</w:t>
+        <w:t>Incharge: —   |   Actual 0.0%  ·  Planned 45.0%  ·  Delayed   |   0 person-days this week   |   0 visitor(s)</w:t>
       </w:r>
     </w:p>
     <w:tbl>
@@ -3619,7 +3619,7 @@
               <w:rPr>
                 <w:sz w:val="18"/>
               </w:rPr>
-              <w:t>2026-07-07 00:00:00 → 2026-07-27 00:00:00</w:t>
+              <w:t>2026-04-29 00:00:00 → 2026-05-19 00:00:00</w:t>
             </w:r>
           </w:p>
         </w:tc>
@@ -3645,7 +3645,7 @@
               <w:rPr>
                 <w:sz w:val="18"/>
               </w:rPr>
-              <w:t>Not Started</w:t>
+              <w:t>Delayed</w:t>
             </w:r>
           </w:p>
         </w:tc>
@@ -3673,7 +3673,7 @@
               <w:rPr>
                 <w:sz w:val="18"/>
               </w:rPr>
-              <w:t>2026-07-28 00:00:00 → 2026-08-17 00:00:00</w:t>
+              <w:t>2026-05-20 00:00:00 → 2026-06-09 00:00:00</w:t>
             </w:r>
           </w:p>
         </w:tc>
@@ -3699,7 +3699,7 @@
               <w:rPr>
                 <w:sz w:val="18"/>
               </w:rPr>
-              <w:t>Not Started</w:t>
+              <w:t>Delayed</w:t>
             </w:r>
           </w:p>
         </w:tc>
@@ -3727,7 +3727,7 @@
               <w:rPr>
                 <w:sz w:val="18"/>
               </w:rPr>
-              <w:t>2026-08-18 00:00:00 → 2026-09-14 00:00:00</w:t>
+              <w:t>2026-06-10 00:00:00 → 2026-07-07 00:00:00</w:t>
             </w:r>
           </w:p>
         </w:tc>
@@ -3781,7 +3781,7 @@
               <w:rPr>
                 <w:sz w:val="18"/>
               </w:rPr>
-              <w:t>2026-09-15 00:00:00 → 2026-10-05 00:00:00</w:t>
+              <w:t>2026-07-08 00:00:00 → 2026-07-28 00:00:00</w:t>
             </w:r>
           </w:p>
         </w:tc>
@@ -3835,7 +3835,7 @@
               <w:rPr>
                 <w:sz w:val="18"/>
               </w:rPr>
-              <w:t>2026-10-06 00:00:00 → 2026-10-23 00:00:00</w:t>
+              <w:t>2026-07-29 00:00:00 → 2026-08-15 00:00:00</w:t>
             </w:r>
           </w:p>
         </w:tc>
@@ -3889,7 +3889,7 @@
               <w:rPr>
                 <w:sz w:val="18"/>
               </w:rPr>
-              <w:t>2026-10-24 00:00:00 → 2026-11-06 00:00:00</w:t>
+              <w:t>2026-08-16 00:00:00 → 2026-08-29 00:00:00</w:t>
             </w:r>
           </w:p>
         </w:tc>
@@ -3943,7 +3943,7 @@
               <w:rPr>
                 <w:sz w:val="18"/>
               </w:rPr>
-              <w:t>2026-11-07 00:00:00 → 2026-11-16 00:00:00</w:t>
+              <w:t>2026-08-30 00:00:00 → 2026-09-08 00:00:00</w:t>
             </w:r>
           </w:p>
         </w:tc>
@@ -3997,7 +3997,7 @@
               <w:rPr>
                 <w:sz w:val="18"/>
               </w:rPr>
-              <w:t>2026-11-17 00:00:00 → 2026-11-26 00:00:00</w:t>
+              <w:t>2026-09-09 00:00:00 → 2026-09-18 00:00:00</w:t>
             </w:r>
           </w:p>
         </w:tc>
@@ -4051,7 +4051,7 @@
               <w:rPr>
                 <w:sz w:val="18"/>
               </w:rPr>
-              <w:t>2026-11-27 00:00:00 → 2026-12-03 00:00:00</w:t>
+              <w:t>2026-09-19 00:00:00 → 2026-09-25 00:00:00</w:t>
             </w:r>
           </w:p>
         </w:tc>
@@ -4099,7 +4099,7 @@
           <w:i w:val="0"/>
           <w:sz w:val="20"/>
         </w:rPr>
-        <w:t>Incharge: —   |   Actual 0.0%  ·  Planned 0.0%  ·  On Track   |   0 person-days this week   |   0 visitor(s)</w:t>
+        <w:t>Incharge: —   |   Actual 0.0%  ·  Planned 40.3%  ·  Delayed   |   0 person-days this week   |   0 visitor(s)</w:t>
       </w:r>
     </w:p>
     <w:tbl>
@@ -4199,7 +4199,7 @@
               <w:rPr>
                 <w:sz w:val="18"/>
               </w:rPr>
-              <w:t>2026-07-07 00:00:00 → 2026-07-27 00:00:00</w:t>
+              <w:t>2026-05-06 00:00:00 → 2026-05-26 00:00:00</w:t>
             </w:r>
           </w:p>
         </w:tc>
@@ -4225,7 +4225,7 @@
               <w:rPr>
                 <w:sz w:val="18"/>
               </w:rPr>
-              <w:t>Not Started</w:t>
+              <w:t>Delayed</w:t>
             </w:r>
           </w:p>
         </w:tc>
@@ -4253,7 +4253,7 @@
               <w:rPr>
                 <w:sz w:val="18"/>
               </w:rPr>
-              <w:t>2026-07-28 00:00:00 → 2026-08-17 00:00:00</w:t>
+              <w:t>2026-05-27 00:00:00 → 2026-06-16 00:00:00</w:t>
             </w:r>
           </w:p>
         </w:tc>
@@ -4279,7 +4279,7 @@
               <w:rPr>
                 <w:sz w:val="18"/>
               </w:rPr>
-              <w:t>Not Started</w:t>
+              <w:t>Delayed</w:t>
             </w:r>
           </w:p>
         </w:tc>
@@ -4307,7 +4307,7 @@
               <w:rPr>
                 <w:sz w:val="18"/>
               </w:rPr>
-              <w:t>2026-08-18 00:00:00 → 2026-09-14 00:00:00</w:t>
+              <w:t>2026-06-17 00:00:00 → 2026-07-14 00:00:00</w:t>
             </w:r>
           </w:p>
         </w:tc>
@@ -4361,7 +4361,7 @@
               <w:rPr>
                 <w:sz w:val="18"/>
               </w:rPr>
-              <w:t>2026-09-15 00:00:00 → 2026-10-05 00:00:00</w:t>
+              <w:t>2026-07-15 00:00:00 → 2026-08-04 00:00:00</w:t>
             </w:r>
           </w:p>
         </w:tc>
@@ -4415,7 +4415,7 @@
               <w:rPr>
                 <w:sz w:val="18"/>
               </w:rPr>
-              <w:t>2026-10-06 00:00:00 → 2026-10-23 00:00:00</w:t>
+              <w:t>2026-08-05 00:00:00 → 2026-08-22 00:00:00</w:t>
             </w:r>
           </w:p>
         </w:tc>
@@ -4469,7 +4469,7 @@
               <w:rPr>
                 <w:sz w:val="18"/>
               </w:rPr>
-              <w:t>2026-10-24 00:00:00 → 2026-11-06 00:00:00</w:t>
+              <w:t>2026-08-23 00:00:00 → 2026-09-05 00:00:00</w:t>
             </w:r>
           </w:p>
         </w:tc>
@@ -4523,7 +4523,7 @@
               <w:rPr>
                 <w:sz w:val="18"/>
               </w:rPr>
-              <w:t>2026-11-07 00:00:00 → 2026-11-16 00:00:00</w:t>
+              <w:t>2026-09-06 00:00:00 → 2026-09-15 00:00:00</w:t>
             </w:r>
           </w:p>
         </w:tc>
@@ -4577,7 +4577,7 @@
               <w:rPr>
                 <w:sz w:val="18"/>
               </w:rPr>
-              <w:t>2026-11-17 00:00:00 → 2026-11-26 00:00:00</w:t>
+              <w:t>2026-09-16 00:00:00 → 2026-09-25 00:00:00</w:t>
             </w:r>
           </w:p>
         </w:tc>
@@ -4631,7 +4631,7 @@
               <w:rPr>
                 <w:sz w:val="18"/>
               </w:rPr>
-              <w:t>2026-11-27 00:00:00 → 2026-12-03 00:00:00</w:t>
+              <w:t>2026-09-26 00:00:00 → 2026-10-02 00:00:00</w:t>
             </w:r>
           </w:p>
         </w:tc>
@@ -4679,7 +4679,7 @@
           <w:i w:val="0"/>
           <w:sz w:val="20"/>
         </w:rPr>
-        <w:t>Incharge: Administrator   |   Actual 0.0%  ·  Planned 0.0%  ·  On Track   |   0 person-days this week   |   1 visitor(s)</w:t>
+        <w:t>Incharge: Administrator   |   Actual 0.0%  ·  Planned 35.7%  ·  Delayed   |   0 person-days this week   |   1 visitor(s)</w:t>
       </w:r>
     </w:p>
     <w:tbl>
@@ -4779,7 +4779,7 @@
               <w:rPr>
                 <w:sz w:val="18"/>
               </w:rPr>
-              <w:t>2026-07-07 00:00:00 → 2026-07-27 00:00:00</w:t>
+              <w:t>2026-05-13 00:00:00 → 2026-06-02 00:00:00</w:t>
             </w:r>
           </w:p>
         </w:tc>
@@ -4805,7 +4805,7 @@
               <w:rPr>
                 <w:sz w:val="18"/>
               </w:rPr>
-              <w:t>In Progress</w:t>
+              <w:t>Delayed</w:t>
             </w:r>
           </w:p>
         </w:tc>
@@ -4833,7 +4833,7 @@
               <w:rPr>
                 <w:sz w:val="18"/>
               </w:rPr>
-              <w:t>2026-07-28 00:00:00 → 2026-08-17 00:00:00</w:t>
+              <w:t>2026-06-03 00:00:00 → 2026-06-23 00:00:00</w:t>
             </w:r>
           </w:p>
         </w:tc>
@@ -4859,7 +4859,7 @@
               <w:rPr>
                 <w:sz w:val="18"/>
               </w:rPr>
-              <w:t>Not Started</w:t>
+              <w:t>Delayed</w:t>
             </w:r>
           </w:p>
         </w:tc>
@@ -4887,7 +4887,7 @@
               <w:rPr>
                 <w:sz w:val="18"/>
               </w:rPr>
-              <w:t>2026-08-18 00:00:00 → 2026-09-14 00:00:00</w:t>
+              <w:t>2026-06-24 00:00:00 → 2026-07-21 00:00:00</w:t>
             </w:r>
           </w:p>
         </w:tc>
@@ -4941,7 +4941,7 @@
               <w:rPr>
                 <w:sz w:val="18"/>
               </w:rPr>
-              <w:t>2026-09-15 00:00:00 → 2026-10-05 00:00:00</w:t>
+              <w:t>2026-07-22 00:00:00 → 2026-08-11 00:00:00</w:t>
             </w:r>
           </w:p>
         </w:tc>
@@ -4995,7 +4995,7 @@
               <w:rPr>
                 <w:sz w:val="18"/>
               </w:rPr>
-              <w:t>2026-10-06 00:00:00 → 2026-10-23 00:00:00</w:t>
+              <w:t>2026-08-12 00:00:00 → 2026-08-29 00:00:00</w:t>
             </w:r>
           </w:p>
         </w:tc>
@@ -5049,7 +5049,7 @@
               <w:rPr>
                 <w:sz w:val="18"/>
               </w:rPr>
-              <w:t>2026-10-24 00:00:00 → 2026-11-06 00:00:00</w:t>
+              <w:t>2026-08-30 00:00:00 → 2026-09-12 00:00:00</w:t>
             </w:r>
           </w:p>
         </w:tc>
@@ -5103,7 +5103,7 @@
               <w:rPr>
                 <w:sz w:val="18"/>
               </w:rPr>
-              <w:t>2026-11-07 00:00:00 → 2026-11-16 00:00:00</w:t>
+              <w:t>2026-09-13 00:00:00 → 2026-09-22 00:00:00</w:t>
             </w:r>
           </w:p>
         </w:tc>
@@ -5157,7 +5157,7 @@
               <w:rPr>
                 <w:sz w:val="18"/>
               </w:rPr>
-              <w:t>2026-11-17 00:00:00 → 2026-11-26 00:00:00</w:t>
+              <w:t>2026-09-23 00:00:00 → 2026-10-02 00:00:00</w:t>
             </w:r>
           </w:p>
         </w:tc>
@@ -5211,7 +5211,7 @@
               <w:rPr>
                 <w:sz w:val="18"/>
               </w:rPr>
-              <w:t>2026-11-27 00:00:00 → 2026-12-03 00:00:00</w:t>
+              <w:t>2026-10-03 00:00:00 → 2026-10-09 00:00:00</w:t>
             </w:r>
           </w:p>
         </w:tc>
@@ -5259,7 +5259,7 @@
           <w:i w:val="0"/>
           <w:sz w:val="20"/>
         </w:rPr>
-        <w:t>Incharge: —   |   Actual 0.0%  ·  Planned 0.0%  ·  On Track   |   0 person-days this week   |   0 visitor(s)</w:t>
+        <w:t>Incharge: —   |   Actual 0.0%  ·  Planned 31.0%  ·  Delayed   |   0 person-days this week   |   0 visitor(s)</w:t>
       </w:r>
     </w:p>
     <w:tbl>
@@ -5359,7 +5359,7 @@
               <w:rPr>
                 <w:sz w:val="18"/>
               </w:rPr>
-              <w:t>2026-07-07 00:00:00 → 2026-07-27 00:00:00</w:t>
+              <w:t>2026-05-20 00:00:00 → 2026-06-09 00:00:00</w:t>
             </w:r>
           </w:p>
         </w:tc>
@@ -5385,7 +5385,7 @@
               <w:rPr>
                 <w:sz w:val="18"/>
               </w:rPr>
-              <w:t>Not Started</w:t>
+              <w:t>Delayed</w:t>
             </w:r>
           </w:p>
         </w:tc>
@@ -5413,7 +5413,7 @@
               <w:rPr>
                 <w:sz w:val="18"/>
               </w:rPr>
-              <w:t>2026-07-28 00:00:00 → 2026-08-17 00:00:00</w:t>
+              <w:t>2026-06-10 00:00:00 → 2026-06-30 00:00:00</w:t>
             </w:r>
           </w:p>
         </w:tc>
@@ -5439,7 +5439,7 @@
               <w:rPr>
                 <w:sz w:val="18"/>
               </w:rPr>
-              <w:t>Not Started</w:t>
+              <w:t>Delayed</w:t>
             </w:r>
           </w:p>
         </w:tc>
@@ -5467,7 +5467,7 @@
               <w:rPr>
                 <w:sz w:val="18"/>
               </w:rPr>
-              <w:t>2026-08-18 00:00:00 → 2026-09-14 00:00:00</w:t>
+              <w:t>2026-07-01 00:00:00 → 2026-07-28 00:00:00</w:t>
             </w:r>
           </w:p>
         </w:tc>
@@ -5521,7 +5521,7 @@
               <w:rPr>
                 <w:sz w:val="18"/>
               </w:rPr>
-              <w:t>2026-09-15 00:00:00 → 2026-10-05 00:00:00</w:t>
+              <w:t>2026-07-29 00:00:00 → 2026-08-18 00:00:00</w:t>
             </w:r>
           </w:p>
         </w:tc>
@@ -5575,7 +5575,7 @@
               <w:rPr>
                 <w:sz w:val="18"/>
               </w:rPr>
-              <w:t>2026-10-06 00:00:00 → 2026-10-23 00:00:00</w:t>
+              <w:t>2026-08-19 00:00:00 → 2026-09-05 00:00:00</w:t>
             </w:r>
           </w:p>
         </w:tc>
@@ -5629,7 +5629,7 @@
               <w:rPr>
                 <w:sz w:val="18"/>
               </w:rPr>
-              <w:t>2026-10-24 00:00:00 → 2026-11-06 00:00:00</w:t>
+              <w:t>2026-09-06 00:00:00 → 2026-09-19 00:00:00</w:t>
             </w:r>
           </w:p>
         </w:tc>
@@ -5683,7 +5683,7 @@
               <w:rPr>
                 <w:sz w:val="18"/>
               </w:rPr>
-              <w:t>2026-11-07 00:00:00 → 2026-11-16 00:00:00</w:t>
+              <w:t>2026-09-20 00:00:00 → 2026-09-29 00:00:00</w:t>
             </w:r>
           </w:p>
         </w:tc>
@@ -5737,7 +5737,7 @@
               <w:rPr>
                 <w:sz w:val="18"/>
               </w:rPr>
-              <w:t>2026-11-17 00:00:00 → 2026-11-26 00:00:00</w:t>
+              <w:t>2026-09-30 00:00:00 → 2026-10-09 00:00:00</w:t>
             </w:r>
           </w:p>
         </w:tc>
@@ -5791,7 +5791,7 @@
               <w:rPr>
                 <w:sz w:val="18"/>
               </w:rPr>
-              <w:t>2026-11-27 00:00:00 → 2026-12-03 00:00:00</w:t>
+              <w:t>2026-10-10 00:00:00 → 2026-10-16 00:00:00</w:t>
             </w:r>
           </w:p>
         </w:tc>
@@ -5839,7 +5839,7 @@
           <w:i w:val="0"/>
           <w:sz w:val="20"/>
         </w:rPr>
-        <w:t>Incharge: —   |   Actual 0.0%  ·  Planned 0.0%  ·  On Track   |   0 person-days this week   |   0 visitor(s)</w:t>
+        <w:t>Incharge: —   |   Actual 0.0%  ·  Planned 27.0%  ·  Delayed   |   0 person-days this week   |   0 visitor(s)</w:t>
       </w:r>
     </w:p>
     <w:tbl>
@@ -5939,7 +5939,7 @@
               <w:rPr>
                 <w:sz w:val="18"/>
               </w:rPr>
-              <w:t>2026-07-07 00:00:00 → 2026-07-27 00:00:00</w:t>
+              <w:t>2026-05-27 00:00:00 → 2026-06-16 00:00:00</w:t>
             </w:r>
           </w:p>
         </w:tc>
@@ -5965,7 +5965,7 @@
               <w:rPr>
                 <w:sz w:val="18"/>
               </w:rPr>
-              <w:t>Not Started</w:t>
+              <w:t>Delayed</w:t>
             </w:r>
           </w:p>
         </w:tc>
@@ -5993,7 +5993,7 @@
               <w:rPr>
                 <w:sz w:val="18"/>
               </w:rPr>
-              <w:t>2026-07-28 00:00:00 → 2026-08-17 00:00:00</w:t>
+              <w:t>2026-06-17 00:00:00 → 2026-07-07 00:00:00</w:t>
             </w:r>
           </w:p>
         </w:tc>
@@ -6047,7 +6047,7 @@
               <w:rPr>
                 <w:sz w:val="18"/>
               </w:rPr>
-              <w:t>2026-08-18 00:00:00 → 2026-09-14 00:00:00</w:t>
+              <w:t>2026-07-08 00:00:00 → 2026-08-04 00:00:00</w:t>
             </w:r>
           </w:p>
         </w:tc>
@@ -6101,7 +6101,7 @@
               <w:rPr>
                 <w:sz w:val="18"/>
               </w:rPr>
-              <w:t>2026-09-15 00:00:00 → 2026-10-05 00:00:00</w:t>
+              <w:t>2026-08-05 00:00:00 → 2026-08-25 00:00:00</w:t>
             </w:r>
           </w:p>
         </w:tc>
@@ -6155,7 +6155,7 @@
               <w:rPr>
                 <w:sz w:val="18"/>
               </w:rPr>
-              <w:t>2026-10-06 00:00:00 → 2026-10-23 00:00:00</w:t>
+              <w:t>2026-08-26 00:00:00 → 2026-09-12 00:00:00</w:t>
             </w:r>
           </w:p>
         </w:tc>
@@ -6209,7 +6209,7 @@
               <w:rPr>
                 <w:sz w:val="18"/>
               </w:rPr>
-              <w:t>2026-10-24 00:00:00 → 2026-11-06 00:00:00</w:t>
+              <w:t>2026-09-13 00:00:00 → 2026-09-26 00:00:00</w:t>
             </w:r>
           </w:p>
         </w:tc>
@@ -6263,7 +6263,7 @@
               <w:rPr>
                 <w:sz w:val="18"/>
               </w:rPr>
-              <w:t>2026-11-07 00:00:00 → 2026-11-16 00:00:00</w:t>
+              <w:t>2026-09-27 00:00:00 → 2026-10-06 00:00:00</w:t>
             </w:r>
           </w:p>
         </w:tc>
@@ -6317,7 +6317,7 @@
               <w:rPr>
                 <w:sz w:val="18"/>
               </w:rPr>
-              <w:t>2026-11-17 00:00:00 → 2026-11-26 00:00:00</w:t>
+              <w:t>2026-10-07 00:00:00 → 2026-10-16 00:00:00</w:t>
             </w:r>
           </w:p>
         </w:tc>
@@ -6371,7 +6371,7 @@
               <w:rPr>
                 <w:sz w:val="18"/>
               </w:rPr>
-              <w:t>2026-11-27 00:00:00 → 2026-12-03 00:00:00</w:t>
+              <w:t>2026-10-17 00:00:00 → 2026-10-23 00:00:00</w:t>
             </w:r>
           </w:p>
         </w:tc>
@@ -6419,7 +6419,7 @@
           <w:i w:val="0"/>
           <w:sz w:val="20"/>
         </w:rPr>
-        <w:t>Incharge: —   |   Actual 0.0%  ·  Planned 0.0%  ·  On Track   |   0 person-days this week   |   0 visitor(s)</w:t>
+        <w:t>Incharge: —   |   Actual 0.0%  ·  Planned 21.8%  ·  Delayed   |   0 person-days this week   |   0 visitor(s)</w:t>
       </w:r>
     </w:p>
     <w:tbl>
@@ -6519,7 +6519,7 @@
               <w:rPr>
                 <w:sz w:val="18"/>
               </w:rPr>
-              <w:t>2026-07-07 00:00:00 → 2026-07-27 00:00:00</w:t>
+              <w:t>2026-06-03 00:00:00 → 2026-06-23 00:00:00</w:t>
             </w:r>
           </w:p>
         </w:tc>
@@ -6545,7 +6545,7 @@
               <w:rPr>
                 <w:sz w:val="18"/>
               </w:rPr>
-              <w:t>Not Started</w:t>
+              <w:t>Delayed</w:t>
             </w:r>
           </w:p>
         </w:tc>
@@ -6573,7 +6573,7 @@
               <w:rPr>
                 <w:sz w:val="18"/>
               </w:rPr>
-              <w:t>2026-07-28 00:00:00 → 2026-08-17 00:00:00</w:t>
+              <w:t>2026-06-24 00:00:00 → 2026-07-14 00:00:00</w:t>
             </w:r>
           </w:p>
         </w:tc>
@@ -6627,7 +6627,7 @@
               <w:rPr>
                 <w:sz w:val="18"/>
               </w:rPr>
-              <w:t>2026-08-18 00:00:00 → 2026-09-14 00:00:00</w:t>
+              <w:t>2026-07-15 00:00:00 → 2026-08-11 00:00:00</w:t>
             </w:r>
           </w:p>
         </w:tc>
@@ -6681,7 +6681,7 @@
               <w:rPr>
                 <w:sz w:val="18"/>
               </w:rPr>
-              <w:t>2026-09-15 00:00:00 → 2026-10-05 00:00:00</w:t>
+              <w:t>2026-08-12 00:00:00 → 2026-09-01 00:00:00</w:t>
             </w:r>
           </w:p>
         </w:tc>
@@ -6735,7 +6735,7 @@
               <w:rPr>
                 <w:sz w:val="18"/>
               </w:rPr>
-              <w:t>2026-10-06 00:00:00 → 2026-10-23 00:00:00</w:t>
+              <w:t>2026-09-02 00:00:00 → 2026-09-19 00:00:00</w:t>
             </w:r>
           </w:p>
         </w:tc>
@@ -6789,7 +6789,7 @@
               <w:rPr>
                 <w:sz w:val="18"/>
               </w:rPr>
-              <w:t>2026-10-24 00:00:00 → 2026-11-06 00:00:00</w:t>
+              <w:t>2026-09-20 00:00:00 → 2026-10-03 00:00:00</w:t>
             </w:r>
           </w:p>
         </w:tc>
@@ -6843,7 +6843,7 @@
               <w:rPr>
                 <w:sz w:val="18"/>
               </w:rPr>
-              <w:t>2026-11-07 00:00:00 → 2026-11-16 00:00:00</w:t>
+              <w:t>2026-10-04 00:00:00 → 2026-10-13 00:00:00</w:t>
             </w:r>
           </w:p>
         </w:tc>
@@ -6897,7 +6897,7 @@
               <w:rPr>
                 <w:sz w:val="18"/>
               </w:rPr>
-              <w:t>2026-11-17 00:00:00 → 2026-11-26 00:00:00</w:t>
+              <w:t>2026-10-14 00:00:00 → 2026-10-23 00:00:00</w:t>
             </w:r>
           </w:p>
         </w:tc>
@@ -6951,7 +6951,7 @@
               <w:rPr>
                 <w:sz w:val="18"/>
               </w:rPr>
-              <w:t>2026-11-27 00:00:00 → 2026-12-03 00:00:00</w:t>
+              <w:t>2026-10-24 00:00:00 → 2026-10-30 00:00:00</w:t>
             </w:r>
           </w:p>
         </w:tc>
@@ -6999,7 +6999,7 @@
           <w:i w:val="0"/>
           <w:sz w:val="20"/>
         </w:rPr>
-        <w:t>Incharge: —   |   Actual 0.0%  ·  Planned 0.0%  ·  On Track   |   0 person-days this week   |   0 visitor(s)</w:t>
+        <w:t>Incharge: —   |   Actual 0.0%  ·  Planned 16.5%  ·  Delayed   |   0 person-days this week   |   0 visitor(s)</w:t>
       </w:r>
     </w:p>
     <w:tbl>
@@ -7099,7 +7099,7 @@
               <w:rPr>
                 <w:sz w:val="18"/>
               </w:rPr>
-              <w:t>2026-07-07 00:00:00 → 2026-07-27 00:00:00</w:t>
+              <w:t>2026-06-10 00:00:00 → 2026-06-30 00:00:00</w:t>
             </w:r>
           </w:p>
         </w:tc>
@@ -7125,7 +7125,7 @@
               <w:rPr>
                 <w:sz w:val="18"/>
               </w:rPr>
-              <w:t>Not Started</w:t>
+              <w:t>Delayed</w:t>
             </w:r>
           </w:p>
         </w:tc>
@@ -7153,7 +7153,7 @@
               <w:rPr>
                 <w:sz w:val="18"/>
               </w:rPr>
-              <w:t>2026-07-28 00:00:00 → 2026-08-17 00:00:00</w:t>
+              <w:t>2026-07-01 00:00:00 → 2026-07-21 00:00:00</w:t>
             </w:r>
           </w:p>
         </w:tc>
@@ -7207,7 +7207,7 @@
               <w:rPr>
                 <w:sz w:val="18"/>
               </w:rPr>
-              <w:t>2026-08-18 00:00:00 → 2026-09-14 00:00:00</w:t>
+              <w:t>2026-07-22 00:00:00 → 2026-08-18 00:00:00</w:t>
             </w:r>
           </w:p>
         </w:tc>
@@ -7261,7 +7261,7 @@
               <w:rPr>
                 <w:sz w:val="18"/>
               </w:rPr>
-              <w:t>2026-09-15 00:00:00 → 2026-10-05 00:00:00</w:t>
+              <w:t>2026-08-19 00:00:00 → 2026-09-08 00:00:00</w:t>
             </w:r>
           </w:p>
         </w:tc>
@@ -7315,7 +7315,7 @@
               <w:rPr>
                 <w:sz w:val="18"/>
               </w:rPr>
-              <w:t>2026-10-06 00:00:00 → 2026-10-23 00:00:00</w:t>
+              <w:t>2026-09-09 00:00:00 → 2026-09-26 00:00:00</w:t>
             </w:r>
           </w:p>
         </w:tc>
@@ -7369,7 +7369,7 @@
               <w:rPr>
                 <w:sz w:val="18"/>
               </w:rPr>
-              <w:t>2026-10-24 00:00:00 → 2026-11-06 00:00:00</w:t>
+              <w:t>2026-09-27 00:00:00 → 2026-10-10 00:00:00</w:t>
             </w:r>
           </w:p>
         </w:tc>
@@ -7423,7 +7423,7 @@
               <w:rPr>
                 <w:sz w:val="18"/>
               </w:rPr>
-              <w:t>2026-11-07 00:00:00 → 2026-11-16 00:00:00</w:t>
+              <w:t>2026-10-11 00:00:00 → 2026-10-20 00:00:00</w:t>
             </w:r>
           </w:p>
         </w:tc>
@@ -7477,7 +7477,7 @@
               <w:rPr>
                 <w:sz w:val="18"/>
               </w:rPr>
-              <w:t>2026-11-17 00:00:00 → 2026-11-26 00:00:00</w:t>
+              <w:t>2026-10-21 00:00:00 → 2026-10-30 00:00:00</w:t>
             </w:r>
           </w:p>
         </w:tc>
@@ -7531,7 +7531,7 @@
               <w:rPr>
                 <w:sz w:val="18"/>
               </w:rPr>
-              <w:t>2026-11-27 00:00:00 → 2026-12-03 00:00:00</w:t>
+              <w:t>2026-10-31 00:00:00 → 2026-11-06 00:00:00</w:t>
             </w:r>
           </w:p>
         </w:tc>
@@ -7579,7 +7579,7 @@
           <w:i w:val="0"/>
           <w:sz w:val="20"/>
         </w:rPr>
-        <w:t>Incharge: —   |   Actual 5.0%  ·  Planned 0.0%  ·  On Track   |   0 person-days this week   |   0 visitor(s)</w:t>
+        <w:t>Incharge: —   |   Actual 100.0%  ·  Planned 12.0%  ·  On Track   |   0 person-days this week   |   0 visitor(s)</w:t>
       </w:r>
     </w:p>
     <w:tbl>
@@ -7679,33 +7679,33 @@
               <w:rPr>
                 <w:sz w:val="18"/>
               </w:rPr>
-              <w:t>2026-07-07 00:00:00 → 2026-07-27 00:00:00</w:t>
-            </w:r>
-          </w:p>
-        </w:tc>
-        <w:tc>
-          <w:tcPr>
-            <w:tcW w:type="dxa" w:w="2401"/>
-          </w:tcPr>
-          <w:p>
-            <w:r>
-              <w:rPr>
-                <w:sz w:val="18"/>
-              </w:rPr>
-              <w:t>0%</w:t>
-            </w:r>
-          </w:p>
-        </w:tc>
-        <w:tc>
-          <w:tcPr>
-            <w:tcW w:type="dxa" w:w="2401"/>
-          </w:tcPr>
-          <w:p>
-            <w:r>
-              <w:rPr>
-                <w:sz w:val="18"/>
-              </w:rPr>
-              <w:t>Not Started</w:t>
+              <w:t>2026-06-17 00:00:00 → 2026-07-07 00:00:00</w:t>
+            </w:r>
+          </w:p>
+        </w:tc>
+        <w:tc>
+          <w:tcPr>
+            <w:tcW w:type="dxa" w:w="2401"/>
+          </w:tcPr>
+          <w:p>
+            <w:r>
+              <w:rPr>
+                <w:sz w:val="18"/>
+              </w:rPr>
+              <w:t>100%</w:t>
+            </w:r>
+          </w:p>
+        </w:tc>
+        <w:tc>
+          <w:tcPr>
+            <w:tcW w:type="dxa" w:w="2401"/>
+          </w:tcPr>
+          <w:p>
+            <w:r>
+              <w:rPr>
+                <w:sz w:val="18"/>
+              </w:rPr>
+              <w:t>Completed</w:t>
             </w:r>
           </w:p>
         </w:tc>
@@ -7733,33 +7733,33 @@
               <w:rPr>
                 <w:sz w:val="18"/>
               </w:rPr>
-              <w:t>2026-07-28 00:00:00 → 2026-08-17 00:00:00</w:t>
-            </w:r>
-          </w:p>
-        </w:tc>
-        <w:tc>
-          <w:tcPr>
-            <w:tcW w:type="dxa" w:w="2401"/>
-          </w:tcPr>
-          <w:p>
-            <w:r>
-              <w:rPr>
-                <w:sz w:val="18"/>
-              </w:rPr>
-              <w:t>0%</w:t>
-            </w:r>
-          </w:p>
-        </w:tc>
-        <w:tc>
-          <w:tcPr>
-            <w:tcW w:type="dxa" w:w="2401"/>
-          </w:tcPr>
-          <w:p>
-            <w:r>
-              <w:rPr>
-                <w:sz w:val="18"/>
-              </w:rPr>
-              <w:t>Not Started</w:t>
+              <w:t>2026-07-08 00:00:00 → 2026-07-28 00:00:00</w:t>
+            </w:r>
+          </w:p>
+        </w:tc>
+        <w:tc>
+          <w:tcPr>
+            <w:tcW w:type="dxa" w:w="2401"/>
+          </w:tcPr>
+          <w:p>
+            <w:r>
+              <w:rPr>
+                <w:sz w:val="18"/>
+              </w:rPr>
+              <w:t>100%</w:t>
+            </w:r>
+          </w:p>
+        </w:tc>
+        <w:tc>
+          <w:tcPr>
+            <w:tcW w:type="dxa" w:w="2401"/>
+          </w:tcPr>
+          <w:p>
+            <w:r>
+              <w:rPr>
+                <w:sz w:val="18"/>
+              </w:rPr>
+              <w:t>Completed</w:t>
             </w:r>
           </w:p>
         </w:tc>
@@ -7787,33 +7787,33 @@
               <w:rPr>
                 <w:sz w:val="18"/>
               </w:rPr>
-              <w:t>2026-08-18 00:00:00 → 2026-09-14 00:00:00</w:t>
-            </w:r>
-          </w:p>
-        </w:tc>
-        <w:tc>
-          <w:tcPr>
-            <w:tcW w:type="dxa" w:w="2401"/>
-          </w:tcPr>
-          <w:p>
-            <w:r>
-              <w:rPr>
-                <w:sz w:val="18"/>
-              </w:rPr>
-              <w:t>0%</w:t>
-            </w:r>
-          </w:p>
-        </w:tc>
-        <w:tc>
-          <w:tcPr>
-            <w:tcW w:type="dxa" w:w="2401"/>
-          </w:tcPr>
-          <w:p>
-            <w:r>
-              <w:rPr>
-                <w:sz w:val="18"/>
-              </w:rPr>
-              <w:t>Not Started</w:t>
+              <w:t>2026-07-29 00:00:00 → 2026-08-25 00:00:00</w:t>
+            </w:r>
+          </w:p>
+        </w:tc>
+        <w:tc>
+          <w:tcPr>
+            <w:tcW w:type="dxa" w:w="2401"/>
+          </w:tcPr>
+          <w:p>
+            <w:r>
+              <w:rPr>
+                <w:sz w:val="18"/>
+              </w:rPr>
+              <w:t>100%</w:t>
+            </w:r>
+          </w:p>
+        </w:tc>
+        <w:tc>
+          <w:tcPr>
+            <w:tcW w:type="dxa" w:w="2401"/>
+          </w:tcPr>
+          <w:p>
+            <w:r>
+              <w:rPr>
+                <w:sz w:val="18"/>
+              </w:rPr>
+              <w:t>Completed</w:t>
             </w:r>
           </w:p>
         </w:tc>
@@ -7841,33 +7841,33 @@
               <w:rPr>
                 <w:sz w:val="18"/>
               </w:rPr>
-              <w:t>2026-09-15 00:00:00 → 2026-10-05 00:00:00</w:t>
-            </w:r>
-          </w:p>
-        </w:tc>
-        <w:tc>
-          <w:tcPr>
-            <w:tcW w:type="dxa" w:w="2401"/>
-          </w:tcPr>
-          <w:p>
-            <w:r>
-              <w:rPr>
-                <w:sz w:val="18"/>
-              </w:rPr>
-              <w:t>0%</w:t>
-            </w:r>
-          </w:p>
-        </w:tc>
-        <w:tc>
-          <w:tcPr>
-            <w:tcW w:type="dxa" w:w="2401"/>
-          </w:tcPr>
-          <w:p>
-            <w:r>
-              <w:rPr>
-                <w:sz w:val="18"/>
-              </w:rPr>
-              <w:t>Not Started</w:t>
+              <w:t>2026-08-26 00:00:00 → 2026-09-15 00:00:00</w:t>
+            </w:r>
+          </w:p>
+        </w:tc>
+        <w:tc>
+          <w:tcPr>
+            <w:tcW w:type="dxa" w:w="2401"/>
+          </w:tcPr>
+          <w:p>
+            <w:r>
+              <w:rPr>
+                <w:sz w:val="18"/>
+              </w:rPr>
+              <w:t>100%</w:t>
+            </w:r>
+          </w:p>
+        </w:tc>
+        <w:tc>
+          <w:tcPr>
+            <w:tcW w:type="dxa" w:w="2401"/>
+          </w:tcPr>
+          <w:p>
+            <w:r>
+              <w:rPr>
+                <w:sz w:val="18"/>
+              </w:rPr>
+              <w:t>Completed</w:t>
             </w:r>
           </w:p>
         </w:tc>
@@ -7895,33 +7895,33 @@
               <w:rPr>
                 <w:sz w:val="18"/>
               </w:rPr>
-              <w:t>2026-10-06 00:00:00 → 2026-10-23 00:00:00</w:t>
-            </w:r>
-          </w:p>
-        </w:tc>
-        <w:tc>
-          <w:tcPr>
-            <w:tcW w:type="dxa" w:w="2401"/>
-          </w:tcPr>
-          <w:p>
-            <w:r>
-              <w:rPr>
-                <w:sz w:val="18"/>
-              </w:rPr>
-              <w:t>0%</w:t>
-            </w:r>
-          </w:p>
-        </w:tc>
-        <w:tc>
-          <w:tcPr>
-            <w:tcW w:type="dxa" w:w="2401"/>
-          </w:tcPr>
-          <w:p>
-            <w:r>
-              <w:rPr>
-                <w:sz w:val="18"/>
-              </w:rPr>
-              <w:t>Not Started</w:t>
+              <w:t>2026-09-16 00:00:00 → 2026-10-03 00:00:00</w:t>
+            </w:r>
+          </w:p>
+        </w:tc>
+        <w:tc>
+          <w:tcPr>
+            <w:tcW w:type="dxa" w:w="2401"/>
+          </w:tcPr>
+          <w:p>
+            <w:r>
+              <w:rPr>
+                <w:sz w:val="18"/>
+              </w:rPr>
+              <w:t>100%</w:t>
+            </w:r>
+          </w:p>
+        </w:tc>
+        <w:tc>
+          <w:tcPr>
+            <w:tcW w:type="dxa" w:w="2401"/>
+          </w:tcPr>
+          <w:p>
+            <w:r>
+              <w:rPr>
+                <w:sz w:val="18"/>
+              </w:rPr>
+              <w:t>Completed</w:t>
             </w:r>
           </w:p>
         </w:tc>
@@ -7949,33 +7949,33 @@
               <w:rPr>
                 <w:sz w:val="18"/>
               </w:rPr>
-              <w:t>2026-10-24 00:00:00 → 2026-11-06 00:00:00</w:t>
-            </w:r>
-          </w:p>
-        </w:tc>
-        <w:tc>
-          <w:tcPr>
-            <w:tcW w:type="dxa" w:w="2401"/>
-          </w:tcPr>
-          <w:p>
-            <w:r>
-              <w:rPr>
-                <w:sz w:val="18"/>
-              </w:rPr>
-              <w:t>0%</w:t>
-            </w:r>
-          </w:p>
-        </w:tc>
-        <w:tc>
-          <w:tcPr>
-            <w:tcW w:type="dxa" w:w="2401"/>
-          </w:tcPr>
-          <w:p>
-            <w:r>
-              <w:rPr>
-                <w:sz w:val="18"/>
-              </w:rPr>
-              <w:t>Not Started</w:t>
+              <w:t>2026-10-04 00:00:00 → 2026-10-17 00:00:00</w:t>
+            </w:r>
+          </w:p>
+        </w:tc>
+        <w:tc>
+          <w:tcPr>
+            <w:tcW w:type="dxa" w:w="2401"/>
+          </w:tcPr>
+          <w:p>
+            <w:r>
+              <w:rPr>
+                <w:sz w:val="18"/>
+              </w:rPr>
+              <w:t>100%</w:t>
+            </w:r>
+          </w:p>
+        </w:tc>
+        <w:tc>
+          <w:tcPr>
+            <w:tcW w:type="dxa" w:w="2401"/>
+          </w:tcPr>
+          <w:p>
+            <w:r>
+              <w:rPr>
+                <w:sz w:val="18"/>
+              </w:rPr>
+              <w:t>Completed</w:t>
             </w:r>
           </w:p>
         </w:tc>
@@ -8003,33 +8003,33 @@
               <w:rPr>
                 <w:sz w:val="18"/>
               </w:rPr>
-              <w:t>2026-11-07 00:00:00 → 2026-11-16 00:00:00</w:t>
-            </w:r>
-          </w:p>
-        </w:tc>
-        <w:tc>
-          <w:tcPr>
-            <w:tcW w:type="dxa" w:w="2401"/>
-          </w:tcPr>
-          <w:p>
-            <w:r>
-              <w:rPr>
-                <w:sz w:val="18"/>
-              </w:rPr>
-              <w:t>0%</w:t>
-            </w:r>
-          </w:p>
-        </w:tc>
-        <w:tc>
-          <w:tcPr>
-            <w:tcW w:type="dxa" w:w="2401"/>
-          </w:tcPr>
-          <w:p>
-            <w:r>
-              <w:rPr>
-                <w:sz w:val="18"/>
-              </w:rPr>
-              <w:t>Not Started</w:t>
+              <w:t>2026-10-18 00:00:00 → 2026-10-27 00:00:00</w:t>
+            </w:r>
+          </w:p>
+        </w:tc>
+        <w:tc>
+          <w:tcPr>
+            <w:tcW w:type="dxa" w:w="2401"/>
+          </w:tcPr>
+          <w:p>
+            <w:r>
+              <w:rPr>
+                <w:sz w:val="18"/>
+              </w:rPr>
+              <w:t>100%</w:t>
+            </w:r>
+          </w:p>
+        </w:tc>
+        <w:tc>
+          <w:tcPr>
+            <w:tcW w:type="dxa" w:w="2401"/>
+          </w:tcPr>
+          <w:p>
+            <w:r>
+              <w:rPr>
+                <w:sz w:val="18"/>
+              </w:rPr>
+              <w:t>Completed</w:t>
             </w:r>
           </w:p>
         </w:tc>
@@ -8057,33 +8057,33 @@
               <w:rPr>
                 <w:sz w:val="18"/>
               </w:rPr>
-              <w:t>2026-11-17 00:00:00 → 2026-11-26 00:00:00</w:t>
-            </w:r>
-          </w:p>
-        </w:tc>
-        <w:tc>
-          <w:tcPr>
-            <w:tcW w:type="dxa" w:w="2401"/>
-          </w:tcPr>
-          <w:p>
-            <w:r>
-              <w:rPr>
-                <w:sz w:val="18"/>
-              </w:rPr>
-              <w:t>0%</w:t>
-            </w:r>
-          </w:p>
-        </w:tc>
-        <w:tc>
-          <w:tcPr>
-            <w:tcW w:type="dxa" w:w="2401"/>
-          </w:tcPr>
-          <w:p>
-            <w:r>
-              <w:rPr>
-                <w:sz w:val="18"/>
-              </w:rPr>
-              <w:t>Not Started</w:t>
+              <w:t>2026-10-28 00:00:00 → 2026-11-06 00:00:00</w:t>
+            </w:r>
+          </w:p>
+        </w:tc>
+        <w:tc>
+          <w:tcPr>
+            <w:tcW w:type="dxa" w:w="2401"/>
+          </w:tcPr>
+          <w:p>
+            <w:r>
+              <w:rPr>
+                <w:sz w:val="18"/>
+              </w:rPr>
+              <w:t>100%</w:t>
+            </w:r>
+          </w:p>
+        </w:tc>
+        <w:tc>
+          <w:tcPr>
+            <w:tcW w:type="dxa" w:w="2401"/>
+          </w:tcPr>
+          <w:p>
+            <w:r>
+              <w:rPr>
+                <w:sz w:val="18"/>
+              </w:rPr>
+              <w:t>Completed</w:t>
             </w:r>
           </w:p>
         </w:tc>
@@ -8111,7 +8111,7 @@
               <w:rPr>
                 <w:sz w:val="18"/>
               </w:rPr>
-              <w:t>2026-11-27 00:00:00 → 2026-12-03 00:00:00</w:t>
+              <w:t>2026-11-07 00:00:00 → 2026-11-13 00:00:00</w:t>
             </w:r>
           </w:p>
         </w:tc>
@@ -8159,7 +8159,7 @@
           <w:i w:val="0"/>
           <w:sz w:val="20"/>
         </w:rPr>
-        <w:t>Incharge: —   |   Actual 0.0%  ·  Planned 0.0%  ·  On Track   |   0 person-days this week   |   0 visitor(s)</w:t>
+        <w:t>Incharge: —   |   Actual 0.0%  ·  Planned 7.8%  ·  Delayed   |   0 person-days this week   |   0 visitor(s)</w:t>
       </w:r>
     </w:p>
     <w:tbl>
@@ -8259,7 +8259,7 @@
               <w:rPr>
                 <w:sz w:val="18"/>
               </w:rPr>
-              <w:t>2026-07-07 00:00:00 → 2026-07-27 00:00:00</w:t>
+              <w:t>2026-06-24 00:00:00 → 2026-07-14 00:00:00</w:t>
             </w:r>
           </w:p>
         </w:tc>
@@ -8313,7 +8313,7 @@
               <w:rPr>
                 <w:sz w:val="18"/>
               </w:rPr>
-              <w:t>2026-07-28 00:00:00 → 2026-08-17 00:00:00</w:t>
+              <w:t>2026-07-15 00:00:00 → 2026-08-04 00:00:00</w:t>
             </w:r>
           </w:p>
         </w:tc>
@@ -8367,7 +8367,7 @@
               <w:rPr>
                 <w:sz w:val="18"/>
               </w:rPr>
-              <w:t>2026-08-18 00:00:00 → 2026-09-14 00:00:00</w:t>
+              <w:t>2026-08-05 00:00:00 → 2026-09-01 00:00:00</w:t>
             </w:r>
           </w:p>
         </w:tc>
@@ -8421,7 +8421,7 @@
               <w:rPr>
                 <w:sz w:val="18"/>
               </w:rPr>
-              <w:t>2026-09-15 00:00:00 → 2026-10-05 00:00:00</w:t>
+              <w:t>2026-09-02 00:00:00 → 2026-09-22 00:00:00</w:t>
             </w:r>
           </w:p>
         </w:tc>
@@ -8475,7 +8475,7 @@
               <w:rPr>
                 <w:sz w:val="18"/>
               </w:rPr>
-              <w:t>2026-10-06 00:00:00 → 2026-10-23 00:00:00</w:t>
+              <w:t>2026-09-23 00:00:00 → 2026-10-10 00:00:00</w:t>
             </w:r>
           </w:p>
         </w:tc>
@@ -8529,7 +8529,7 @@
               <w:rPr>
                 <w:sz w:val="18"/>
               </w:rPr>
-              <w:t>2026-10-24 00:00:00 → 2026-11-06 00:00:00</w:t>
+              <w:t>2026-10-11 00:00:00 → 2026-10-24 00:00:00</w:t>
             </w:r>
           </w:p>
         </w:tc>
@@ -8583,7 +8583,7 @@
               <w:rPr>
                 <w:sz w:val="18"/>
               </w:rPr>
-              <w:t>2026-11-07 00:00:00 → 2026-11-16 00:00:00</w:t>
+              <w:t>2026-10-25 00:00:00 → 2026-11-03 00:00:00</w:t>
             </w:r>
           </w:p>
         </w:tc>
@@ -8637,7 +8637,7 @@
               <w:rPr>
                 <w:sz w:val="18"/>
               </w:rPr>
-              <w:t>2026-11-17 00:00:00 → 2026-11-26 00:00:00</w:t>
+              <w:t>2026-11-04 00:00:00 → 2026-11-13 00:00:00</w:t>
             </w:r>
           </w:p>
         </w:tc>
@@ -8691,7 +8691,7 @@
               <w:rPr>
                 <w:sz w:val="18"/>
               </w:rPr>
-              <w:t>2026-11-27 00:00:00 → 2026-12-03 00:00:00</w:t>
+              <w:t>2026-11-14 00:00:00 → 2026-11-20 00:00:00</w:t>
             </w:r>
           </w:p>
         </w:tc>
@@ -9231,44 +9231,964 @@
               <w:rPr>
                 <w:sz w:val="18"/>
               </w:rPr>
-              <w:t>None</w:t>
-            </w:r>
-          </w:p>
-        </w:tc>
-        <w:tc>
-          <w:tcPr>
-            <w:tcW w:type="dxa" w:w="2401"/>
-          </w:tcPr>
-          <w:p>
-            <w:r>
-              <w:rPr>
-                <w:sz w:val="18"/>
-              </w:rPr>
-              <w:t>All tasks on schedule</w:t>
-            </w:r>
-          </w:p>
-        </w:tc>
-        <w:tc>
-          <w:tcPr>
-            <w:tcW w:type="dxa" w:w="2401"/>
-          </w:tcPr>
-          <w:p>
-            <w:r>
-              <w:rPr>
-                <w:sz w:val="18"/>
-              </w:rPr>
-            </w:r>
-          </w:p>
-        </w:tc>
-        <w:tc>
-          <w:tcPr>
-            <w:tcW w:type="dxa" w:w="2401"/>
-          </w:tcPr>
-          <w:p>
-            <w:r>
-              <w:rPr>
-                <w:sz w:val="18"/>
-              </w:rPr>
+              <w:t>CO2</w:t>
+            </w:r>
+          </w:p>
+        </w:tc>
+        <w:tc>
+          <w:tcPr>
+            <w:tcW w:type="dxa" w:w="2401"/>
+          </w:tcPr>
+          <w:p>
+            <w:r>
+              <w:rPr>
+                <w:sz w:val="18"/>
+              </w:rPr>
+              <w:t>CO2 - Civil &amp; Foundation</w:t>
+            </w:r>
+          </w:p>
+        </w:tc>
+        <w:tc>
+          <w:tcPr>
+            <w:tcW w:type="dxa" w:w="2401"/>
+          </w:tcPr>
+          <w:p>
+            <w:r>
+              <w:rPr>
+                <w:sz w:val="18"/>
+              </w:rPr>
+              <w:t>2026-04-28 00:00:00</w:t>
+            </w:r>
+          </w:p>
+        </w:tc>
+        <w:tc>
+          <w:tcPr>
+            <w:tcW w:type="dxa" w:w="2401"/>
+          </w:tcPr>
+          <w:p>
+            <w:r>
+              <w:rPr>
+                <w:sz w:val="18"/>
+              </w:rPr>
+              <w:t>0%</w:t>
+            </w:r>
+          </w:p>
+        </w:tc>
+      </w:tr>
+      <w:tr>
+        <w:tc>
+          <w:tcPr>
+            <w:tcW w:type="dxa" w:w="2401"/>
+          </w:tcPr>
+          <w:p>
+            <w:r>
+              <w:rPr>
+                <w:sz w:val="18"/>
+              </w:rPr>
+              <w:t>CO2</w:t>
+            </w:r>
+          </w:p>
+        </w:tc>
+        <w:tc>
+          <w:tcPr>
+            <w:tcW w:type="dxa" w:w="2401"/>
+          </w:tcPr>
+          <w:p>
+            <w:r>
+              <w:rPr>
+                <w:sz w:val="18"/>
+              </w:rPr>
+              <w:t>CO2 - Structural / Erection</w:t>
+            </w:r>
+          </w:p>
+        </w:tc>
+        <w:tc>
+          <w:tcPr>
+            <w:tcW w:type="dxa" w:w="2401"/>
+          </w:tcPr>
+          <w:p>
+            <w:r>
+              <w:rPr>
+                <w:sz w:val="18"/>
+              </w:rPr>
+              <w:t>2026-05-19 00:00:00</w:t>
+            </w:r>
+          </w:p>
+        </w:tc>
+        <w:tc>
+          <w:tcPr>
+            <w:tcW w:type="dxa" w:w="2401"/>
+          </w:tcPr>
+          <w:p>
+            <w:r>
+              <w:rPr>
+                <w:sz w:val="18"/>
+              </w:rPr>
+              <w:t>0%</w:t>
+            </w:r>
+          </w:p>
+        </w:tc>
+      </w:tr>
+      <w:tr>
+        <w:tc>
+          <w:tcPr>
+            <w:tcW w:type="dxa" w:w="2401"/>
+          </w:tcPr>
+          <w:p>
+            <w:r>
+              <w:rPr>
+                <w:sz w:val="18"/>
+              </w:rPr>
+              <w:t>CO2</w:t>
+            </w:r>
+          </w:p>
+        </w:tc>
+        <w:tc>
+          <w:tcPr>
+            <w:tcW w:type="dxa" w:w="2401"/>
+          </w:tcPr>
+          <w:p>
+            <w:r>
+              <w:rPr>
+                <w:sz w:val="18"/>
+              </w:rPr>
+              <w:t>CO2 - Equipment Installation</w:t>
+            </w:r>
+          </w:p>
+        </w:tc>
+        <w:tc>
+          <w:tcPr>
+            <w:tcW w:type="dxa" w:w="2401"/>
+          </w:tcPr>
+          <w:p>
+            <w:r>
+              <w:rPr>
+                <w:sz w:val="18"/>
+              </w:rPr>
+              <w:t>2026-06-16 00:00:00</w:t>
+            </w:r>
+          </w:p>
+        </w:tc>
+        <w:tc>
+          <w:tcPr>
+            <w:tcW w:type="dxa" w:w="2401"/>
+          </w:tcPr>
+          <w:p>
+            <w:r>
+              <w:rPr>
+                <w:sz w:val="18"/>
+              </w:rPr>
+              <w:t>0%</w:t>
+            </w:r>
+          </w:p>
+        </w:tc>
+      </w:tr>
+      <w:tr>
+        <w:tc>
+          <w:tcPr>
+            <w:tcW w:type="dxa" w:w="2401"/>
+          </w:tcPr>
+          <w:p>
+            <w:r>
+              <w:rPr>
+                <w:sz w:val="18"/>
+              </w:rPr>
+              <w:t>DIST</w:t>
+            </w:r>
+          </w:p>
+        </w:tc>
+        <w:tc>
+          <w:tcPr>
+            <w:tcW w:type="dxa" w:w="2401"/>
+          </w:tcPr>
+          <w:p>
+            <w:r>
+              <w:rPr>
+                <w:sz w:val="18"/>
+              </w:rPr>
+              <w:t>DIST - Structural / Erection</w:t>
+            </w:r>
+          </w:p>
+        </w:tc>
+        <w:tc>
+          <w:tcPr>
+            <w:tcW w:type="dxa" w:w="2401"/>
+          </w:tcPr>
+          <w:p>
+            <w:r>
+              <w:rPr>
+                <w:sz w:val="18"/>
+              </w:rPr>
+              <w:t>2026-05-26 00:00:00</w:t>
+            </w:r>
+          </w:p>
+        </w:tc>
+        <w:tc>
+          <w:tcPr>
+            <w:tcW w:type="dxa" w:w="2401"/>
+          </w:tcPr>
+          <w:p>
+            <w:r>
+              <w:rPr>
+                <w:sz w:val="18"/>
+              </w:rPr>
+              <w:t>60%</w:t>
+            </w:r>
+          </w:p>
+        </w:tc>
+      </w:tr>
+      <w:tr>
+        <w:tc>
+          <w:tcPr>
+            <w:tcW w:type="dxa" w:w="2401"/>
+          </w:tcPr>
+          <w:p>
+            <w:r>
+              <w:rPr>
+                <w:sz w:val="18"/>
+              </w:rPr>
+              <w:t>DRY</w:t>
+            </w:r>
+          </w:p>
+        </w:tc>
+        <w:tc>
+          <w:tcPr>
+            <w:tcW w:type="dxa" w:w="2401"/>
+          </w:tcPr>
+          <w:p>
+            <w:r>
+              <w:rPr>
+                <w:sz w:val="18"/>
+              </w:rPr>
+              <w:t>DRY - Civil &amp; Foundation</w:t>
+            </w:r>
+          </w:p>
+        </w:tc>
+        <w:tc>
+          <w:tcPr>
+            <w:tcW w:type="dxa" w:w="2401"/>
+          </w:tcPr>
+          <w:p>
+            <w:r>
+              <w:rPr>
+                <w:sz w:val="18"/>
+              </w:rPr>
+              <w:t>2026-05-12 00:00:00</w:t>
+            </w:r>
+          </w:p>
+        </w:tc>
+        <w:tc>
+          <w:tcPr>
+            <w:tcW w:type="dxa" w:w="2401"/>
+          </w:tcPr>
+          <w:p>
+            <w:r>
+              <w:rPr>
+                <w:sz w:val="18"/>
+              </w:rPr>
+              <w:t>0%</w:t>
+            </w:r>
+          </w:p>
+        </w:tc>
+      </w:tr>
+      <w:tr>
+        <w:tc>
+          <w:tcPr>
+            <w:tcW w:type="dxa" w:w="2401"/>
+          </w:tcPr>
+          <w:p>
+            <w:r>
+              <w:rPr>
+                <w:sz w:val="18"/>
+              </w:rPr>
+              <w:t>DRY</w:t>
+            </w:r>
+          </w:p>
+        </w:tc>
+        <w:tc>
+          <w:tcPr>
+            <w:tcW w:type="dxa" w:w="2401"/>
+          </w:tcPr>
+          <w:p>
+            <w:r>
+              <w:rPr>
+                <w:sz w:val="18"/>
+              </w:rPr>
+              <w:t>DRY - Structural / Erection</w:t>
+            </w:r>
+          </w:p>
+        </w:tc>
+        <w:tc>
+          <w:tcPr>
+            <w:tcW w:type="dxa" w:w="2401"/>
+          </w:tcPr>
+          <w:p>
+            <w:r>
+              <w:rPr>
+                <w:sz w:val="18"/>
+              </w:rPr>
+              <w:t>2026-06-02 00:00:00</w:t>
+            </w:r>
+          </w:p>
+        </w:tc>
+        <w:tc>
+          <w:tcPr>
+            <w:tcW w:type="dxa" w:w="2401"/>
+          </w:tcPr>
+          <w:p>
+            <w:r>
+              <w:rPr>
+                <w:sz w:val="18"/>
+              </w:rPr>
+              <w:t>0%</w:t>
+            </w:r>
+          </w:p>
+        </w:tc>
+      </w:tr>
+      <w:tr>
+        <w:tc>
+          <w:tcPr>
+            <w:tcW w:type="dxa" w:w="2401"/>
+          </w:tcPr>
+          <w:p>
+            <w:r>
+              <w:rPr>
+                <w:sz w:val="18"/>
+              </w:rPr>
+              <w:t>DRY</w:t>
+            </w:r>
+          </w:p>
+        </w:tc>
+        <w:tc>
+          <w:tcPr>
+            <w:tcW w:type="dxa" w:w="2401"/>
+          </w:tcPr>
+          <w:p>
+            <w:r>
+              <w:rPr>
+                <w:sz w:val="18"/>
+              </w:rPr>
+              <w:t>DRY - Equipment Installation</w:t>
+            </w:r>
+          </w:p>
+        </w:tc>
+        <w:tc>
+          <w:tcPr>
+            <w:tcW w:type="dxa" w:w="2401"/>
+          </w:tcPr>
+          <w:p>
+            <w:r>
+              <w:rPr>
+                <w:sz w:val="18"/>
+              </w:rPr>
+              <w:t>2026-06-30 00:00:00</w:t>
+            </w:r>
+          </w:p>
+        </w:tc>
+        <w:tc>
+          <w:tcPr>
+            <w:tcW w:type="dxa" w:w="2401"/>
+          </w:tcPr>
+          <w:p>
+            <w:r>
+              <w:rPr>
+                <w:sz w:val="18"/>
+              </w:rPr>
+              <w:t>0%</w:t>
+            </w:r>
+          </w:p>
+        </w:tc>
+      </w:tr>
+      <w:tr>
+        <w:tc>
+          <w:tcPr>
+            <w:tcW w:type="dxa" w:w="2401"/>
+          </w:tcPr>
+          <w:p>
+            <w:r>
+              <w:rPr>
+                <w:sz w:val="18"/>
+              </w:rPr>
+              <w:t>ETP</w:t>
+            </w:r>
+          </w:p>
+        </w:tc>
+        <w:tc>
+          <w:tcPr>
+            <w:tcW w:type="dxa" w:w="2401"/>
+          </w:tcPr>
+          <w:p>
+            <w:r>
+              <w:rPr>
+                <w:sz w:val="18"/>
+              </w:rPr>
+              <w:t>ETP - Civil &amp; Foundation</w:t>
+            </w:r>
+          </w:p>
+        </w:tc>
+        <w:tc>
+          <w:tcPr>
+            <w:tcW w:type="dxa" w:w="2401"/>
+          </w:tcPr>
+          <w:p>
+            <w:r>
+              <w:rPr>
+                <w:sz w:val="18"/>
+              </w:rPr>
+              <w:t>2026-05-19 00:00:00</w:t>
+            </w:r>
+          </w:p>
+        </w:tc>
+        <w:tc>
+          <w:tcPr>
+            <w:tcW w:type="dxa" w:w="2401"/>
+          </w:tcPr>
+          <w:p>
+            <w:r>
+              <w:rPr>
+                <w:sz w:val="18"/>
+              </w:rPr>
+              <w:t>0%</w:t>
+            </w:r>
+          </w:p>
+        </w:tc>
+      </w:tr>
+      <w:tr>
+        <w:tc>
+          <w:tcPr>
+            <w:tcW w:type="dxa" w:w="2401"/>
+          </w:tcPr>
+          <w:p>
+            <w:r>
+              <w:rPr>
+                <w:sz w:val="18"/>
+              </w:rPr>
+              <w:t>ETP</w:t>
+            </w:r>
+          </w:p>
+        </w:tc>
+        <w:tc>
+          <w:tcPr>
+            <w:tcW w:type="dxa" w:w="2401"/>
+          </w:tcPr>
+          <w:p>
+            <w:r>
+              <w:rPr>
+                <w:sz w:val="18"/>
+              </w:rPr>
+              <w:t>ETP - Structural / Erection</w:t>
+            </w:r>
+          </w:p>
+        </w:tc>
+        <w:tc>
+          <w:tcPr>
+            <w:tcW w:type="dxa" w:w="2401"/>
+          </w:tcPr>
+          <w:p>
+            <w:r>
+              <w:rPr>
+                <w:sz w:val="18"/>
+              </w:rPr>
+              <w:t>2026-06-09 00:00:00</w:t>
+            </w:r>
+          </w:p>
+        </w:tc>
+        <w:tc>
+          <w:tcPr>
+            <w:tcW w:type="dxa" w:w="2401"/>
+          </w:tcPr>
+          <w:p>
+            <w:r>
+              <w:rPr>
+                <w:sz w:val="18"/>
+              </w:rPr>
+              <w:t>0%</w:t>
+            </w:r>
+          </w:p>
+        </w:tc>
+      </w:tr>
+      <w:tr>
+        <w:tc>
+          <w:tcPr>
+            <w:tcW w:type="dxa" w:w="2401"/>
+          </w:tcPr>
+          <w:p>
+            <w:r>
+              <w:rPr>
+                <w:sz w:val="18"/>
+              </w:rPr>
+              <w:t>EVAP</w:t>
+            </w:r>
+          </w:p>
+        </w:tc>
+        <w:tc>
+          <w:tcPr>
+            <w:tcW w:type="dxa" w:w="2401"/>
+          </w:tcPr>
+          <w:p>
+            <w:r>
+              <w:rPr>
+                <w:sz w:val="18"/>
+              </w:rPr>
+              <w:t>EVAP - Civil &amp; Foundation</w:t>
+            </w:r>
+          </w:p>
+        </w:tc>
+        <w:tc>
+          <w:tcPr>
+            <w:tcW w:type="dxa" w:w="2401"/>
+          </w:tcPr>
+          <w:p>
+            <w:r>
+              <w:rPr>
+                <w:sz w:val="18"/>
+              </w:rPr>
+              <w:t>2026-05-26 00:00:00</w:t>
+            </w:r>
+          </w:p>
+        </w:tc>
+        <w:tc>
+          <w:tcPr>
+            <w:tcW w:type="dxa" w:w="2401"/>
+          </w:tcPr>
+          <w:p>
+            <w:r>
+              <w:rPr>
+                <w:sz w:val="18"/>
+              </w:rPr>
+              <w:t>0%</w:t>
+            </w:r>
+          </w:p>
+        </w:tc>
+      </w:tr>
+      <w:tr>
+        <w:tc>
+          <w:tcPr>
+            <w:tcW w:type="dxa" w:w="2401"/>
+          </w:tcPr>
+          <w:p>
+            <w:r>
+              <w:rPr>
+                <w:sz w:val="18"/>
+              </w:rPr>
+              <w:t>EVAP</w:t>
+            </w:r>
+          </w:p>
+        </w:tc>
+        <w:tc>
+          <w:tcPr>
+            <w:tcW w:type="dxa" w:w="2401"/>
+          </w:tcPr>
+          <w:p>
+            <w:r>
+              <w:rPr>
+                <w:sz w:val="18"/>
+              </w:rPr>
+              <w:t>EVAP - Structural / Erection</w:t>
+            </w:r>
+          </w:p>
+        </w:tc>
+        <w:tc>
+          <w:tcPr>
+            <w:tcW w:type="dxa" w:w="2401"/>
+          </w:tcPr>
+          <w:p>
+            <w:r>
+              <w:rPr>
+                <w:sz w:val="18"/>
+              </w:rPr>
+              <w:t>2026-06-16 00:00:00</w:t>
+            </w:r>
+          </w:p>
+        </w:tc>
+        <w:tc>
+          <w:tcPr>
+            <w:tcW w:type="dxa" w:w="2401"/>
+          </w:tcPr>
+          <w:p>
+            <w:r>
+              <w:rPr>
+                <w:sz w:val="18"/>
+              </w:rPr>
+              <w:t>0%</w:t>
+            </w:r>
+          </w:p>
+        </w:tc>
+      </w:tr>
+      <w:tr>
+        <w:tc>
+          <w:tcPr>
+            <w:tcW w:type="dxa" w:w="2401"/>
+          </w:tcPr>
+          <w:p>
+            <w:r>
+              <w:rPr>
+                <w:sz w:val="18"/>
+              </w:rPr>
+              <w:t>FERM</w:t>
+            </w:r>
+          </w:p>
+        </w:tc>
+        <w:tc>
+          <w:tcPr>
+            <w:tcW w:type="dxa" w:w="2401"/>
+          </w:tcPr>
+          <w:p>
+            <w:r>
+              <w:rPr>
+                <w:sz w:val="18"/>
+              </w:rPr>
+              <w:t>FERM - Civil &amp; Foundation</w:t>
+            </w:r>
+          </w:p>
+        </w:tc>
+        <w:tc>
+          <w:tcPr>
+            <w:tcW w:type="dxa" w:w="2401"/>
+          </w:tcPr>
+          <w:p>
+            <w:r>
+              <w:rPr>
+                <w:sz w:val="18"/>
+              </w:rPr>
+              <w:t>2026-06-02 00:00:00</w:t>
+            </w:r>
+          </w:p>
+        </w:tc>
+        <w:tc>
+          <w:tcPr>
+            <w:tcW w:type="dxa" w:w="2401"/>
+          </w:tcPr>
+          <w:p>
+            <w:r>
+              <w:rPr>
+                <w:sz w:val="18"/>
+              </w:rPr>
+              <w:t>80%</w:t>
+            </w:r>
+          </w:p>
+        </w:tc>
+      </w:tr>
+      <w:tr>
+        <w:tc>
+          <w:tcPr>
+            <w:tcW w:type="dxa" w:w="2401"/>
+          </w:tcPr>
+          <w:p>
+            <w:r>
+              <w:rPr>
+                <w:sz w:val="18"/>
+              </w:rPr>
+              <w:t>FERM</w:t>
+            </w:r>
+          </w:p>
+        </w:tc>
+        <w:tc>
+          <w:tcPr>
+            <w:tcW w:type="dxa" w:w="2401"/>
+          </w:tcPr>
+          <w:p>
+            <w:r>
+              <w:rPr>
+                <w:sz w:val="18"/>
+              </w:rPr>
+              <w:t>FERM - Structural / Erection</w:t>
+            </w:r>
+          </w:p>
+        </w:tc>
+        <w:tc>
+          <w:tcPr>
+            <w:tcW w:type="dxa" w:w="2401"/>
+          </w:tcPr>
+          <w:p>
+            <w:r>
+              <w:rPr>
+                <w:sz w:val="18"/>
+              </w:rPr>
+              <w:t>2026-06-23 00:00:00</w:t>
+            </w:r>
+          </w:p>
+        </w:tc>
+        <w:tc>
+          <w:tcPr>
+            <w:tcW w:type="dxa" w:w="2401"/>
+          </w:tcPr>
+          <w:p>
+            <w:r>
+              <w:rPr>
+                <w:sz w:val="18"/>
+              </w:rPr>
+              <w:t>0%</w:t>
+            </w:r>
+          </w:p>
+        </w:tc>
+      </w:tr>
+      <w:tr>
+        <w:tc>
+          <w:tcPr>
+            <w:tcW w:type="dxa" w:w="2401"/>
+          </w:tcPr>
+          <w:p>
+            <w:r>
+              <w:rPr>
+                <w:sz w:val="18"/>
+              </w:rPr>
+              <w:t>LIQ</w:t>
+            </w:r>
+          </w:p>
+        </w:tc>
+        <w:tc>
+          <w:tcPr>
+            <w:tcW w:type="dxa" w:w="2401"/>
+          </w:tcPr>
+          <w:p>
+            <w:r>
+              <w:rPr>
+                <w:sz w:val="18"/>
+              </w:rPr>
+              <w:t>LIQ - Civil &amp; Foundation</w:t>
+            </w:r>
+          </w:p>
+        </w:tc>
+        <w:tc>
+          <w:tcPr>
+            <w:tcW w:type="dxa" w:w="2401"/>
+          </w:tcPr>
+          <w:p>
+            <w:r>
+              <w:rPr>
+                <w:sz w:val="18"/>
+              </w:rPr>
+              <w:t>2026-06-09 00:00:00</w:t>
+            </w:r>
+          </w:p>
+        </w:tc>
+        <w:tc>
+          <w:tcPr>
+            <w:tcW w:type="dxa" w:w="2401"/>
+          </w:tcPr>
+          <w:p>
+            <w:r>
+              <w:rPr>
+                <w:sz w:val="18"/>
+              </w:rPr>
+              <w:t>0%</w:t>
+            </w:r>
+          </w:p>
+        </w:tc>
+      </w:tr>
+      <w:tr>
+        <w:tc>
+          <w:tcPr>
+            <w:tcW w:type="dxa" w:w="2401"/>
+          </w:tcPr>
+          <w:p>
+            <w:r>
+              <w:rPr>
+                <w:sz w:val="18"/>
+              </w:rPr>
+              <w:t>LIQ</w:t>
+            </w:r>
+          </w:p>
+        </w:tc>
+        <w:tc>
+          <w:tcPr>
+            <w:tcW w:type="dxa" w:w="2401"/>
+          </w:tcPr>
+          <w:p>
+            <w:r>
+              <w:rPr>
+                <w:sz w:val="18"/>
+              </w:rPr>
+              <w:t>LIQ - Structural / Erection</w:t>
+            </w:r>
+          </w:p>
+        </w:tc>
+        <w:tc>
+          <w:tcPr>
+            <w:tcW w:type="dxa" w:w="2401"/>
+          </w:tcPr>
+          <w:p>
+            <w:r>
+              <w:rPr>
+                <w:sz w:val="18"/>
+              </w:rPr>
+              <w:t>2026-06-30 00:00:00</w:t>
+            </w:r>
+          </w:p>
+        </w:tc>
+        <w:tc>
+          <w:tcPr>
+            <w:tcW w:type="dxa" w:w="2401"/>
+          </w:tcPr>
+          <w:p>
+            <w:r>
+              <w:rPr>
+                <w:sz w:val="18"/>
+              </w:rPr>
+              <w:t>0%</w:t>
+            </w:r>
+          </w:p>
+        </w:tc>
+      </w:tr>
+      <w:tr>
+        <w:tc>
+          <w:tcPr>
+            <w:tcW w:type="dxa" w:w="2401"/>
+          </w:tcPr>
+          <w:p>
+            <w:r>
+              <w:rPr>
+                <w:sz w:val="18"/>
+              </w:rPr>
+              <w:t>MILL</w:t>
+            </w:r>
+          </w:p>
+        </w:tc>
+        <w:tc>
+          <w:tcPr>
+            <w:tcW w:type="dxa" w:w="2401"/>
+          </w:tcPr>
+          <w:p>
+            <w:r>
+              <w:rPr>
+                <w:sz w:val="18"/>
+              </w:rPr>
+              <w:t>MILL - Civil &amp; Foundation</w:t>
+            </w:r>
+          </w:p>
+        </w:tc>
+        <w:tc>
+          <w:tcPr>
+            <w:tcW w:type="dxa" w:w="2401"/>
+          </w:tcPr>
+          <w:p>
+            <w:r>
+              <w:rPr>
+                <w:sz w:val="18"/>
+              </w:rPr>
+              <w:t>2026-06-16 00:00:00</w:t>
+            </w:r>
+          </w:p>
+        </w:tc>
+        <w:tc>
+          <w:tcPr>
+            <w:tcW w:type="dxa" w:w="2401"/>
+          </w:tcPr>
+          <w:p>
+            <w:r>
+              <w:rPr>
+                <w:sz w:val="18"/>
+              </w:rPr>
+              <w:t>0%</w:t>
+            </w:r>
+          </w:p>
+        </w:tc>
+      </w:tr>
+      <w:tr>
+        <w:tc>
+          <w:tcPr>
+            <w:tcW w:type="dxa" w:w="2401"/>
+          </w:tcPr>
+          <w:p>
+            <w:r>
+              <w:rPr>
+                <w:sz w:val="18"/>
+              </w:rPr>
+              <w:t>MSDH</w:t>
+            </w:r>
+          </w:p>
+        </w:tc>
+        <w:tc>
+          <w:tcPr>
+            <w:tcW w:type="dxa" w:w="2401"/>
+          </w:tcPr>
+          <w:p>
+            <w:r>
+              <w:rPr>
+                <w:sz w:val="18"/>
+              </w:rPr>
+              <w:t>MSDH - Civil &amp; Foundation</w:t>
+            </w:r>
+          </w:p>
+        </w:tc>
+        <w:tc>
+          <w:tcPr>
+            <w:tcW w:type="dxa" w:w="2401"/>
+          </w:tcPr>
+          <w:p>
+            <w:r>
+              <w:rPr>
+                <w:sz w:val="18"/>
+              </w:rPr>
+              <w:t>2026-06-23 00:00:00</w:t>
+            </w:r>
+          </w:p>
+        </w:tc>
+        <w:tc>
+          <w:tcPr>
+            <w:tcW w:type="dxa" w:w="2401"/>
+          </w:tcPr>
+          <w:p>
+            <w:r>
+              <w:rPr>
+                <w:sz w:val="18"/>
+              </w:rPr>
+              <w:t>0%</w:t>
+            </w:r>
+          </w:p>
+        </w:tc>
+      </w:tr>
+      <w:tr>
+        <w:tc>
+          <w:tcPr>
+            <w:tcW w:type="dxa" w:w="2401"/>
+          </w:tcPr>
+          <w:p>
+            <w:r>
+              <w:rPr>
+                <w:sz w:val="18"/>
+              </w:rPr>
+              <w:t>PP</w:t>
+            </w:r>
+          </w:p>
+        </w:tc>
+        <w:tc>
+          <w:tcPr>
+            <w:tcW w:type="dxa" w:w="2401"/>
+          </w:tcPr>
+          <w:p>
+            <w:r>
+              <w:rPr>
+                <w:sz w:val="18"/>
+              </w:rPr>
+              <w:t>PP - Civil &amp; Foundation</w:t>
+            </w:r>
+          </w:p>
+        </w:tc>
+        <w:tc>
+          <w:tcPr>
+            <w:tcW w:type="dxa" w:w="2401"/>
+          </w:tcPr>
+          <w:p>
+            <w:r>
+              <w:rPr>
+                <w:sz w:val="18"/>
+              </w:rPr>
+              <w:t>2026-06-30 00:00:00</w:t>
+            </w:r>
+          </w:p>
+        </w:tc>
+        <w:tc>
+          <w:tcPr>
+            <w:tcW w:type="dxa" w:w="2401"/>
+          </w:tcPr>
+          <w:p>
+            <w:r>
+              <w:rPr>
+                <w:sz w:val="18"/>
+              </w:rPr>
+              <w:t>0%</w:t>
             </w:r>
           </w:p>
         </w:tc>
@@ -9407,7 +10327,7 @@
               <w:rPr>
                 <w:sz w:val="18"/>
               </w:rPr>
-              <w:t>07 Jul</w:t>
+              <w:t>06 Jul</w:t>
             </w:r>
           </w:p>
         </w:tc>
@@ -9625,7 +10545,7 @@
               <w:rPr>
                 <w:sz w:val="18"/>
               </w:rPr>
-              <w:t>07 Jul</w:t>
+              <w:t>06 Jul</w:t>
             </w:r>
           </w:p>
         </w:tc>

</xml_diff>